<commit_message>
Apuntes memoria y links de referencias
</commit_message>
<xml_diff>
--- a/Senku-Memoria.docx
+++ b/Senku-Memoria.docx
@@ -60,15 +60,7 @@
           <w:szCs w:val="18"/>
           <w:lang w:val="es-ES"/>
         </w:rPr>
-        <w:t>Mario Domínguez López</w:t>
-      </w:r>
-      <w:r>
-        <w:rPr>
-          <w:sz w:val="18"/>
-          <w:szCs w:val="18"/>
-          <w:lang w:val="es-ES"/>
-        </w:rPr>
-        <w:t xml:space="preserve"> </w:t>
+        <w:t xml:space="preserve">Mario Domínguez López </w:t>
       </w:r>
       <w:r>
         <w:rPr>
@@ -132,7 +124,7 @@
       <w:hyperlink r:id="rId9" w:history="1">
         <w:r>
           <w:rPr>
-            <w:rStyle w:val="Hipervnculo"/>
+            <w:rStyle w:val="Hyperlink"/>
             <w:sz w:val="18"/>
             <w:szCs w:val="18"/>
             <w:lang w:val="es-ES"/>
@@ -148,6 +140,14 @@
         </w:rPr>
         <w:t xml:space="preserve"> / </w:t>
       </w:r>
+      <w:r>
+        <w:rPr>
+          <w:sz w:val="18"/>
+          <w:szCs w:val="18"/>
+          <w:lang w:val="es-ES"/>
+        </w:rPr>
+        <w:t>mardomlop11</w:t>
+      </w:r>
     </w:p>
     <w:p>
       <w:pPr>
@@ -227,7 +227,7 @@
       <w:hyperlink r:id="rId10" w:history="1">
         <w:r>
           <w:rPr>
-            <w:rStyle w:val="Hipervnculo"/>
+            <w:rStyle w:val="Hyperlink"/>
             <w:sz w:val="18"/>
             <w:szCs w:val="18"/>
             <w:lang w:val="es-ES"/>
@@ -391,25 +391,7 @@
         <w:rPr>
           <w:lang w:val="es-ES"/>
         </w:rPr>
-        <w:t xml:space="preserve">, </w:t>
-      </w:r>
-      <w:r>
-        <w:rPr>
-          <w:lang w:val="es-ES"/>
-        </w:rPr>
-        <w:t>planificación automática</w:t>
-      </w:r>
-      <w:r>
-        <w:rPr>
-          <w:lang w:val="es-ES"/>
-        </w:rPr>
-        <w:t xml:space="preserve">, </w:t>
-      </w:r>
-      <w:r>
-        <w:rPr>
-          <w:lang w:val="es-ES"/>
-        </w:rPr>
-        <w:t>árbol de búsqueda</w:t>
+        <w:t>, planificación automática, árbol de búsqueda</w:t>
       </w:r>
       <w:r>
         <w:rPr>
@@ -420,7 +402,7 @@
     </w:p>
     <w:p>
       <w:pPr>
-        <w:pStyle w:val="Ttulo1"/>
+        <w:pStyle w:val="Heading1"/>
         <w:rPr>
           <w:lang w:val="es-ES"/>
         </w:rPr>
@@ -455,17 +437,7 @@
           <w:szCs w:val="20"/>
           <w:lang w:eastAsia="es-ES" w:bidi="ar-SA"/>
         </w:rPr>
-        <w:t>El ámbito de la</w:t>
-      </w:r>
-      <w:r>
-        <w:rPr>
-          <w:rFonts w:ascii="Times New Roman" w:eastAsia="Times New Roman" w:hAnsi="Times New Roman" w:cs="Times New Roman"/>
-          <w:kern w:val="0"/>
-          <w:sz w:val="20"/>
-          <w:szCs w:val="20"/>
-          <w:lang w:eastAsia="es-ES" w:bidi="ar-SA"/>
-        </w:rPr>
-        <w:t xml:space="preserve"> </w:t>
+        <w:t xml:space="preserve">El ámbito de la </w:t>
       </w:r>
       <w:r>
         <w:rPr>
@@ -533,37 +505,7 @@
           <w:szCs w:val="20"/>
           <w:lang w:eastAsia="es-ES" w:bidi="ar-SA"/>
         </w:rPr>
-        <w:t xml:space="preserve"> </w:t>
-      </w:r>
-      <w:r>
-        <w:rPr>
-          <w:rFonts w:ascii="Times New Roman" w:eastAsia="Times New Roman" w:hAnsi="Times New Roman" w:cs="Times New Roman"/>
-          <w:kern w:val="0"/>
-          <w:sz w:val="20"/>
-          <w:szCs w:val="20"/>
-          <w:lang w:eastAsia="es-ES" w:bidi="ar-SA"/>
-        </w:rPr>
-        <w:t xml:space="preserve">ha utilizado históricamente los juegos </w:t>
-      </w:r>
-      <w:r>
-        <w:rPr>
-          <w:rFonts w:ascii="Times New Roman" w:eastAsia="Times New Roman" w:hAnsi="Times New Roman" w:cs="Times New Roman"/>
-          <w:kern w:val="0"/>
-          <w:sz w:val="20"/>
-          <w:szCs w:val="20"/>
-          <w:lang w:eastAsia="es-ES" w:bidi="ar-SA"/>
-        </w:rPr>
-        <w:t xml:space="preserve">y </w:t>
-      </w:r>
-      <w:r>
-        <w:rPr>
-          <w:rFonts w:ascii="Times New Roman" w:eastAsia="Times New Roman" w:hAnsi="Times New Roman" w:cs="Times New Roman"/>
-          <w:kern w:val="0"/>
-          <w:sz w:val="20"/>
-          <w:szCs w:val="20"/>
-          <w:lang w:eastAsia="es-ES" w:bidi="ar-SA"/>
-        </w:rPr>
-        <w:t xml:space="preserve"> puzles, como entornos controlados de gran utilidad para la evaluación del desempeño de agentes y algoritmos de búsqueda. Dentro de esta categoría, el </w:t>
+        <w:t xml:space="preserve"> ha utilizado históricamente los juegos y  puzles, como entornos controlados de gran utilidad para la evaluación del desempeño de agentes y algoritmos de búsqueda. Dentro de esta categoría, el </w:t>
       </w:r>
       <w:r>
         <w:rPr>
@@ -597,7 +539,7 @@
           <w:szCs w:val="20"/>
           <w:lang w:eastAsia="es-ES" w:bidi="ar-SA"/>
         </w:rPr>
-        <w:t xml:space="preserve"> representa un desafío clásico de optimización combinatoria y planificación. El juego </w:t>
+        <w:t xml:space="preserve"> representa un desafío clásico </w:t>
       </w:r>
       <w:r>
         <w:rPr>
@@ -607,7 +549,7 @@
           <w:szCs w:val="20"/>
           <w:lang w:eastAsia="es-ES" w:bidi="ar-SA"/>
         </w:rPr>
-        <w:t>está formado por</w:t>
+        <w:t>que en este trabajo atacaremos desde el ángulo de</w:t>
       </w:r>
       <w:r>
         <w:rPr>
@@ -617,7 +559,107 @@
           <w:szCs w:val="20"/>
           <w:lang w:eastAsia="es-ES" w:bidi="ar-SA"/>
         </w:rPr>
-        <w:t xml:space="preserve"> un tablero con M piezas y un único hueco; el objetivo consiste en realizar una secuencia de saltos ortogonales para eliminar piezas sucesivamente hasta que solo una permanezca en la posición del hueco original.</w:t>
+        <w:t xml:space="preserve"> </w:t>
+      </w:r>
+      <w:r>
+        <w:rPr>
+          <w:rFonts w:ascii="Times New Roman" w:eastAsia="Times New Roman" w:hAnsi="Times New Roman" w:cs="Times New Roman"/>
+          <w:kern w:val="0"/>
+          <w:sz w:val="20"/>
+          <w:szCs w:val="20"/>
+          <w:lang w:eastAsia="es-ES" w:bidi="ar-SA"/>
+        </w:rPr>
+        <w:t>la p</w:t>
+      </w:r>
+      <w:r>
+        <w:rPr>
+          <w:rFonts w:ascii="Times New Roman" w:eastAsia="Times New Roman" w:hAnsi="Times New Roman" w:cs="Times New Roman"/>
+          <w:kern w:val="0"/>
+          <w:sz w:val="20"/>
+          <w:szCs w:val="20"/>
+          <w:lang w:eastAsia="es-ES" w:bidi="ar-SA"/>
+        </w:rPr>
+        <w:t>lanificación</w:t>
+      </w:r>
+      <w:r>
+        <w:rPr>
+          <w:rFonts w:ascii="Times New Roman" w:eastAsia="Times New Roman" w:hAnsi="Times New Roman" w:cs="Times New Roman"/>
+          <w:kern w:val="0"/>
+          <w:sz w:val="20"/>
+          <w:szCs w:val="20"/>
+          <w:lang w:eastAsia="es-ES" w:bidi="ar-SA"/>
+        </w:rPr>
+        <w:t xml:space="preserve"> automática</w:t>
+      </w:r>
+      <w:r>
+        <w:rPr>
+          <w:rFonts w:ascii="Times New Roman" w:eastAsia="Times New Roman" w:hAnsi="Times New Roman" w:cs="Times New Roman"/>
+          <w:kern w:val="0"/>
+          <w:sz w:val="20"/>
+          <w:szCs w:val="20"/>
+          <w:lang w:eastAsia="es-ES" w:bidi="ar-SA"/>
+        </w:rPr>
+        <w:t xml:space="preserve">. El juego </w:t>
+      </w:r>
+      <w:r>
+        <w:rPr>
+          <w:rFonts w:ascii="Times New Roman" w:eastAsia="Times New Roman" w:hAnsi="Times New Roman" w:cs="Times New Roman"/>
+          <w:kern w:val="0"/>
+          <w:sz w:val="20"/>
+          <w:szCs w:val="20"/>
+          <w:lang w:eastAsia="es-ES" w:bidi="ar-SA"/>
+        </w:rPr>
+        <w:t>está formado por</w:t>
+      </w:r>
+      <w:r>
+        <w:rPr>
+          <w:rFonts w:ascii="Times New Roman" w:eastAsia="Times New Roman" w:hAnsi="Times New Roman" w:cs="Times New Roman"/>
+          <w:kern w:val="0"/>
+          <w:sz w:val="20"/>
+          <w:szCs w:val="20"/>
+          <w:lang w:eastAsia="es-ES" w:bidi="ar-SA"/>
+        </w:rPr>
+        <w:t xml:space="preserve"> un tablero con M piezas y un único hueco; el objetivo consiste en realizar una secuencia de saltos ortogonales para eliminar piezas sucesivamente hasta que solo una permanezca</w:t>
+      </w:r>
+      <w:r>
+        <w:rPr>
+          <w:rFonts w:ascii="Times New Roman" w:eastAsia="Times New Roman" w:hAnsi="Times New Roman" w:cs="Times New Roman"/>
+          <w:kern w:val="0"/>
+          <w:sz w:val="20"/>
+          <w:szCs w:val="20"/>
+          <w:lang w:eastAsia="es-ES" w:bidi="ar-SA"/>
+        </w:rPr>
+        <w:t>,</w:t>
+      </w:r>
+      <w:r>
+        <w:rPr>
+          <w:rFonts w:ascii="Times New Roman" w:eastAsia="Times New Roman" w:hAnsi="Times New Roman" w:cs="Times New Roman"/>
+          <w:kern w:val="0"/>
+          <w:sz w:val="20"/>
+          <w:szCs w:val="20"/>
+          <w:lang w:eastAsia="es-ES" w:bidi="ar-SA"/>
+        </w:rPr>
+        <w:t xml:space="preserve"> en la posición del hueco original</w:t>
+      </w:r>
+      <w:r>
+        <w:rPr>
+          <w:rFonts w:ascii="Times New Roman" w:eastAsia="Times New Roman" w:hAnsi="Times New Roman" w:cs="Times New Roman"/>
+          <w:kern w:val="0"/>
+          <w:sz w:val="20"/>
+          <w:szCs w:val="20"/>
+          <w:lang w:eastAsia="es-ES" w:bidi="ar-SA"/>
+        </w:rPr>
+        <w:t xml:space="preserve"> si fuera posible</w:t>
+      </w:r>
+      <w:r>
+        <w:rPr>
+          <w:rFonts w:ascii="Times New Roman" w:eastAsia="Times New Roman" w:hAnsi="Times New Roman" w:cs="Times New Roman"/>
+          <w:kern w:val="0"/>
+          <w:sz w:val="20"/>
+          <w:szCs w:val="20"/>
+          <w:lang w:eastAsia="es-ES" w:bidi="ar-SA"/>
+        </w:rPr>
+        <w:t>.</w:t>
       </w:r>
     </w:p>
     <w:p>
@@ -673,19 +715,7 @@
         <w:rPr>
           <w:lang w:val="es-ES"/>
         </w:rPr>
-        <w:t>, donde los nodos representan los estados del tablero y las aristas corresponden a las acciones válidas. Dado que el espacio de estados puede ser altamente complejo, el uso de algoritmos basados en grafos y técnicas heurísticas resulta fundamental para una exploración eficiente</w:t>
-      </w:r>
-      <w:r>
-        <w:rPr>
-          <w:lang w:val="es-ES"/>
-        </w:rPr>
-        <w:t>.</w:t>
-      </w:r>
-      <w:r>
-        <w:rPr>
-          <w:lang w:val="es-ES"/>
-        </w:rPr>
-        <w:t xml:space="preserve"> </w:t>
+        <w:t>, donde los nodos representan los estados del tablero y las aristas corresponden a las acciones válidas. Dado que el espacio de estados puede ser altamente complejo, el uso de algoritmos basados en grafos y técnicas heurísticas resulta fundamental para una exploración eficiente.</w:t>
       </w:r>
     </w:p>
     <w:p>
@@ -699,6 +729,26 @@
         <w:rPr>
           <w:lang w:val="es-ES"/>
         </w:rPr>
+        <w:t>#####No usamos búsqueda de grafo en el trabajo hehe</w:t>
+      </w:r>
+      <w:r>
+        <w:rPr>
+          <w:lang w:val="es-ES"/>
+        </w:rPr>
+        <w:t>, usamos búsqueda en espacio de estados</w:t>
+      </w:r>
+    </w:p>
+    <w:p>
+      <w:pPr>
+        <w:pStyle w:val="Textbody"/>
+        <w:rPr>
+          <w:lang w:val="es-ES"/>
+        </w:rPr>
+      </w:pPr>
+      <w:r>
+        <w:rPr>
+          <w:lang w:val="es-ES"/>
+        </w:rPr>
         <w:t xml:space="preserve">El </w:t>
       </w:r>
       <w:r>
@@ -739,7 +789,19 @@
         <w:rPr>
           <w:lang w:val="es-ES"/>
         </w:rPr>
-        <w:t xml:space="preserve"> El principal problema esta en la eficiencia en la búsqueda en tableros grandes con grandes espacios de estados, por lo que la solución propuesta se ha enfocado utilizando algoritmos avanzados de búsqueda mediante el lenguaje de programación Python. El algoritmo utilizado es el Beam Search que se explicará más adelante, pero en resumen es un algo</w:t>
+        <w:t xml:space="preserve"> El principal problema est</w:t>
+      </w:r>
+      <w:r>
+        <w:rPr>
+          <w:lang w:val="es-ES"/>
+        </w:rPr>
+        <w:t>á</w:t>
+      </w:r>
+      <w:r>
+        <w:rPr>
+          <w:lang w:val="es-ES"/>
+        </w:rPr>
+        <w:t xml:space="preserve"> en la eficiencia en la búsqueda en tableros grandes con grandes espacios de estados, por lo que la solución propuesta se ha enfocado utilizando algoritmos avanzados de búsqueda mediante el lenguaje de programación Python. El algoritmo utilizado es el Beam Search que se explicará más adelante, pero en resumen es un algo</w:t>
       </w:r>
       <w:r>
         <w:rPr>
@@ -750,7 +812,7 @@
     </w:p>
     <w:p>
       <w:pPr>
-        <w:pStyle w:val="Ttulo1"/>
+        <w:pStyle w:val="Heading1"/>
         <w:rPr>
           <w:lang w:val="es-ES"/>
         </w:rPr>
@@ -778,7 +840,7 @@
     </w:p>
     <w:p>
       <w:pPr>
-        <w:pStyle w:val="Ttulo2"/>
+        <w:pStyle w:val="Heading2"/>
         <w:rPr>
           <w:lang w:val="es-ES"/>
         </w:rPr>
@@ -788,6 +850,20 @@
           <w:lang w:val="es-ES"/>
         </w:rPr>
         <w:t>Métodos empleados</w:t>
+      </w:r>
+    </w:p>
+    <w:p>
+      <w:pPr>
+        <w:pStyle w:val="Standard"/>
+        <w:rPr>
+          <w:lang w:val="es-ES" w:eastAsia="en-US"/>
+        </w:rPr>
+      </w:pPr>
+      <w:r>
+        <w:rPr>
+          <w:lang w:val="es-ES" w:eastAsia="en-US"/>
+        </w:rPr>
+        <w:t>##### búsqueda en espacio de estados y clasificación por heurística</w:t>
       </w:r>
     </w:p>
     <w:p>
@@ -902,7 +978,7 @@
     </w:p>
     <w:p>
       <w:pPr>
-        <w:pStyle w:val="Ttulo2"/>
+        <w:pStyle w:val="Heading2"/>
         <w:rPr>
           <w:lang w:val="es-ES"/>
         </w:rPr>
@@ -916,56 +992,98 @@
     </w:p>
     <w:p>
       <w:pPr>
-        <w:pStyle w:val="Textbody"/>
-        <w:rPr>
-          <w:lang w:val="es-ES"/>
-        </w:rPr>
-      </w:pPr>
-      <w:r>
-        <w:rPr>
-          <w:lang w:val="es-ES"/>
-        </w:rPr>
-        <w:t>Se puede realizar un recorrido en la literatura sobre trabajos anteriores que estén relacionados y que sea por tanto interesante comentar aquí. Por supuesto, añadir las referencias bibliográficas correspondientes.</w:t>
+        <w:pStyle w:val="Standard"/>
+        <w:rPr>
+          <w:lang w:val="es-ES" w:eastAsia="en-US"/>
+        </w:rPr>
+      </w:pPr>
+      <w:r>
+        <w:rPr>
+          <w:lang w:val="es-ES" w:eastAsia="en-US"/>
+        </w:rPr>
+        <w:t>#### No se si aquí es el sitio, pero se puede poner referencia a consultar los links de las referencias para ver que había estados irresolubles del problema</w:t>
       </w:r>
     </w:p>
     <w:p>
       <w:pPr>
-        <w:pStyle w:val="Ttulo1"/>
-        <w:rPr>
-          <w:lang w:val="es-ES"/>
-        </w:rPr>
-      </w:pPr>
-      <w:r>
-        <w:rPr>
-          <w:lang w:val="es-ES"/>
-        </w:rPr>
-        <w:t>Metodología</w:t>
+        <w:pStyle w:val="Textbody"/>
+        <w:rPr>
+          <w:lang w:val="es-ES"/>
+        </w:rPr>
+      </w:pPr>
+      <w:r>
+        <w:rPr>
+          <w:lang w:val="es-ES"/>
+        </w:rPr>
+        <w:t>Se puede realizar un recorrido en la literatura sobre trabajos anteriores que estén relacionados y que sea por tanto interesante comentar aquí. Por supuesto, añadir las referencias bibliográficas correspondientes.</w:t>
       </w:r>
     </w:p>
     <w:p>
       <w:pPr>
-        <w:pStyle w:val="Textbody"/>
-        <w:rPr>
-          <w:lang w:val="es-ES"/>
-        </w:rPr>
-      </w:pPr>
-      <w:r>
-        <w:rPr>
-          <w:lang w:val="es-ES"/>
-        </w:rPr>
-        <w:t>Esta sección se dedica a la descripción del método implementado en el trabajo. Esta parte es la correspondiente a lo realmente desarrollado en el trabajo, y se puede emplear pseudocódigo (nunca código), esquemas, tablas, etc.</w:t>
+        <w:pStyle w:val="Heading1"/>
+        <w:rPr>
+          <w:lang w:val="es-ES"/>
+        </w:rPr>
+      </w:pPr>
+      <w:r>
+        <w:rPr>
+          <w:lang w:val="es-ES"/>
+        </w:rPr>
+        <w:t>Metodología</w:t>
       </w:r>
     </w:p>
     <w:p>
       <w:pPr>
-        <w:pStyle w:val="Textbody"/>
-        <w:rPr>
-          <w:lang w:val="es-ES"/>
-        </w:rPr>
-      </w:pPr>
+        <w:pStyle w:val="Standard"/>
+        <w:rPr>
+          <w:lang w:val="es-ES" w:eastAsia="en-US"/>
+        </w:rPr>
+      </w:pPr>
+      <w:r>
+        <w:rPr>
+          <w:lang w:val="es-ES" w:eastAsia="en-US"/>
+        </w:rPr>
+        <w:t xml:space="preserve">#### </w:t>
+      </w:r>
+      <w:r>
+        <w:rPr>
+          <w:lang w:val="es-ES" w:eastAsia="en-US"/>
+        </w:rPr>
+        <w:t>en la parte común seguimos el tipo de trabajo que nos enseñaron en la práctica, y en la parte de junio hemos ido optimizando la búsqueda mediante estudio y experimentación.</w:t>
+      </w:r>
     </w:p>
     <w:p>
       <w:pPr>
+        <w:pStyle w:val="Standard"/>
+        <w:rPr>
+          <w:lang w:val="es-ES" w:eastAsia="en-US"/>
+        </w:rPr>
+      </w:pPr>
+    </w:p>
+    <w:p>
+      <w:pPr>
+        <w:pStyle w:val="Textbody"/>
+        <w:rPr>
+          <w:lang w:val="es-ES"/>
+        </w:rPr>
+      </w:pPr>
+      <w:r>
+        <w:rPr>
+          <w:lang w:val="es-ES"/>
+        </w:rPr>
+        <w:t>Esta sección se dedica a la descripción del método implementado en el trabajo. Esta parte es la correspondiente a lo realmente desarrollado en el trabajo, y se puede emplear pseudocódigo (nunca código), esquemas, tablas, etc.</w:t>
+      </w:r>
+    </w:p>
+    <w:p>
+      <w:pPr>
+        <w:pStyle w:val="Textbody"/>
+        <w:rPr>
+          <w:lang w:val="es-ES"/>
+        </w:rPr>
+      </w:pPr>
+    </w:p>
+    <w:p>
+      <w:pPr>
         <w:pStyle w:val="Textbody"/>
         <w:jc w:val="center"/>
         <w:rPr>
@@ -974,6 +1092,7 @@
       </w:pPr>
       <w:r>
         <w:rPr>
+          <w:noProof/>
           <w:lang w:val="es-ES"/>
         </w:rPr>
         <w:drawing>
@@ -1035,6 +1154,7 @@
         <w:rPr>
           <w:lang w:val="es-ES"/>
         </w:rPr>
+        <w:lastRenderedPageBreak/>
         <w:t>Ejemplo de un pie de figura. Imagen con derechos Creative Commons</w:t>
       </w:r>
       <w:bookmarkEnd w:id="0"/>
@@ -1055,7 +1175,7 @@
     </w:p>
     <w:p>
       <w:pPr>
-        <w:pStyle w:val="Ttulo3"/>
+        <w:pStyle w:val="Heading3"/>
         <w:rPr>
           <w:lang w:val="es-ES"/>
         </w:rPr>
@@ -1069,22 +1189,21 @@
     </w:p>
     <w:p>
       <w:pPr>
-        <w:pStyle w:val="Ttulo3"/>
-        <w:rPr>
-          <w:lang w:val="es-ES"/>
-        </w:rPr>
-      </w:pPr>
-      <w:r>
-        <w:rPr>
-          <w:lang w:val="es-ES"/>
-        </w:rPr>
-        <w:lastRenderedPageBreak/>
+        <w:pStyle w:val="Heading3"/>
+        <w:rPr>
+          <w:lang w:val="es-ES"/>
+        </w:rPr>
+      </w:pPr>
+      <w:r>
+        <w:rPr>
+          <w:lang w:val="es-ES"/>
+        </w:rPr>
         <w:t>Trabajo con un autor: Cambiar la cabecera de la siguiente manera</w:t>
       </w:r>
     </w:p>
     <w:p>
       <w:pPr>
-        <w:pStyle w:val="Ttulo4"/>
+        <w:pStyle w:val="Heading4"/>
         <w:rPr>
           <w:lang w:val="es-ES"/>
         </w:rPr>
@@ -1098,7 +1217,7 @@
     </w:p>
     <w:p>
       <w:pPr>
-        <w:pStyle w:val="Ttulo4"/>
+        <w:pStyle w:val="Heading4"/>
         <w:rPr>
           <w:lang w:val="es-ES"/>
         </w:rPr>
@@ -1119,209 +1238,22 @@
       </w:pPr>
       <w:r>
         <w:rPr>
-          <w:lang w:val="es-ES"/>
-        </w:rPr>
-        <w:t xml:space="preserve">Las figuras se deben mencionar en el texto, como la </w:t>
-      </w:r>
-      <w:r>
-        <w:rPr>
-          <w:lang w:val="es-ES"/>
-        </w:rPr>
-        <w:fldChar w:fldCharType="begin"/>
-      </w:r>
-      <w:r>
-        <w:rPr>
-          <w:lang w:val="es-ES"/>
-        </w:rPr>
-        <w:instrText xml:space="preserve"> PAGEREF _Ref509684450 </w:instrText>
-      </w:r>
-      <w:r>
-        <w:rPr>
-          <w:lang w:val="es-ES"/>
-        </w:rPr>
-        <w:fldChar w:fldCharType="separate"/>
-      </w:r>
-      <w:r>
-        <w:rPr>
-          <w:lang w:val="es-ES"/>
-        </w:rPr>
-        <w:t>Fig. 1.</w:t>
-      </w:r>
-      <w:r>
-        <w:rPr>
-          <w:lang w:val="es-ES"/>
-        </w:rPr>
-        <w:fldChar w:fldCharType="end"/>
-      </w:r>
-      <w:r>
-        <w:rPr>
-          <w:lang w:val="es-ES"/>
-        </w:rPr>
-        <w:t xml:space="preserve">. También se puede añadir ecuaciones, como la ecuación (1).   Un ejemplo de pseudocódigo se puede observar en </w:t>
-      </w:r>
-      <w:r>
-        <w:rPr>
-          <w:lang w:val="es-ES"/>
-        </w:rPr>
-        <w:fldChar w:fldCharType="begin"/>
-      </w:r>
-      <w:r>
-        <w:rPr>
-          <w:lang w:val="es-ES"/>
-        </w:rPr>
-        <w:instrText xml:space="preserve"> REF _Ref509685628 </w:instrText>
-      </w:r>
-      <w:r>
-        <w:rPr>
-          <w:lang w:val="es-ES"/>
-        </w:rPr>
-        <w:fldChar w:fldCharType="separate"/>
-      </w:r>
-      <w:r>
-        <w:rPr>
-          <w:lang w:val="es-ES"/>
-        </w:rPr>
-        <w:t>Error: Reference source not found</w:t>
-      </w:r>
-      <w:r>
-        <w:rPr>
-          <w:lang w:val="es-ES"/>
-        </w:rPr>
-        <w:fldChar w:fldCharType="end"/>
-      </w:r>
-      <w:r>
-        <w:rPr>
-          <w:lang w:val="es-ES"/>
-        </w:rPr>
-        <w:t>.</w:t>
-      </w:r>
-    </w:p>
-    <w:p>
-      <w:pPr>
-        <w:pStyle w:val="equation"/>
-        <w:rPr>
-          <w:lang w:val="es-ES"/>
-        </w:rPr>
-      </w:pPr>
-      <w:r>
-        <w:rPr>
-          <w:lang w:val="es-ES"/>
-        </w:rPr>
-        <w:tab/>
-      </w:r>
-      <w:r>
-        <w:rPr>
-          <w:rFonts w:ascii="Times New Roman" w:hAnsi="Times New Roman" w:cs="Times New Roman"/>
-          <w:i/>
-          <w:lang w:val="es-ES"/>
-        </w:rPr>
-        <w:t>a</w:t>
-      </w:r>
-      <w:r>
-        <w:rPr>
-          <w:lang w:val="es-ES"/>
-        </w:rPr>
-        <w:t></w:t>
-      </w:r>
-      <w:r>
-        <w:rPr>
-          <w:lang w:val="es-ES"/>
-        </w:rPr>
-        <w:t></w:t>
-      </w:r>
-      <w:r>
-        <w:rPr>
-          <w:lang w:val="es-ES"/>
-        </w:rPr>
-        <w:t></w:t>
-      </w:r>
-      <w:r>
-        <w:rPr>
-          <w:rFonts w:ascii="Times New Roman" w:hAnsi="Times New Roman" w:cs="Times New Roman"/>
-          <w:i/>
-          <w:lang w:val="es-ES"/>
-        </w:rPr>
-        <w:t>b</w:t>
-      </w:r>
-      <w:r>
-        <w:rPr>
-          <w:lang w:val="es-ES"/>
-        </w:rPr>
-        <w:t></w:t>
-      </w:r>
-      <w:r>
-        <w:rPr>
-          <w:lang w:val="es-ES"/>
-        </w:rPr>
-        <w:t></w:t>
-      </w:r>
-      <w:r>
-        <w:rPr>
-          <w:lang w:val="es-ES"/>
-        </w:rPr>
-        <w:t></w:t>
-      </w:r>
-      <w:r>
-        <w:rPr>
-          <w:lang w:val="es-ES"/>
-        </w:rPr>
-        <w:t></w:t>
-      </w:r>
-      <w:r>
-        <w:rPr>
-          <w:lang w:val="es-ES"/>
-        </w:rPr>
-        <w:t></w:t>
-      </w:r>
-      <w:r>
-        <w:rPr>
-          <w:lang w:val="es-ES"/>
-        </w:rPr>
-        <w:tab/>
-      </w:r>
-      <w:r>
-        <w:rPr>
-          <w:lang w:val="es-ES"/>
-        </w:rPr>
-        <w:t></w:t>
-      </w:r>
-      <w:r>
-        <w:rPr>
-          <w:lang w:val="es-ES"/>
-        </w:rPr>
-        <w:t></w:t>
-      </w:r>
-      <w:r>
-        <w:rPr>
-          <w:lang w:val="es-ES"/>
-        </w:rPr>
-        <w:t></w:t>
-      </w:r>
-    </w:p>
-    <w:p>
-      <w:pPr>
-        <w:pStyle w:val="equation"/>
-        <w:rPr>
-          <w:lang w:val="es-ES"/>
-        </w:rPr>
-      </w:pPr>
-      <w:r>
-        <w:rPr>
+          <w:noProof/>
           <w:lang w:val="es-ES"/>
         </w:rPr>
         <mc:AlternateContent>
           <mc:Choice Requires="wps">
             <w:drawing>
-              <wp:anchor distT="0" distB="0" distL="114300" distR="114300" simplePos="0" relativeHeight="251659264" behindDoc="0" locked="0" layoutInCell="1" allowOverlap="1" wp14:anchorId="6F3E0C6A" wp14:editId="3A6F2C21">
+              <wp:anchor distT="0" distB="0" distL="114300" distR="114300" simplePos="0" relativeHeight="251659264" behindDoc="0" locked="0" layoutInCell="1" allowOverlap="1" wp14:anchorId="6F3E0C6A" wp14:editId="7D4971FE">
                 <wp:simplePos x="0" y="0"/>
                 <wp:positionH relativeFrom="column">
-                  <wp:posOffset>35661</wp:posOffset>
+                  <wp:posOffset>38100</wp:posOffset>
                 </wp:positionH>
                 <wp:positionV relativeFrom="paragraph">
-                  <wp:posOffset>53309</wp:posOffset>
+                  <wp:posOffset>344805</wp:posOffset>
                 </wp:positionV>
-                <wp:extent cx="2991916" cy="0"/>
-                <wp:effectExtent l="0" t="0" r="0" b="0"/>
+                <wp:extent cx="2991485" cy="4000500"/>
+                <wp:effectExtent l="0" t="0" r="20955" b="19050"/>
                 <wp:wrapSquare wrapText="bothSides"/>
                 <wp:docPr id="1090771516" name="Frame1"/>
                 <wp:cNvGraphicFramePr/>
@@ -1332,7 +1264,7 @@
                       <wps:spPr>
                         <a:xfrm>
                           <a:off x="0" y="0"/>
-                          <a:ext cx="2991916" cy="0"/>
+                          <a:ext cx="2991485" cy="4000500"/>
                         </a:xfrm>
                         <a:prstGeom prst="rect">
                           <a:avLst/>
@@ -1362,7 +1294,7 @@
                                 <w:sz w:val="18"/>
                                 <w:lang w:val="es-ES"/>
                               </w:rPr>
-                              <w:t>Procedimiento Mergesort</w:t>
+                              <w:t>Algoritmo de Beam Search</w:t>
                             </w:r>
                           </w:p>
                           <w:p>
@@ -1407,7 +1339,70 @@
                                 <w:sz w:val="18"/>
                                 <w:lang w:val="es-ES"/>
                               </w:rPr>
-                              <w:t>Un vector V</w:t>
+                              <w:t>Un set E de estado inicial</w:t>
+                            </w:r>
+                          </w:p>
+                          <w:p>
+                            <w:pPr>
+                              <w:pStyle w:val="Standard"/>
+                              <w:numPr>
+                                <w:ilvl w:val="0"/>
+                                <w:numId w:val="30"/>
+                              </w:numPr>
+                              <w:jc w:val="left"/>
+                              <w:rPr>
+                                <w:sz w:val="18"/>
+                                <w:lang w:val="es-ES"/>
+                              </w:rPr>
+                            </w:pPr>
+                            <w:r>
+                              <w:rPr>
+                                <w:sz w:val="18"/>
+                                <w:lang w:val="es-ES"/>
+                              </w:rPr>
+                              <w:t>Un set F de estado objetivo</w:t>
+                            </w:r>
+                          </w:p>
+                          <w:p>
+                            <w:pPr>
+                              <w:pStyle w:val="Standard"/>
+                              <w:numPr>
+                                <w:ilvl w:val="0"/>
+                                <w:numId w:val="30"/>
+                              </w:numPr>
+                              <w:jc w:val="left"/>
+                              <w:rPr>
+                                <w:sz w:val="18"/>
+                                <w:lang w:val="es-ES"/>
+                              </w:rPr>
+                            </w:pPr>
+                            <w:r>
+                              <w:rPr>
+                                <w:sz w:val="18"/>
+                                <w:lang w:val="es-ES"/>
+                              </w:rPr>
+                              <w:t>Una lista M de movimientos</w:t>
+                            </w:r>
+                          </w:p>
+                          <w:p>
+                            <w:pPr>
+                              <w:pStyle w:val="Standard"/>
+                              <w:numPr>
+                                <w:ilvl w:val="0"/>
+                                <w:numId w:val="30"/>
+                              </w:numPr>
+                              <w:jc w:val="left"/>
+                              <w:rPr>
+                                <w:sz w:val="18"/>
+                                <w:lang w:val="es-ES"/>
+                              </w:rPr>
+                            </w:pPr>
+                            <w:r>
+                              <w:rPr>
+                                <w:sz w:val="18"/>
+                                <w:lang w:val="es-ES"/>
+                              </w:rPr>
+                              <w:t>Un entero β</w:t>
                             </w:r>
                           </w:p>
                           <w:p>
@@ -1452,7 +1447,7 @@
                                 <w:sz w:val="18"/>
                                 <w:lang w:val="es-ES"/>
                               </w:rPr>
-                              <w:t>Un vector OV con los elementos ordenados</w:t>
+                              <w:t>Una lista P de movimientos que nos llevan del estado inicial al final.</w:t>
                             </w:r>
                           </w:p>
                           <w:p>
@@ -1460,6 +1455,7 @@
                               <w:pStyle w:val="Standard"/>
                               <w:jc w:val="left"/>
                               <w:rPr>
+                                <w:sz w:val="18"/>
                                 <w:lang w:val="es-ES"/>
                               </w:rPr>
                             </w:pPr>
@@ -1482,10 +1478,78 @@
                           <w:p>
                             <w:pPr>
                               <w:pStyle w:val="Standard"/>
-                              <w:numPr>
-                                <w:ilvl w:val="0"/>
-                                <w:numId w:val="32"/>
-                              </w:numPr>
+                              <w:jc w:val="left"/>
+                              <w:rPr>
+                                <w:sz w:val="18"/>
+                              </w:rPr>
+                            </w:pPr>
+                            <w:r>
+                              <w:rPr>
+                                <w:sz w:val="18"/>
+                              </w:rPr>
+                              <w:t xml:space="preserve">       P = List</w:t>
+                            </w:r>
+                            <w:r>
+                              <w:rPr>
+                                <w:sz w:val="18"/>
+                              </w:rPr>
+                              <w:t>[]</w:t>
+                            </w:r>
+                          </w:p>
+                          <w:p>
+                            <w:pPr>
+                              <w:pStyle w:val="Standard"/>
+                              <w:jc w:val="left"/>
+                              <w:rPr>
+                                <w:sz w:val="18"/>
+                              </w:rPr>
+                            </w:pPr>
+                            <w:r>
+                              <w:rPr>
+                                <w:sz w:val="18"/>
+                              </w:rPr>
+                              <w:t xml:space="preserve">       </w:t>
+                            </w:r>
+                            <w:r>
+                              <w:rPr>
+                                <w:sz w:val="18"/>
+                              </w:rPr>
+                              <w:t xml:space="preserve">B = </w:t>
+                            </w:r>
+                            <w:r>
+                              <w:rPr>
+                                <w:sz w:val="18"/>
+                              </w:rPr>
+                              <w:t>List [</w:t>
+                            </w:r>
+                            <w:r>
+                              <w:rPr>
+                                <w:sz w:val="18"/>
+                              </w:rPr>
+                              <w:t>Set(E,</w:t>
+                            </w:r>
+                            <w:r>
+                              <w:rPr>
+                                <w:sz w:val="18"/>
+                              </w:rPr>
+                              <w:t>P</w:t>
+                            </w:r>
+                            <w:r>
+                              <w:rPr>
+                                <w:sz w:val="18"/>
+                              </w:rPr>
+                              <w:t>)</w:t>
+                            </w:r>
+                            <w:r>
+                              <w:rPr>
+                                <w:sz w:val="18"/>
+                              </w:rPr>
+                              <w:t>]</w:t>
+                            </w:r>
+                          </w:p>
+                          <w:p>
+                            <w:pPr>
+                              <w:pStyle w:val="Standard"/>
                               <w:jc w:val="left"/>
                               <w:rPr>
                                 <w:sz w:val="18"/>
@@ -1497,17 +1561,36 @@
                                 <w:sz w:val="18"/>
                                 <w:lang w:val="es-ES"/>
                               </w:rPr>
-                              <w:t>Si longitud(V) == 1</w:t>
+                              <w:t xml:space="preserve">      </w:t>
+                            </w:r>
+                            <w:r>
+                              <w:rPr>
+                                <w:sz w:val="18"/>
+                                <w:lang w:val="es-ES"/>
+                              </w:rPr>
+                              <w:t xml:space="preserve"> Mientras B no esté vacío:</w:t>
                             </w:r>
                           </w:p>
                           <w:p>
                             <w:pPr>
                               <w:pStyle w:val="Standard"/>
-                              <w:numPr>
-                                <w:ilvl w:val="1"/>
-                                <w:numId w:val="18"/>
-                              </w:numPr>
-                              <w:ind w:left="709"/>
+                              <w:jc w:val="left"/>
+                              <w:rPr>
+                                <w:lang w:val="es-ES"/>
+                              </w:rPr>
+                            </w:pPr>
+                            <w:r>
+                              <w:rPr>
+                                <w:sz w:val="18"/>
+                                <w:lang w:val="es-ES"/>
+                              </w:rPr>
+                              <w:tab/>
+                              <w:t>candidatos = []</w:t>
+                            </w:r>
+                          </w:p>
+                          <w:p>
+                            <w:pPr>
+                              <w:pStyle w:val="Standard"/>
                               <w:jc w:val="left"/>
                               <w:rPr>
                                 <w:sz w:val="18"/>
@@ -1519,16 +1602,27 @@
                                 <w:sz w:val="18"/>
                                 <w:lang w:val="es-ES"/>
                               </w:rPr>
-                              <w:t>Devolver OV=V</w:t>
+                              <w:tab/>
+                              <w:t>for(estado e</w:t>
+                            </w:r>
+                            <w:r>
+                              <w:rPr>
+                                <w:sz w:val="18"/>
+                                <w:lang w:val="es-ES"/>
+                              </w:rPr>
+                              <w:t>, plan p</w:t>
+                            </w:r>
+                            <w:r>
+                              <w:rPr>
+                                <w:sz w:val="18"/>
+                                <w:lang w:val="es-ES"/>
+                              </w:rPr>
+                              <w:t xml:space="preserve"> en B):</w:t>
                             </w:r>
                           </w:p>
                           <w:p>
                             <w:pPr>
                               <w:pStyle w:val="Standard"/>
-                              <w:numPr>
-                                <w:ilvl w:val="0"/>
-                                <w:numId w:val="18"/>
-                              </w:numPr>
                               <w:jc w:val="left"/>
                               <w:rPr>
                                 <w:sz w:val="18"/>
@@ -1540,17 +1634,19 @@
                                 <w:sz w:val="18"/>
                                 <w:lang w:val="es-ES"/>
                               </w:rPr>
-                              <w:t>Sino</w:t>
+                              <w:tab/>
+                            </w:r>
+                            <w:r>
+                              <w:rPr>
+                                <w:sz w:val="18"/>
+                                <w:lang w:val="es-ES"/>
+                              </w:rPr>
+                              <w:t xml:space="preserve">      MP = movimientos posibles en e</w:t>
                             </w:r>
                           </w:p>
                           <w:p>
                             <w:pPr>
                               <w:pStyle w:val="Standard"/>
-                              <w:numPr>
-                                <w:ilvl w:val="1"/>
-                                <w:numId w:val="18"/>
-                              </w:numPr>
-                              <w:ind w:left="709"/>
                               <w:jc w:val="left"/>
                               <w:rPr>
                                 <w:sz w:val="18"/>
@@ -1562,17 +1658,13 @@
                                 <w:sz w:val="18"/>
                                 <w:lang w:val="es-ES"/>
                               </w:rPr>
-                              <w:t>V1 = primera mitad de V</w:t>
+                              <w:tab/>
+                              <w:t xml:space="preserve">     for(mov in MP):</w:t>
                             </w:r>
                           </w:p>
                           <w:p>
                             <w:pPr>
                               <w:pStyle w:val="Standard"/>
-                              <w:numPr>
-                                <w:ilvl w:val="1"/>
-                                <w:numId w:val="18"/>
-                              </w:numPr>
-                              <w:ind w:left="709"/>
                               <w:jc w:val="left"/>
                               <w:rPr>
                                 <w:sz w:val="18"/>
@@ -1584,17 +1676,13 @@
                                 <w:sz w:val="18"/>
                                 <w:lang w:val="es-ES"/>
                               </w:rPr>
-                              <w:t>V2 = segunda mitad de V</w:t>
+                              <w:tab/>
+                              <w:t xml:space="preserve">          nuevo_e = aplicar_mov(e, mov)</w:t>
                             </w:r>
                           </w:p>
                           <w:p>
                             <w:pPr>
                               <w:pStyle w:val="Standard"/>
-                              <w:numPr>
-                                <w:ilvl w:val="1"/>
-                                <w:numId w:val="18"/>
-                              </w:numPr>
-                              <w:ind w:left="709"/>
                               <w:jc w:val="left"/>
                               <w:rPr>
                                 <w:sz w:val="18"/>
@@ -1606,17 +1694,13 @@
                                 <w:sz w:val="18"/>
                                 <w:lang w:val="es-ES"/>
                               </w:rPr>
-                              <w:t>Mergesort(V1)</w:t>
+                              <w:tab/>
+                              <w:t xml:space="preserve">          nuevo_p = p.add(mov)</w:t>
                             </w:r>
                           </w:p>
                           <w:p>
                             <w:pPr>
                               <w:pStyle w:val="Standard"/>
-                              <w:numPr>
-                                <w:ilvl w:val="1"/>
-                                <w:numId w:val="18"/>
-                              </w:numPr>
-                              <w:ind w:left="709"/>
                               <w:jc w:val="left"/>
                               <w:rPr>
                                 <w:sz w:val="18"/>
@@ -1628,17 +1712,13 @@
                                 <w:sz w:val="18"/>
                                 <w:lang w:val="es-ES"/>
                               </w:rPr>
-                              <w:t>Mergesort(V2)</w:t>
+                              <w:tab/>
+                              <w:t xml:space="preserve">          if(esSolucion(nuevo_e)):</w:t>
                             </w:r>
                           </w:p>
                           <w:p>
                             <w:pPr>
                               <w:pStyle w:val="Standard"/>
-                              <w:numPr>
-                                <w:ilvl w:val="1"/>
-                                <w:numId w:val="18"/>
-                              </w:numPr>
-                              <w:ind w:left="709"/>
                               <w:jc w:val="left"/>
                               <w:rPr>
                                 <w:sz w:val="18"/>
@@ -1650,17 +1730,20 @@
                                 <w:sz w:val="18"/>
                                 <w:lang w:val="es-ES"/>
                               </w:rPr>
-                              <w:t>OV = vacío</w:t>
+                              <w:tab/>
+                            </w:r>
+                            <w:r>
+                              <w:rPr>
+                                <w:sz w:val="18"/>
+                                <w:lang w:val="es-ES"/>
+                              </w:rPr>
+                              <w:tab/>
+                              <w:t>return nuevo_p</w:t>
                             </w:r>
                           </w:p>
                           <w:p>
                             <w:pPr>
                               <w:pStyle w:val="Standard"/>
-                              <w:numPr>
-                                <w:ilvl w:val="1"/>
-                                <w:numId w:val="18"/>
-                              </w:numPr>
-                              <w:ind w:left="709"/>
                               <w:jc w:val="left"/>
                               <w:rPr>
                                 <w:sz w:val="18"/>
@@ -1672,38 +1755,13 @@
                                 <w:sz w:val="18"/>
                                 <w:lang w:val="es-ES"/>
                               </w:rPr>
-                              <w:t>i, j = 0</w:t>
+                              <w:tab/>
+                              <w:t xml:space="preserve">          h  = aplicar_heuristica(nuevo_e)</w:t>
                             </w:r>
                           </w:p>
                           <w:p>
                             <w:pPr>
                               <w:pStyle w:val="Standard"/>
-                              <w:numPr>
-                                <w:ilvl w:val="1"/>
-                                <w:numId w:val="18"/>
-                              </w:numPr>
-                              <w:ind w:left="709"/>
-                              <w:jc w:val="left"/>
-                              <w:rPr>
-                                <w:lang w:val="es-ES"/>
-                              </w:rPr>
-                            </w:pPr>
-                            <w:r>
-                              <w:rPr>
-                                <w:sz w:val="18"/>
-                                <w:lang w:val="es-ES"/>
-                              </w:rPr>
-                              <w:t>Mientras i&lt;longitud(V1) o j&lt;longitud(V2)</w:t>
-                            </w:r>
-                          </w:p>
-                          <w:p>
-                            <w:pPr>
-                              <w:pStyle w:val="Standard"/>
-                              <w:numPr>
-                                <w:ilvl w:val="2"/>
-                                <w:numId w:val="18"/>
-                              </w:numPr>
-                              <w:ind w:left="993"/>
                               <w:jc w:val="left"/>
                               <w:rPr>
                                 <w:sz w:val="18"/>
@@ -1715,17 +1773,13 @@
                                 <w:sz w:val="18"/>
                                 <w:lang w:val="es-ES"/>
                               </w:rPr>
-                              <w:t>Si V1[i] &lt; V2[j] o j==longitud(V2)</w:t>
+                              <w:tab/>
+                              <w:t xml:space="preserve">          candidatos.add( (nuevo_e, h, nuevo_p) )</w:t>
                             </w:r>
                           </w:p>
                           <w:p>
                             <w:pPr>
                               <w:pStyle w:val="Standard"/>
-                              <w:numPr>
-                                <w:ilvl w:val="3"/>
-                                <w:numId w:val="18"/>
-                              </w:numPr>
-                              <w:ind w:left="1560"/>
                               <w:jc w:val="left"/>
                               <w:rPr>
                                 <w:sz w:val="18"/>
@@ -1737,17 +1791,13 @@
                                 <w:sz w:val="18"/>
                                 <w:lang w:val="es-ES"/>
                               </w:rPr>
-                              <w:t>Añadir V1[i] a OV</w:t>
+                              <w:tab/>
+                              <w:t>candidatos.sort(key=h)</w:t>
                             </w:r>
                           </w:p>
                           <w:p>
                             <w:pPr>
                               <w:pStyle w:val="Standard"/>
-                              <w:numPr>
-                                <w:ilvl w:val="3"/>
-                                <w:numId w:val="18"/>
-                              </w:numPr>
-                              <w:ind w:left="1560"/>
                               <w:jc w:val="left"/>
                               <w:rPr>
                                 <w:sz w:val="18"/>
@@ -1759,17 +1809,27 @@
                                 <w:sz w:val="18"/>
                                 <w:lang w:val="es-ES"/>
                               </w:rPr>
-                              <w:t>Incrementar i en 1</w:t>
+                              <w:tab/>
+                              <w:t>beam = candidatos[:</w:t>
+                            </w:r>
+                            <w:r>
+                              <w:rPr>
+                                <w:sz w:val="18"/>
+                                <w:lang w:val="es-ES"/>
+                              </w:rPr>
+                              <w:t>β</w:t>
+                            </w:r>
+                            <w:r>
+                              <w:rPr>
+                                <w:sz w:val="18"/>
+                                <w:lang w:val="es-ES"/>
+                              </w:rPr>
+                              <w:t>]</w:t>
                             </w:r>
                           </w:p>
                           <w:p>
                             <w:pPr>
                               <w:pStyle w:val="Standard"/>
-                              <w:numPr>
-                                <w:ilvl w:val="2"/>
-                                <w:numId w:val="18"/>
-                              </w:numPr>
-                              <w:ind w:left="993"/>
                               <w:jc w:val="left"/>
                               <w:rPr>
                                 <w:sz w:val="18"/>
@@ -1781,83 +1841,20 @@
                                 <w:sz w:val="18"/>
                                 <w:lang w:val="es-ES"/>
                               </w:rPr>
-                              <w:t>Sino</w:t>
-                            </w:r>
-                          </w:p>
-                          <w:p>
-                            <w:pPr>
-                              <w:pStyle w:val="Standard"/>
-                              <w:numPr>
-                                <w:ilvl w:val="3"/>
-                                <w:numId w:val="18"/>
-                              </w:numPr>
-                              <w:ind w:left="1560"/>
-                              <w:jc w:val="left"/>
-                              <w:rPr>
-                                <w:sz w:val="18"/>
-                                <w:lang w:val="es-ES"/>
-                              </w:rPr>
-                            </w:pPr>
-                            <w:r>
-                              <w:rPr>
-                                <w:sz w:val="18"/>
-                                <w:lang w:val="es-ES"/>
-                              </w:rPr>
-                              <w:t>Añadir V2(j) a OV</w:t>
-                            </w:r>
-                          </w:p>
-                          <w:p>
-                            <w:pPr>
-                              <w:pStyle w:val="Standard"/>
-                              <w:numPr>
-                                <w:ilvl w:val="3"/>
-                                <w:numId w:val="18"/>
-                              </w:numPr>
-                              <w:ind w:left="1560"/>
-                              <w:jc w:val="left"/>
-                              <w:rPr>
-                                <w:sz w:val="18"/>
-                                <w:lang w:val="es-ES"/>
-                              </w:rPr>
-                            </w:pPr>
-                            <w:r>
-                              <w:rPr>
-                                <w:sz w:val="18"/>
-                                <w:lang w:val="es-ES"/>
-                              </w:rPr>
-                              <w:t>Incrementar j en 1</w:t>
-                            </w:r>
-                          </w:p>
-                          <w:p>
-                            <w:pPr>
-                              <w:pStyle w:val="Standard"/>
-                              <w:numPr>
-                                <w:ilvl w:val="3"/>
-                                <w:numId w:val="18"/>
-                              </w:numPr>
-                              <w:ind w:left="709"/>
-                              <w:jc w:val="left"/>
-                              <w:rPr>
-                                <w:sz w:val="18"/>
-                                <w:lang w:val="es-ES"/>
-                              </w:rPr>
-                            </w:pPr>
-                            <w:r>
-                              <w:rPr>
-                                <w:sz w:val="18"/>
-                                <w:lang w:val="es-ES"/>
-                              </w:rPr>
-                              <w:t>Devolver OV</w:t>
+                              <w:t xml:space="preserve">       return None</w:t>
                             </w:r>
                           </w:p>
                         </w:txbxContent>
                       </wps:txbx>
                       <wps:bodyPr vert="horz" wrap="none" lIns="91440" tIns="45720" rIns="91440" bIns="45720" compatLnSpc="0">
-                        <a:spAutoFit/>
+                        <a:noAutofit/>
                       </wps:bodyPr>
                     </wps:wsp>
                   </a:graphicData>
                 </a:graphic>
+                <wp14:sizeRelV relativeFrom="margin">
+                  <wp14:pctHeight>0</wp14:pctHeight>
+                </wp14:sizeRelV>
               </wp:anchor>
             </w:drawing>
           </mc:Choice>
@@ -1867,8 +1864,8 @@
                 <v:stroke joinstyle="miter"/>
                 <v:path gradientshapeok="t" o:connecttype="rect"/>
               </v:shapetype>
-              <v:shape id="Frame1" o:spid="_x0000_s1026" type="#_x0000_t202" style="position:absolute;left:0;text-align:left;margin-left:2.8pt;margin-top:4.2pt;width:235.6pt;height:0;z-index:251659264;visibility:visible;mso-wrap-style:none;mso-wrap-distance-left:9pt;mso-wrap-distance-top:0;mso-wrap-distance-right:9pt;mso-wrap-distance-bottom:0;mso-position-horizontal:absolute;mso-position-horizontal-relative:text;mso-position-vertical:absolute;mso-position-vertical-relative:text;v-text-anchor:top" o:gfxdata="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" filled="f" strokeweight=".74pt">
-                <v:textbox style="mso-fit-shape-to-text:t">
+              <v:shape id="Frame1" o:spid="_x0000_s1026" type="#_x0000_t202" style="position:absolute;left:0;text-align:left;margin-left:3pt;margin-top:27.15pt;width:235.55pt;height:315pt;z-index:251659264;visibility:visible;mso-wrap-style:none;mso-height-percent:0;mso-wrap-distance-left:9pt;mso-wrap-distance-top:0;mso-wrap-distance-right:9pt;mso-wrap-distance-bottom:0;mso-position-horizontal:absolute;mso-position-horizontal-relative:text;mso-position-vertical:absolute;mso-position-vertical-relative:text;mso-height-percent:0;mso-height-relative:margin;v-text-anchor:top" o:gfxdata="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" filled="f" strokeweight=".74pt">
+                <v:textbox>
                   <w:txbxContent>
                     <w:p>
                       <w:pPr>
@@ -1886,7 +1883,7 @@
                           <w:sz w:val="18"/>
                           <w:lang w:val="es-ES"/>
                         </w:rPr>
-                        <w:t>Procedimiento Mergesort</w:t>
+                        <w:t>Algoritmo de Beam Search</w:t>
                       </w:r>
                     </w:p>
                     <w:p>
@@ -1931,7 +1928,70 @@
                           <w:sz w:val="18"/>
                           <w:lang w:val="es-ES"/>
                         </w:rPr>
-                        <w:t>Un vector V</w:t>
+                        <w:t>Un set E de estado inicial</w:t>
+                      </w:r>
+                    </w:p>
+                    <w:p>
+                      <w:pPr>
+                        <w:pStyle w:val="Standard"/>
+                        <w:numPr>
+                          <w:ilvl w:val="0"/>
+                          <w:numId w:val="30"/>
+                        </w:numPr>
+                        <w:jc w:val="left"/>
+                        <w:rPr>
+                          <w:sz w:val="18"/>
+                          <w:lang w:val="es-ES"/>
+                        </w:rPr>
+                      </w:pPr>
+                      <w:r>
+                        <w:rPr>
+                          <w:sz w:val="18"/>
+                          <w:lang w:val="es-ES"/>
+                        </w:rPr>
+                        <w:t>Un set F de estado objetivo</w:t>
+                      </w:r>
+                    </w:p>
+                    <w:p>
+                      <w:pPr>
+                        <w:pStyle w:val="Standard"/>
+                        <w:numPr>
+                          <w:ilvl w:val="0"/>
+                          <w:numId w:val="30"/>
+                        </w:numPr>
+                        <w:jc w:val="left"/>
+                        <w:rPr>
+                          <w:sz w:val="18"/>
+                          <w:lang w:val="es-ES"/>
+                        </w:rPr>
+                      </w:pPr>
+                      <w:r>
+                        <w:rPr>
+                          <w:sz w:val="18"/>
+                          <w:lang w:val="es-ES"/>
+                        </w:rPr>
+                        <w:t>Una lista M de movimientos</w:t>
+                      </w:r>
+                    </w:p>
+                    <w:p>
+                      <w:pPr>
+                        <w:pStyle w:val="Standard"/>
+                        <w:numPr>
+                          <w:ilvl w:val="0"/>
+                          <w:numId w:val="30"/>
+                        </w:numPr>
+                        <w:jc w:val="left"/>
+                        <w:rPr>
+                          <w:sz w:val="18"/>
+                          <w:lang w:val="es-ES"/>
+                        </w:rPr>
+                      </w:pPr>
+                      <w:r>
+                        <w:rPr>
+                          <w:sz w:val="18"/>
+                          <w:lang w:val="es-ES"/>
+                        </w:rPr>
+                        <w:t>Un entero β</w:t>
                       </w:r>
                     </w:p>
                     <w:p>
@@ -1976,7 +2036,7 @@
                           <w:sz w:val="18"/>
                           <w:lang w:val="es-ES"/>
                         </w:rPr>
-                        <w:t>Un vector OV con los elementos ordenados</w:t>
+                        <w:t>Una lista P de movimientos que nos llevan del estado inicial al final.</w:t>
                       </w:r>
                     </w:p>
                     <w:p>
@@ -1984,6 +2044,7 @@
                         <w:pStyle w:val="Standard"/>
                         <w:jc w:val="left"/>
                         <w:rPr>
+                          <w:sz w:val="18"/>
                           <w:lang w:val="es-ES"/>
                         </w:rPr>
                       </w:pPr>
@@ -2006,10 +2067,78 @@
                     <w:p>
                       <w:pPr>
                         <w:pStyle w:val="Standard"/>
-                        <w:numPr>
-                          <w:ilvl w:val="0"/>
-                          <w:numId w:val="32"/>
-                        </w:numPr>
+                        <w:jc w:val="left"/>
+                        <w:rPr>
+                          <w:sz w:val="18"/>
+                        </w:rPr>
+                      </w:pPr>
+                      <w:r>
+                        <w:rPr>
+                          <w:sz w:val="18"/>
+                        </w:rPr>
+                        <w:t xml:space="preserve">       P = List</w:t>
+                      </w:r>
+                      <w:r>
+                        <w:rPr>
+                          <w:sz w:val="18"/>
+                        </w:rPr>
+                        <w:t>[]</w:t>
+                      </w:r>
+                    </w:p>
+                    <w:p>
+                      <w:pPr>
+                        <w:pStyle w:val="Standard"/>
+                        <w:jc w:val="left"/>
+                        <w:rPr>
+                          <w:sz w:val="18"/>
+                        </w:rPr>
+                      </w:pPr>
+                      <w:r>
+                        <w:rPr>
+                          <w:sz w:val="18"/>
+                        </w:rPr>
+                        <w:t xml:space="preserve">       </w:t>
+                      </w:r>
+                      <w:r>
+                        <w:rPr>
+                          <w:sz w:val="18"/>
+                        </w:rPr>
+                        <w:t xml:space="preserve">B = </w:t>
+                      </w:r>
+                      <w:r>
+                        <w:rPr>
+                          <w:sz w:val="18"/>
+                        </w:rPr>
+                        <w:t>List [</w:t>
+                      </w:r>
+                      <w:r>
+                        <w:rPr>
+                          <w:sz w:val="18"/>
+                        </w:rPr>
+                        <w:t>Set(E,</w:t>
+                      </w:r>
+                      <w:r>
+                        <w:rPr>
+                          <w:sz w:val="18"/>
+                        </w:rPr>
+                        <w:t>P</w:t>
+                      </w:r>
+                      <w:r>
+                        <w:rPr>
+                          <w:sz w:val="18"/>
+                        </w:rPr>
+                        <w:t>)</w:t>
+                      </w:r>
+                      <w:r>
+                        <w:rPr>
+                          <w:sz w:val="18"/>
+                        </w:rPr>
+                        <w:t>]</w:t>
+                      </w:r>
+                    </w:p>
+                    <w:p>
+                      <w:pPr>
+                        <w:pStyle w:val="Standard"/>
                         <w:jc w:val="left"/>
                         <w:rPr>
                           <w:sz w:val="18"/>
@@ -2021,17 +2150,36 @@
                           <w:sz w:val="18"/>
                           <w:lang w:val="es-ES"/>
                         </w:rPr>
-                        <w:t>Si longitud(V) == 1</w:t>
+                        <w:t xml:space="preserve">      </w:t>
+                      </w:r>
+                      <w:r>
+                        <w:rPr>
+                          <w:sz w:val="18"/>
+                          <w:lang w:val="es-ES"/>
+                        </w:rPr>
+                        <w:t xml:space="preserve"> Mientras B no esté vacío:</w:t>
                       </w:r>
                     </w:p>
                     <w:p>
                       <w:pPr>
                         <w:pStyle w:val="Standard"/>
-                        <w:numPr>
-                          <w:ilvl w:val="1"/>
-                          <w:numId w:val="18"/>
-                        </w:numPr>
-                        <w:ind w:left="709"/>
+                        <w:jc w:val="left"/>
+                        <w:rPr>
+                          <w:lang w:val="es-ES"/>
+                        </w:rPr>
+                      </w:pPr>
+                      <w:r>
+                        <w:rPr>
+                          <w:sz w:val="18"/>
+                          <w:lang w:val="es-ES"/>
+                        </w:rPr>
+                        <w:tab/>
+                        <w:t>candidatos = []</w:t>
+                      </w:r>
+                    </w:p>
+                    <w:p>
+                      <w:pPr>
+                        <w:pStyle w:val="Standard"/>
                         <w:jc w:val="left"/>
                         <w:rPr>
                           <w:sz w:val="18"/>
@@ -2043,16 +2191,27 @@
                           <w:sz w:val="18"/>
                           <w:lang w:val="es-ES"/>
                         </w:rPr>
-                        <w:t>Devolver OV=V</w:t>
+                        <w:tab/>
+                        <w:t>for(estado e</w:t>
+                      </w:r>
+                      <w:r>
+                        <w:rPr>
+                          <w:sz w:val="18"/>
+                          <w:lang w:val="es-ES"/>
+                        </w:rPr>
+                        <w:t>, plan p</w:t>
+                      </w:r>
+                      <w:r>
+                        <w:rPr>
+                          <w:sz w:val="18"/>
+                          <w:lang w:val="es-ES"/>
+                        </w:rPr>
+                        <w:t xml:space="preserve"> en B):</w:t>
                       </w:r>
                     </w:p>
                     <w:p>
                       <w:pPr>
                         <w:pStyle w:val="Standard"/>
-                        <w:numPr>
-                          <w:ilvl w:val="0"/>
-                          <w:numId w:val="18"/>
-                        </w:numPr>
                         <w:jc w:val="left"/>
                         <w:rPr>
                           <w:sz w:val="18"/>
@@ -2064,17 +2223,19 @@
                           <w:sz w:val="18"/>
                           <w:lang w:val="es-ES"/>
                         </w:rPr>
-                        <w:t>Sino</w:t>
+                        <w:tab/>
+                      </w:r>
+                      <w:r>
+                        <w:rPr>
+                          <w:sz w:val="18"/>
+                          <w:lang w:val="es-ES"/>
+                        </w:rPr>
+                        <w:t xml:space="preserve">      MP = movimientos posibles en e</w:t>
                       </w:r>
                     </w:p>
                     <w:p>
                       <w:pPr>
                         <w:pStyle w:val="Standard"/>
-                        <w:numPr>
-                          <w:ilvl w:val="1"/>
-                          <w:numId w:val="18"/>
-                        </w:numPr>
-                        <w:ind w:left="709"/>
                         <w:jc w:val="left"/>
                         <w:rPr>
                           <w:sz w:val="18"/>
@@ -2086,17 +2247,13 @@
                           <w:sz w:val="18"/>
                           <w:lang w:val="es-ES"/>
                         </w:rPr>
-                        <w:t>V1 = primera mitad de V</w:t>
+                        <w:tab/>
+                        <w:t xml:space="preserve">     for(mov in MP):</w:t>
                       </w:r>
                     </w:p>
                     <w:p>
                       <w:pPr>
                         <w:pStyle w:val="Standard"/>
-                        <w:numPr>
-                          <w:ilvl w:val="1"/>
-                          <w:numId w:val="18"/>
-                        </w:numPr>
-                        <w:ind w:left="709"/>
                         <w:jc w:val="left"/>
                         <w:rPr>
                           <w:sz w:val="18"/>
@@ -2108,17 +2265,13 @@
                           <w:sz w:val="18"/>
                           <w:lang w:val="es-ES"/>
                         </w:rPr>
-                        <w:t>V2 = segunda mitad de V</w:t>
+                        <w:tab/>
+                        <w:t xml:space="preserve">          nuevo_e = aplicar_mov(e, mov)</w:t>
                       </w:r>
                     </w:p>
                     <w:p>
                       <w:pPr>
                         <w:pStyle w:val="Standard"/>
-                        <w:numPr>
-                          <w:ilvl w:val="1"/>
-                          <w:numId w:val="18"/>
-                        </w:numPr>
-                        <w:ind w:left="709"/>
                         <w:jc w:val="left"/>
                         <w:rPr>
                           <w:sz w:val="18"/>
@@ -2130,17 +2283,13 @@
                           <w:sz w:val="18"/>
                           <w:lang w:val="es-ES"/>
                         </w:rPr>
-                        <w:t>Mergesort(V1)</w:t>
+                        <w:tab/>
+                        <w:t xml:space="preserve">          nuevo_p = p.add(mov)</w:t>
                       </w:r>
                     </w:p>
                     <w:p>
                       <w:pPr>
                         <w:pStyle w:val="Standard"/>
-                        <w:numPr>
-                          <w:ilvl w:val="1"/>
-                          <w:numId w:val="18"/>
-                        </w:numPr>
-                        <w:ind w:left="709"/>
                         <w:jc w:val="left"/>
                         <w:rPr>
                           <w:sz w:val="18"/>
@@ -2152,17 +2301,13 @@
                           <w:sz w:val="18"/>
                           <w:lang w:val="es-ES"/>
                         </w:rPr>
-                        <w:t>Mergesort(V2)</w:t>
+                        <w:tab/>
+                        <w:t xml:space="preserve">          if(esSolucion(nuevo_e)):</w:t>
                       </w:r>
                     </w:p>
                     <w:p>
                       <w:pPr>
                         <w:pStyle w:val="Standard"/>
-                        <w:numPr>
-                          <w:ilvl w:val="1"/>
-                          <w:numId w:val="18"/>
-                        </w:numPr>
-                        <w:ind w:left="709"/>
                         <w:jc w:val="left"/>
                         <w:rPr>
                           <w:sz w:val="18"/>
@@ -2174,17 +2319,20 @@
                           <w:sz w:val="18"/>
                           <w:lang w:val="es-ES"/>
                         </w:rPr>
-                        <w:t>OV = vacío</w:t>
+                        <w:tab/>
+                      </w:r>
+                      <w:r>
+                        <w:rPr>
+                          <w:sz w:val="18"/>
+                          <w:lang w:val="es-ES"/>
+                        </w:rPr>
+                        <w:tab/>
+                        <w:t>return nuevo_p</w:t>
                       </w:r>
                     </w:p>
                     <w:p>
                       <w:pPr>
                         <w:pStyle w:val="Standard"/>
-                        <w:numPr>
-                          <w:ilvl w:val="1"/>
-                          <w:numId w:val="18"/>
-                        </w:numPr>
-                        <w:ind w:left="709"/>
                         <w:jc w:val="left"/>
                         <w:rPr>
                           <w:sz w:val="18"/>
@@ -2196,38 +2344,13 @@
                           <w:sz w:val="18"/>
                           <w:lang w:val="es-ES"/>
                         </w:rPr>
-                        <w:t>i, j = 0</w:t>
+                        <w:tab/>
+                        <w:t xml:space="preserve">          h  = aplicar_heuristica(nuevo_e)</w:t>
                       </w:r>
                     </w:p>
                     <w:p>
                       <w:pPr>
                         <w:pStyle w:val="Standard"/>
-                        <w:numPr>
-                          <w:ilvl w:val="1"/>
-                          <w:numId w:val="18"/>
-                        </w:numPr>
-                        <w:ind w:left="709"/>
-                        <w:jc w:val="left"/>
-                        <w:rPr>
-                          <w:lang w:val="es-ES"/>
-                        </w:rPr>
-                      </w:pPr>
-                      <w:r>
-                        <w:rPr>
-                          <w:sz w:val="18"/>
-                          <w:lang w:val="es-ES"/>
-                        </w:rPr>
-                        <w:t>Mientras i&lt;longitud(V1) o j&lt;longitud(V2)</w:t>
-                      </w:r>
-                    </w:p>
-                    <w:p>
-                      <w:pPr>
-                        <w:pStyle w:val="Standard"/>
-                        <w:numPr>
-                          <w:ilvl w:val="2"/>
-                          <w:numId w:val="18"/>
-                        </w:numPr>
-                        <w:ind w:left="993"/>
                         <w:jc w:val="left"/>
                         <w:rPr>
                           <w:sz w:val="18"/>
@@ -2239,17 +2362,13 @@
                           <w:sz w:val="18"/>
                           <w:lang w:val="es-ES"/>
                         </w:rPr>
-                        <w:t>Si V1[i] &lt; V2[j] o j==longitud(V2)</w:t>
+                        <w:tab/>
+                        <w:t xml:space="preserve">          candidatos.add( (nuevo_e, h, nuevo_p) )</w:t>
                       </w:r>
                     </w:p>
                     <w:p>
                       <w:pPr>
                         <w:pStyle w:val="Standard"/>
-                        <w:numPr>
-                          <w:ilvl w:val="3"/>
-                          <w:numId w:val="18"/>
-                        </w:numPr>
-                        <w:ind w:left="1560"/>
                         <w:jc w:val="left"/>
                         <w:rPr>
                           <w:sz w:val="18"/>
@@ -2261,17 +2380,13 @@
                           <w:sz w:val="18"/>
                           <w:lang w:val="es-ES"/>
                         </w:rPr>
-                        <w:t>Añadir V1[i] a OV</w:t>
+                        <w:tab/>
+                        <w:t>candidatos.sort(key=h)</w:t>
                       </w:r>
                     </w:p>
                     <w:p>
                       <w:pPr>
                         <w:pStyle w:val="Standard"/>
-                        <w:numPr>
-                          <w:ilvl w:val="3"/>
-                          <w:numId w:val="18"/>
-                        </w:numPr>
-                        <w:ind w:left="1560"/>
                         <w:jc w:val="left"/>
                         <w:rPr>
                           <w:sz w:val="18"/>
@@ -2283,17 +2398,27 @@
                           <w:sz w:val="18"/>
                           <w:lang w:val="es-ES"/>
                         </w:rPr>
-                        <w:t>Incrementar i en 1</w:t>
+                        <w:tab/>
+                        <w:t>beam = candidatos[:</w:t>
+                      </w:r>
+                      <w:r>
+                        <w:rPr>
+                          <w:sz w:val="18"/>
+                          <w:lang w:val="es-ES"/>
+                        </w:rPr>
+                        <w:t>β</w:t>
+                      </w:r>
+                      <w:r>
+                        <w:rPr>
+                          <w:sz w:val="18"/>
+                          <w:lang w:val="es-ES"/>
+                        </w:rPr>
+                        <w:t>]</w:t>
                       </w:r>
                     </w:p>
                     <w:p>
                       <w:pPr>
                         <w:pStyle w:val="Standard"/>
-                        <w:numPr>
-                          <w:ilvl w:val="2"/>
-                          <w:numId w:val="18"/>
-                        </w:numPr>
-                        <w:ind w:left="993"/>
                         <w:jc w:val="left"/>
                         <w:rPr>
                           <w:sz w:val="18"/>
@@ -2305,73 +2430,7 @@
                           <w:sz w:val="18"/>
                           <w:lang w:val="es-ES"/>
                         </w:rPr>
-                        <w:t>Sino</w:t>
-                      </w:r>
-                    </w:p>
-                    <w:p>
-                      <w:pPr>
-                        <w:pStyle w:val="Standard"/>
-                        <w:numPr>
-                          <w:ilvl w:val="3"/>
-                          <w:numId w:val="18"/>
-                        </w:numPr>
-                        <w:ind w:left="1560"/>
-                        <w:jc w:val="left"/>
-                        <w:rPr>
-                          <w:sz w:val="18"/>
-                          <w:lang w:val="es-ES"/>
-                        </w:rPr>
-                      </w:pPr>
-                      <w:r>
-                        <w:rPr>
-                          <w:sz w:val="18"/>
-                          <w:lang w:val="es-ES"/>
-                        </w:rPr>
-                        <w:t>Añadir V2(j) a OV</w:t>
-                      </w:r>
-                    </w:p>
-                    <w:p>
-                      <w:pPr>
-                        <w:pStyle w:val="Standard"/>
-                        <w:numPr>
-                          <w:ilvl w:val="3"/>
-                          <w:numId w:val="18"/>
-                        </w:numPr>
-                        <w:ind w:left="1560"/>
-                        <w:jc w:val="left"/>
-                        <w:rPr>
-                          <w:sz w:val="18"/>
-                          <w:lang w:val="es-ES"/>
-                        </w:rPr>
-                      </w:pPr>
-                      <w:r>
-                        <w:rPr>
-                          <w:sz w:val="18"/>
-                          <w:lang w:val="es-ES"/>
-                        </w:rPr>
-                        <w:t>Incrementar j en 1</w:t>
-                      </w:r>
-                    </w:p>
-                    <w:p>
-                      <w:pPr>
-                        <w:pStyle w:val="Standard"/>
-                        <w:numPr>
-                          <w:ilvl w:val="3"/>
-                          <w:numId w:val="18"/>
-                        </w:numPr>
-                        <w:ind w:left="709"/>
-                        <w:jc w:val="left"/>
-                        <w:rPr>
-                          <w:sz w:val="18"/>
-                          <w:lang w:val="es-ES"/>
-                        </w:rPr>
-                      </w:pPr>
-                      <w:r>
-                        <w:rPr>
-                          <w:sz w:val="18"/>
-                          <w:lang w:val="es-ES"/>
-                        </w:rPr>
-                        <w:t>Devolver OV</w:t>
+                        <w:t xml:space="preserve">       return None</w:t>
                       </w:r>
                     </w:p>
                   </w:txbxContent>
@@ -2384,6 +2443,195 @@
       </w:r>
       <w:r>
         <w:rPr>
+          <w:lang w:val="es-ES"/>
+        </w:rPr>
+        <w:t xml:space="preserve">Las figuras se deben mencionar en el texto, como la </w:t>
+      </w:r>
+      <w:r>
+        <w:rPr>
+          <w:lang w:val="es-ES"/>
+        </w:rPr>
+        <w:fldChar w:fldCharType="begin"/>
+      </w:r>
+      <w:r>
+        <w:rPr>
+          <w:lang w:val="es-ES"/>
+        </w:rPr>
+        <w:instrText xml:space="preserve"> PAGEREF _Ref509684450 </w:instrText>
+      </w:r>
+      <w:r>
+        <w:rPr>
+          <w:lang w:val="es-ES"/>
+        </w:rPr>
+        <w:fldChar w:fldCharType="separate"/>
+      </w:r>
+      <w:r>
+        <w:rPr>
+          <w:lang w:val="es-ES"/>
+        </w:rPr>
+        <w:t>Fig. 1.</w:t>
+      </w:r>
+      <w:r>
+        <w:rPr>
+          <w:lang w:val="es-ES"/>
+        </w:rPr>
+        <w:fldChar w:fldCharType="end"/>
+      </w:r>
+      <w:r>
+        <w:rPr>
+          <w:lang w:val="es-ES"/>
+        </w:rPr>
+        <w:t xml:space="preserve">. También se puede añadir ecuaciones, como la ecuación (1).   Un ejemplo de pseudocódigo se puede observar en </w:t>
+      </w:r>
+      <w:r>
+        <w:rPr>
+          <w:lang w:val="es-ES"/>
+        </w:rPr>
+        <w:fldChar w:fldCharType="begin"/>
+      </w:r>
+      <w:r>
+        <w:rPr>
+          <w:lang w:val="es-ES"/>
+        </w:rPr>
+        <w:instrText xml:space="preserve"> REF _Ref509685628 </w:instrText>
+      </w:r>
+      <w:r>
+        <w:rPr>
+          <w:lang w:val="es-ES"/>
+        </w:rPr>
+        <w:fldChar w:fldCharType="separate"/>
+      </w:r>
+      <w:r>
+        <w:rPr>
+          <w:lang w:val="es-ES"/>
+        </w:rPr>
+        <w:t>Error: Reference source not found</w:t>
+      </w:r>
+      <w:r>
+        <w:rPr>
+          <w:lang w:val="es-ES"/>
+        </w:rPr>
+        <w:fldChar w:fldCharType="end"/>
+      </w:r>
+      <w:r>
+        <w:rPr>
+          <w:lang w:val="es-ES"/>
+        </w:rPr>
+        <w:t>.</w:t>
+      </w:r>
+    </w:p>
+    <w:p>
+      <w:pPr>
+        <w:pStyle w:val="equation"/>
+        <w:rPr>
+          <w:lang w:val="es-ES"/>
+        </w:rPr>
+      </w:pPr>
+      <w:r>
+        <w:rPr>
+          <w:lang w:val="es-ES"/>
+        </w:rPr>
+        <w:tab/>
+      </w:r>
+      <w:r>
+        <w:rPr>
+          <w:rFonts w:ascii="Times New Roman" w:hAnsi="Times New Roman" w:cs="Times New Roman"/>
+          <w:i/>
+          <w:lang w:val="es-ES"/>
+        </w:rPr>
+        <w:t>a</w:t>
+      </w:r>
+      <w:r>
+        <w:rPr>
+          <w:lang w:val="es-ES"/>
+        </w:rPr>
+        <w:t></w:t>
+      </w:r>
+      <w:r>
+        <w:rPr>
+          <w:lang w:val="es-ES"/>
+        </w:rPr>
+        <w:t></w:t>
+      </w:r>
+      <w:r>
+        <w:rPr>
+          <w:lang w:val="es-ES"/>
+        </w:rPr>
+        <w:t></w:t>
+      </w:r>
+      <w:r>
+        <w:rPr>
+          <w:rFonts w:ascii="Times New Roman" w:hAnsi="Times New Roman" w:cs="Times New Roman"/>
+          <w:i/>
+          <w:lang w:val="es-ES"/>
+        </w:rPr>
+        <w:t>b</w:t>
+      </w:r>
+      <w:r>
+        <w:rPr>
+          <w:lang w:val="es-ES"/>
+        </w:rPr>
+        <w:t></w:t>
+      </w:r>
+      <w:r>
+        <w:rPr>
+          <w:lang w:val="es-ES"/>
+        </w:rPr>
+        <w:t></w:t>
+      </w:r>
+      <w:r>
+        <w:rPr>
+          <w:lang w:val="es-ES"/>
+        </w:rPr>
+        <w:t></w:t>
+      </w:r>
+      <w:r>
+        <w:rPr>
+          <w:lang w:val="es-ES"/>
+        </w:rPr>
+        <w:t></w:t>
+      </w:r>
+      <w:r>
+        <w:rPr>
+          <w:lang w:val="es-ES"/>
+        </w:rPr>
+        <w:t></w:t>
+      </w:r>
+      <w:r>
+        <w:rPr>
+          <w:lang w:val="es-ES"/>
+        </w:rPr>
+        <w:tab/>
+      </w:r>
+      <w:r>
+        <w:rPr>
+          <w:lang w:val="es-ES"/>
+        </w:rPr>
+        <w:t></w:t>
+      </w:r>
+      <w:r>
+        <w:rPr>
+          <w:lang w:val="es-ES"/>
+        </w:rPr>
+        <w:t></w:t>
+      </w:r>
+      <w:r>
+        <w:rPr>
+          <w:lang w:val="es-ES"/>
+        </w:rPr>
+        <w:t></w:t>
+      </w:r>
+    </w:p>
+    <w:p>
+      <w:pPr>
+        <w:pStyle w:val="equation"/>
+        <w:rPr>
+          <w:lang w:val="es-ES"/>
+        </w:rPr>
+      </w:pPr>
+      <w:r>
+        <w:rPr>
+          <w:noProof/>
           <w:lang w:val="es-ES"/>
         </w:rPr>
         <mc:AlternateContent>
@@ -2423,7 +2671,7 @@
                         <w:txbxContent>
                           <w:p>
                             <w:pPr>
-                              <w:pStyle w:val="Descripcin"/>
+                              <w:pStyle w:val="Caption"/>
                               <w:jc w:val="left"/>
                               <w:rPr>
                                 <w:lang w:val="es-ES"/>
@@ -2468,7 +2716,7 @@
                   <w:txbxContent>
                     <w:p>
                       <w:pPr>
-                        <w:pStyle w:val="Descripcin"/>
+                        <w:pStyle w:val="Caption"/>
                         <w:jc w:val="left"/>
                         <w:rPr>
                           <w:lang w:val="es-ES"/>
@@ -2506,7 +2754,7 @@
     </w:p>
     <w:p>
       <w:pPr>
-        <w:pStyle w:val="Ttulo1"/>
+        <w:pStyle w:val="Heading1"/>
         <w:rPr>
           <w:lang w:val="es-ES"/>
         </w:rPr>
@@ -2516,6 +2764,48 @@
           <w:lang w:val="es-ES"/>
         </w:rPr>
         <w:t>Resultados</w:t>
+      </w:r>
+    </w:p>
+    <w:p>
+      <w:pPr>
+        <w:pStyle w:val="Standard"/>
+        <w:rPr>
+          <w:lang w:val="es-ES" w:eastAsia="en-US"/>
+        </w:rPr>
+      </w:pPr>
+      <w:r>
+        <w:rPr>
+          <w:lang w:val="es-ES" w:eastAsia="en-US"/>
+        </w:rPr>
+        <w:t>### Hemos experimentado con las heurísticas del enunciado, con función pagoda distancia, con heurísticas manuales.</w:t>
+      </w:r>
+    </w:p>
+    <w:p>
+      <w:pPr>
+        <w:pStyle w:val="Standard"/>
+        <w:rPr>
+          <w:lang w:val="es-ES" w:eastAsia="en-US"/>
+        </w:rPr>
+      </w:pPr>
+      <w:r>
+        <w:rPr>
+          <w:lang w:val="es-ES" w:eastAsia="en-US"/>
+        </w:rPr>
+        <w:t xml:space="preserve">### También hemos filtrado los estados que son simétricos o rotaciones de otros ya estudiados, que no se puede aplicar a todos los tableros. En los que se puede aplicar hace que la búsqueda sea más lenta pero permite bajar mucho la </w:t>
+      </w:r>
+      <w:r>
+        <w:rPr>
+          <w:sz w:val="18"/>
+          <w:lang w:val="es-ES"/>
+        </w:rPr>
+        <w:t>β</w:t>
+      </w:r>
+      <w:r>
+        <w:rPr>
+          <w:sz w:val="18"/>
+          <w:lang w:val="es-ES"/>
+        </w:rPr>
+        <w:t>.</w:t>
       </w:r>
     </w:p>
     <w:p>
@@ -2638,7 +2928,7 @@
     </w:p>
     <w:p>
       <w:pPr>
-        <w:pStyle w:val="Descripcin"/>
+        <w:pStyle w:val="Caption"/>
         <w:rPr>
           <w:b w:val="0"/>
           <w:sz w:val="16"/>
@@ -2687,12 +2977,6 @@
         <w:gridCol w:w="905"/>
       </w:tblGrid>
       <w:tr>
-        <w:tblPrEx>
-          <w:tblCellMar>
-            <w:top w:w="0" w:type="dxa"/>
-            <w:bottom w:w="0" w:type="dxa"/>
-          </w:tblCellMar>
-        </w:tblPrEx>
         <w:trPr>
           <w:cantSplit/>
           <w:trHeight w:val="240"/>
@@ -2766,12 +3050,6 @@
         </w:tc>
       </w:tr>
       <w:tr>
-        <w:tblPrEx>
-          <w:tblCellMar>
-            <w:top w:w="0" w:type="dxa"/>
-            <w:bottom w:w="0" w:type="dxa"/>
-          </w:tblCellMar>
-        </w:tblPrEx>
         <w:trPr>
           <w:cantSplit/>
           <w:trHeight w:val="240"/>
@@ -2893,12 +3171,6 @@
         </w:tc>
       </w:tr>
       <w:tr>
-        <w:tblPrEx>
-          <w:tblCellMar>
-            <w:top w:w="0" w:type="dxa"/>
-            <w:bottom w:w="0" w:type="dxa"/>
-          </w:tblCellMar>
-        </w:tblPrEx>
         <w:trPr>
           <w:trHeight w:val="320"/>
           <w:jc w:val="center"/>
@@ -3041,7 +3313,7 @@
     </w:p>
     <w:p>
       <w:pPr>
-        <w:pStyle w:val="Ttulo1"/>
+        <w:pStyle w:val="Heading1"/>
         <w:rPr>
           <w:lang w:val="es-ES"/>
         </w:rPr>
@@ -3069,7 +3341,7 @@
     </w:p>
     <w:p>
       <w:pPr>
-        <w:pStyle w:val="Ttulo5"/>
+        <w:pStyle w:val="Heading5"/>
         <w:rPr>
           <w:lang w:val="es-ES"/>
         </w:rPr>
@@ -3092,72 +3364,88 @@
     <w:p>
       <w:pPr>
         <w:pStyle w:val="references"/>
-        <w:numPr>
-          <w:ilvl w:val="0"/>
-          <w:numId w:val="34"/>
-        </w:numPr>
-        <w:rPr>
-          <w:lang w:val="es-ES"/>
-        </w:rPr>
-      </w:pPr>
-      <w:bookmarkStart w:id="5" w:name="_Ref509593486"/>
-      <w:r>
-        <w:rPr>
-          <w:lang w:val="es-ES"/>
-        </w:rPr>
-        <w:t>S. Russell, P. Norvig, Artificial Intelligence: A Modern Approach, 3rd ed, Pearson, 2010.</w:t>
-      </w:r>
-      <w:bookmarkEnd w:id="5"/>
-    </w:p>
-    <w:p>
-      <w:pPr>
-        <w:pStyle w:val="references"/>
-        <w:ind w:left="354" w:hanging="354"/>
-        <w:rPr>
-          <w:lang w:val="es-ES"/>
-        </w:rPr>
-      </w:pPr>
-      <w:r>
-        <w:rPr>
-          <w:lang w:val="es-ES"/>
-        </w:rPr>
-        <w:t>Y. LeCun, Y. Bengio, G. Hinton. “Deep Learning”, Nature, vol. 521, 2015, pp. 436-444.</w:t>
-      </w:r>
-    </w:p>
-    <w:p>
-      <w:pPr>
-        <w:pStyle w:val="references"/>
-        <w:rPr>
-          <w:lang w:val="es-ES"/>
-        </w:rPr>
-      </w:pPr>
-      <w:r>
-        <w:rPr>
-          <w:lang w:val="es-ES"/>
-        </w:rPr>
-        <w:t xml:space="preserve">Página web del curso IA de Ingeniería del Software. </w:t>
+        <w:rPr>
+          <w:lang w:val="es-ES"/>
+        </w:rPr>
+      </w:pPr>
+      <w:r>
+        <w:rPr>
+          <w:lang w:val="es-ES"/>
+        </w:rPr>
+        <w:t xml:space="preserve">Página de Wikipedia sobre el </w:t>
       </w:r>
       <w:hyperlink r:id="rId12" w:history="1">
         <w:r>
           <w:rPr>
-            <w:rStyle w:val="Internetlink"/>
+            <w:rStyle w:val="Hyperlink"/>
             <w:lang w:val="es-ES"/>
           </w:rPr>
-          <w:t>https://www.cs.us.es/cursos/iais</w:t>
+          <w:t>Senku</w:t>
         </w:r>
       </w:hyperlink>
       <w:r>
         <w:rPr>
           <w:lang w:val="es-ES"/>
         </w:rPr>
-        <w:t>. Consultada el 24/03/2018.</w:t>
+        <w:t>, consultada el 28/05/2026</w:t>
       </w:r>
     </w:p>
     <w:p>
       <w:pPr>
+        <w:pStyle w:val="references"/>
+        <w:rPr>
+          <w:lang w:val="es-ES"/>
+        </w:rPr>
+      </w:pPr>
+      <w:hyperlink r:id="rId13" w:history="1">
+        <w:r>
+          <w:rPr>
+            <w:rStyle w:val="Hyperlink"/>
+            <w:lang w:val="es-ES"/>
+          </w:rPr>
+          <w:t>Gibell.net</w:t>
+        </w:r>
+      </w:hyperlink>
+      <w:r>
+        <w:rPr>
+          <w:lang w:val="es-ES"/>
+        </w:rPr>
+        <w:t>, con todo tipo de información sobre Senku y variaciones, consultada el 28/05/2026</w:t>
+      </w:r>
+    </w:p>
+    <w:p>
+      <w:pPr>
+        <w:pStyle w:val="references"/>
+      </w:pPr>
+      <w:hyperlink r:id="rId14" w:history="1">
+        <w:r>
+          <w:rPr>
+            <w:rStyle w:val="Hyperlink"/>
+          </w:rPr>
+          <w:t>Peg Solitaire and its unbeatable games</w:t>
+        </w:r>
+      </w:hyperlink>
+      <w:r>
+        <w:t xml:space="preserve">, y </w:t>
+      </w:r>
+      <w:hyperlink r:id="rId15" w:history="1">
+        <w:r>
+          <w:rPr>
+            <w:rStyle w:val="Hyperlink"/>
+          </w:rPr>
+          <w:t>Analysis of Peg Solitaire</w:t>
+        </w:r>
+      </w:hyperlink>
+      <w:r>
+        <w:t>, consultadas el 28/05/2026</w:t>
+      </w:r>
+    </w:p>
+    <w:p>
+      <w:pPr>
         <w:rPr>
           <w:rFonts w:cs="Mangal"/>
           <w:szCs w:val="21"/>
+          <w:lang w:val="en-US"/>
         </w:rPr>
         <w:sectPr>
           <w:type w:val="continuous"/>
@@ -3174,7 +3462,16 @@
     <w:p>
       <w:pPr>
         <w:pStyle w:val="Standard"/>
-      </w:pPr>
+        <w:ind w:left="2160" w:firstLine="720"/>
+        <w:rPr>
+          <w:sz w:val="16"/>
+          <w:szCs w:val="16"/>
+          <w:lang w:val="es-ES"/>
+        </w:rPr>
+      </w:pPr>
+      <w:r>
+        <w:t xml:space="preserve">                     </w:t>
+      </w:r>
     </w:p>
     <w:sectPr>
       <w:type w:val="continuous"/>
@@ -3210,7 +3507,7 @@
 <w:ftr xmlns:wpc="http://schemas.microsoft.com/office/word/2010/wordprocessingCanvas" xmlns:cx="http://schemas.microsoft.com/office/drawing/2014/chartex" xmlns:cx1="http://schemas.microsoft.com/office/drawing/2015/9/8/chartex" xmlns:cx2="http://schemas.microsoft.com/office/drawing/2015/10/21/chartex" xmlns:cx3="http://schemas.microsoft.com/office/drawing/2016/5/9/chartex" xmlns:cx4="http://schemas.microsoft.com/office/drawing/2016/5/10/chartex" xmlns:cx5="http://schemas.microsoft.com/office/drawing/2016/5/11/chartex" xmlns:cx6="http://schemas.microsoft.com/office/drawing/2016/5/12/chartex" xmlns:cx7="http://schemas.microsoft.com/office/drawing/2016/5/13/chartex" xmlns:cx8="http://schemas.microsoft.com/office/drawing/2016/5/14/chartex" xmlns:mc="http://schemas.openxmlformats.org/markup-compatibility/2006" xmlns:aink="http://schemas.microsoft.com/office/drawing/2016/ink" xmlns:am3d="http://schemas.microsoft.com/office/drawing/2017/model3d" xmlns:o="urn:schemas-microsoft-com:office:office" xmlns:oel="http://schemas.microsoft.com/office/2019/extlst" xmlns:r="http://schemas.openxmlformats.org/officeDocument/2006/relationships" xmlns:m="http://schemas.openxmlformats.org/officeDocument/2006/math" xmlns:v="urn:schemas-microsoft-com:vml" xmlns:wp14="http://schemas.microsoft.com/office/word/2010/wordprocessingDrawing" xmlns:wp="http://schemas.openxmlformats.org/drawingml/2006/wordprocessingDrawing" xmlns:w10="urn:schemas-microsoft-com:office:word" xmlns:w="http://schemas.openxmlformats.org/wordprocessingml/2006/main" xmlns:w14="http://schemas.microsoft.com/office/word/2010/wordml" xmlns:w15="http://schemas.microsoft.com/office/word/2012/wordml" xmlns:w16cex="http://schemas.microsoft.com/office/word/2018/wordml/cex" xmlns:w16cid="http://schemas.microsoft.com/office/word/2016/wordml/cid" xmlns:w16="http://schemas.microsoft.com/office/word/2018/wordml" xmlns:w16du="http://schemas.microsoft.com/office/word/2023/wordml/word16du" xmlns:w16sdtdh="http://schemas.microsoft.com/office/word/2020/wordml/sdtdatahash" xmlns:w16sdtfl="http://schemas.microsoft.com/office/word/2024/wordml/sdtformatlock" xmlns:w16se="http://schemas.microsoft.com/office/word/2015/wordml/symex" xmlns:wpg="http://schemas.microsoft.com/office/word/2010/wordprocessingGroup" xmlns:wpi="http://schemas.microsoft.com/office/word/2010/wordprocessingInk" xmlns:wne="http://schemas.microsoft.com/office/word/2006/wordml" xmlns:wps="http://schemas.microsoft.com/office/word/2010/wordprocessingShape" mc:Ignorable="w14 w15 w16se w16cid w16 w16cex w16sdtdh w16sdtfl w16du wp14">
   <w:p>
     <w:pPr>
-      <w:pStyle w:val="Piedepgina"/>
+      <w:pStyle w:val="Footer"/>
       <w:rPr>
         <w:lang w:val="es-ES"/>
       </w:rPr>
@@ -3223,7 +3520,7 @@
 <w:ftr xmlns:wpc="http://schemas.microsoft.com/office/word/2010/wordprocessingCanvas" xmlns:cx="http://schemas.microsoft.com/office/drawing/2014/chartex" xmlns:cx1="http://schemas.microsoft.com/office/drawing/2015/9/8/chartex" xmlns:cx2="http://schemas.microsoft.com/office/drawing/2015/10/21/chartex" xmlns:cx3="http://schemas.microsoft.com/office/drawing/2016/5/9/chartex" xmlns:cx4="http://schemas.microsoft.com/office/drawing/2016/5/10/chartex" xmlns:cx5="http://schemas.microsoft.com/office/drawing/2016/5/11/chartex" xmlns:cx6="http://schemas.microsoft.com/office/drawing/2016/5/12/chartex" xmlns:cx7="http://schemas.microsoft.com/office/drawing/2016/5/13/chartex" xmlns:cx8="http://schemas.microsoft.com/office/drawing/2016/5/14/chartex" xmlns:mc="http://schemas.openxmlformats.org/markup-compatibility/2006" xmlns:aink="http://schemas.microsoft.com/office/drawing/2016/ink" xmlns:am3d="http://schemas.microsoft.com/office/drawing/2017/model3d" xmlns:o="urn:schemas-microsoft-com:office:office" xmlns:oel="http://schemas.microsoft.com/office/2019/extlst" xmlns:r="http://schemas.openxmlformats.org/officeDocument/2006/relationships" xmlns:m="http://schemas.openxmlformats.org/officeDocument/2006/math" xmlns:v="urn:schemas-microsoft-com:vml" xmlns:wp14="http://schemas.microsoft.com/office/word/2010/wordprocessingDrawing" xmlns:wp="http://schemas.openxmlformats.org/drawingml/2006/wordprocessingDrawing" xmlns:w10="urn:schemas-microsoft-com:office:word" xmlns:w="http://schemas.openxmlformats.org/wordprocessingml/2006/main" xmlns:w14="http://schemas.microsoft.com/office/word/2010/wordml" xmlns:w15="http://schemas.microsoft.com/office/word/2012/wordml" xmlns:w16cex="http://schemas.microsoft.com/office/word/2018/wordml/cex" xmlns:w16cid="http://schemas.microsoft.com/office/word/2016/wordml/cid" xmlns:w16="http://schemas.microsoft.com/office/word/2018/wordml" xmlns:w16du="http://schemas.microsoft.com/office/word/2023/wordml/word16du" xmlns:w16sdtdh="http://schemas.microsoft.com/office/word/2020/wordml/sdtdatahash" xmlns:w16sdtfl="http://schemas.microsoft.com/office/word/2024/wordml/sdtformatlock" xmlns:w16se="http://schemas.microsoft.com/office/word/2015/wordml/symex" xmlns:wpg="http://schemas.microsoft.com/office/word/2010/wordprocessingGroup" xmlns:wpi="http://schemas.microsoft.com/office/word/2010/wordprocessingInk" xmlns:wne="http://schemas.microsoft.com/office/word/2006/wordml" xmlns:wps="http://schemas.microsoft.com/office/word/2010/wordprocessingShape" mc:Ignorable="w14 w15 w16se w16cid w16 w16cex w16sdtdh w16sdtfl w16du wp14">
   <w:p>
     <w:pPr>
-      <w:pStyle w:val="Piedepgina"/>
+      <w:pStyle w:val="Footer"/>
       <w:jc w:val="both"/>
       <w:rPr>
         <w:lang w:val="es-ES"/>
@@ -3814,7 +4111,7 @@
     <w:lvl w:ilvl="0">
       <w:start w:val="1"/>
       <w:numFmt w:val="upperRoman"/>
-      <w:pStyle w:val="Ttulo1"/>
+      <w:pStyle w:val="Heading1"/>
       <w:lvlText w:val="%1."/>
       <w:lvlJc w:val="center"/>
       <w:pPr>
@@ -3841,7 +4138,7 @@
     <w:lvl w:ilvl="1">
       <w:start w:val="1"/>
       <w:numFmt w:val="upperLetter"/>
-      <w:pStyle w:val="Ttulo2"/>
+      <w:pStyle w:val="Heading2"/>
       <w:lvlText w:val="%2."/>
       <w:lvlJc w:val="left"/>
       <w:pPr>
@@ -3872,7 +4169,7 @@
     <w:lvl w:ilvl="2">
       <w:start w:val="1"/>
       <w:numFmt w:val="decimal"/>
-      <w:pStyle w:val="Ttulo3"/>
+      <w:pStyle w:val="Heading3"/>
       <w:lvlText w:val="%3)"/>
       <w:lvlJc w:val="left"/>
       <w:pPr>
@@ -3903,7 +4200,7 @@
     <w:lvl w:ilvl="3">
       <w:start w:val="1"/>
       <w:numFmt w:val="lowerLetter"/>
-      <w:pStyle w:val="Ttulo4"/>
+      <w:pStyle w:val="Heading4"/>
       <w:lvlText w:val="%4)"/>
       <w:lvlJc w:val="left"/>
       <w:pPr>
@@ -4400,7 +4697,7 @@
       <w:lvlText w:val="%1."/>
       <w:lvlJc w:val="left"/>
       <w:pPr>
-        <w:ind w:left="360" w:hanging="360"/>
+        <w:ind w:left="709" w:hanging="360"/>
       </w:pPr>
     </w:lvl>
     <w:lvl w:ilvl="1">
@@ -4409,7 +4706,7 @@
       <w:lvlText w:val="%2."/>
       <w:lvlJc w:val="left"/>
       <w:pPr>
-        <w:ind w:left="1080" w:hanging="360"/>
+        <w:ind w:left="1429" w:hanging="360"/>
       </w:pPr>
       <w:rPr>
         <w:sz w:val="18"/>
@@ -4421,7 +4718,7 @@
       <w:lvlText w:val="%3."/>
       <w:lvlJc w:val="right"/>
       <w:pPr>
-        <w:ind w:left="1800" w:hanging="180"/>
+        <w:ind w:left="2149" w:hanging="180"/>
       </w:pPr>
     </w:lvl>
     <w:lvl w:ilvl="3">
@@ -4430,7 +4727,7 @@
       <w:lvlText w:val="%4."/>
       <w:lvlJc w:val="left"/>
       <w:pPr>
-        <w:ind w:left="2520" w:hanging="360"/>
+        <w:ind w:left="2869" w:hanging="360"/>
       </w:pPr>
     </w:lvl>
     <w:lvl w:ilvl="4">
@@ -4439,7 +4736,7 @@
       <w:lvlText w:val="%5."/>
       <w:lvlJc w:val="left"/>
       <w:pPr>
-        <w:ind w:left="3240" w:hanging="360"/>
+        <w:ind w:left="3589" w:hanging="360"/>
       </w:pPr>
     </w:lvl>
     <w:lvl w:ilvl="5">
@@ -4448,7 +4745,7 @@
       <w:lvlText w:val="%6."/>
       <w:lvlJc w:val="right"/>
       <w:pPr>
-        <w:ind w:left="3960" w:hanging="180"/>
+        <w:ind w:left="4309" w:hanging="180"/>
       </w:pPr>
     </w:lvl>
     <w:lvl w:ilvl="6">
@@ -4457,7 +4754,7 @@
       <w:lvlText w:val="%7."/>
       <w:lvlJc w:val="left"/>
       <w:pPr>
-        <w:ind w:left="4680" w:hanging="360"/>
+        <w:ind w:left="5029" w:hanging="360"/>
       </w:pPr>
     </w:lvl>
     <w:lvl w:ilvl="7">
@@ -4466,7 +4763,7 @@
       <w:lvlText w:val="%8."/>
       <w:lvlJc w:val="left"/>
       <w:pPr>
-        <w:ind w:left="5400" w:hanging="360"/>
+        <w:ind w:left="5749" w:hanging="360"/>
       </w:pPr>
     </w:lvl>
     <w:lvl w:ilvl="8">
@@ -4475,7 +4772,7 @@
       <w:lvlText w:val="%9."/>
       <w:lvlJc w:val="right"/>
       <w:pPr>
-        <w:ind w:left="6120" w:hanging="180"/>
+        <w:ind w:left="6469" w:hanging="180"/>
       </w:pPr>
     </w:lvl>
   </w:abstractNum>
@@ -6099,7 +6396,6 @@
   </w:num>
   <w:num w:numId="28" w16cid:durableId="668867472">
     <w:abstractNumId w:val="17"/>
-    <w:lvlOverride w:ilvl="0"/>
   </w:num>
   <w:num w:numId="29" w16cid:durableId="2075733228">
     <w:abstractNumId w:val="8"/>
@@ -6109,11 +6405,9 @@
   </w:num>
   <w:num w:numId="30" w16cid:durableId="2012443921">
     <w:abstractNumId w:val="11"/>
-    <w:lvlOverride w:ilvl="0"/>
   </w:num>
   <w:num w:numId="31" w16cid:durableId="1550335370">
     <w:abstractNumId w:val="22"/>
-    <w:lvlOverride w:ilvl="0"/>
   </w:num>
   <w:num w:numId="32" w16cid:durableId="441456017">
     <w:abstractNumId w:val="10"/>
@@ -6123,7 +6417,6 @@
   </w:num>
   <w:num w:numId="33" w16cid:durableId="1606961422">
     <w:abstractNumId w:val="2"/>
-    <w:lvlOverride w:ilvl="0"/>
   </w:num>
   <w:num w:numId="34" w16cid:durableId="173500285">
     <w:abstractNumId w:val="23"/>
@@ -6540,7 +6833,7 @@
       <w:lang w:val="es-ES"/>
     </w:rPr>
   </w:style>
-  <w:style w:type="paragraph" w:styleId="Ttulo1">
+  <w:style w:type="paragraph" w:styleId="Heading1">
     <w:name w:val="heading 1"/>
     <w:basedOn w:val="Standard"/>
     <w:next w:val="Standard"/>
@@ -6563,7 +6856,7 @@
       <w:lang w:eastAsia="en-US"/>
     </w:rPr>
   </w:style>
-  <w:style w:type="paragraph" w:styleId="Ttulo2">
+  <w:style w:type="paragraph" w:styleId="Heading2">
     <w:name w:val="heading 2"/>
     <w:basedOn w:val="Standard"/>
     <w:next w:val="Standard"/>
@@ -6590,7 +6883,7 @@
       <w:lang w:eastAsia="en-US"/>
     </w:rPr>
   </w:style>
-  <w:style w:type="paragraph" w:styleId="Ttulo3">
+  <w:style w:type="paragraph" w:styleId="Heading3">
     <w:name w:val="heading 3"/>
     <w:basedOn w:val="Standard"/>
     <w:next w:val="Standard"/>
@@ -6612,7 +6905,7 @@
       <w:lang w:eastAsia="en-US"/>
     </w:rPr>
   </w:style>
-  <w:style w:type="paragraph" w:styleId="Ttulo4">
+  <w:style w:type="paragraph" w:styleId="Heading4">
     <w:name w:val="heading 4"/>
     <w:basedOn w:val="Standard"/>
     <w:next w:val="Standard"/>
@@ -6637,7 +6930,7 @@
       <w:lang w:eastAsia="en-US"/>
     </w:rPr>
   </w:style>
-  <w:style w:type="paragraph" w:styleId="Ttulo5">
+  <w:style w:type="paragraph" w:styleId="Heading5">
     <w:name w:val="heading 5"/>
     <w:basedOn w:val="Standard"/>
     <w:next w:val="Standard"/>
@@ -6656,12 +6949,13 @@
       <w:lang w:eastAsia="en-US"/>
     </w:rPr>
   </w:style>
-  <w:style w:type="character" w:default="1" w:styleId="Fuentedeprrafopredeter">
+  <w:style w:type="character" w:default="1" w:styleId="DefaultParagraphFont">
     <w:name w:val="Default Paragraph Font"/>
     <w:uiPriority w:val="1"/>
+    <w:semiHidden/>
     <w:unhideWhenUsed/>
   </w:style>
-  <w:style w:type="table" w:default="1" w:styleId="Tablanormal">
+  <w:style w:type="table" w:default="1" w:styleId="TableNormal">
     <w:name w:val="Normal Table"/>
     <w:uiPriority w:val="99"/>
     <w:semiHidden/>
@@ -6676,7 +6970,7 @@
       </w:tblCellMar>
     </w:tblPr>
   </w:style>
-  <w:style w:type="numbering" w:default="1" w:styleId="Sinlista">
+  <w:style w:type="numbering" w:default="1" w:styleId="NoList">
     <w:name w:val="No List"/>
     <w:uiPriority w:val="99"/>
     <w:semiHidden/>
@@ -6684,7 +6978,7 @@
   </w:style>
   <w:style w:type="numbering" w:customStyle="1" w:styleId="Outline">
     <w:name w:val="Outline"/>
-    <w:basedOn w:val="Sinlista"/>
+    <w:basedOn w:val="NoList"/>
     <w:pPr>
       <w:numPr>
         <w:numId w:val="1"/>
@@ -6733,7 +7027,7 @@
       <w:spacing w:val="-1"/>
     </w:rPr>
   </w:style>
-  <w:style w:type="paragraph" w:styleId="Lista">
+  <w:style w:type="paragraph" w:styleId="List">
     <w:name w:val="List"/>
     <w:basedOn w:val="Textbody"/>
     <w:rPr>
@@ -6741,7 +7035,7 @@
       <w:sz w:val="24"/>
     </w:rPr>
   </w:style>
-  <w:style w:type="paragraph" w:styleId="Descripcin">
+  <w:style w:type="paragraph" w:styleId="Caption">
     <w:name w:val="caption"/>
     <w:basedOn w:val="Standard"/>
     <w:next w:val="Standard"/>
@@ -7008,7 +7302,7 @@
       <w:i/>
     </w:rPr>
   </w:style>
-  <w:style w:type="paragraph" w:styleId="Encabezado">
+  <w:style w:type="paragraph" w:styleId="Header">
     <w:name w:val="header"/>
     <w:basedOn w:val="Standard"/>
     <w:pPr>
@@ -7018,7 +7312,7 @@
       </w:tabs>
     </w:pPr>
   </w:style>
-  <w:style w:type="paragraph" w:styleId="Piedepgina">
+  <w:style w:type="paragraph" w:styleId="Footer">
     <w:name w:val="footer"/>
     <w:basedOn w:val="Standard"/>
     <w:pPr>
@@ -7477,11 +7771,11 @@
   </w:style>
   <w:style w:type="character" w:customStyle="1" w:styleId="EncabezadoCar">
     <w:name w:val="Encabezado Car"/>
-    <w:basedOn w:val="Fuentedeprrafopredeter"/>
+    <w:basedOn w:val="DefaultParagraphFont"/>
   </w:style>
   <w:style w:type="character" w:customStyle="1" w:styleId="PiedepginaCar">
     <w:name w:val="Pie de página Car"/>
-    <w:basedOn w:val="Fuentedeprrafopredeter"/>
+    <w:basedOn w:val="DefaultParagraphFont"/>
   </w:style>
   <w:style w:type="character" w:customStyle="1" w:styleId="Internetlink">
     <w:name w:val="Internet link"/>
@@ -7492,7 +7786,7 @@
   </w:style>
   <w:style w:type="numbering" w:customStyle="1" w:styleId="WW8Num1">
     <w:name w:val="WW8Num1"/>
-    <w:basedOn w:val="Sinlista"/>
+    <w:basedOn w:val="NoList"/>
     <w:pPr>
       <w:numPr>
         <w:numId w:val="2"/>
@@ -7501,7 +7795,7 @@
   </w:style>
   <w:style w:type="numbering" w:customStyle="1" w:styleId="WW8Num2">
     <w:name w:val="WW8Num2"/>
-    <w:basedOn w:val="Sinlista"/>
+    <w:basedOn w:val="NoList"/>
     <w:pPr>
       <w:numPr>
         <w:numId w:val="3"/>
@@ -7510,7 +7804,7 @@
   </w:style>
   <w:style w:type="numbering" w:customStyle="1" w:styleId="WW8Num3">
     <w:name w:val="WW8Num3"/>
-    <w:basedOn w:val="Sinlista"/>
+    <w:basedOn w:val="NoList"/>
     <w:pPr>
       <w:numPr>
         <w:numId w:val="4"/>
@@ -7519,7 +7813,7 @@
   </w:style>
   <w:style w:type="numbering" w:customStyle="1" w:styleId="WW8Num4">
     <w:name w:val="WW8Num4"/>
-    <w:basedOn w:val="Sinlista"/>
+    <w:basedOn w:val="NoList"/>
     <w:pPr>
       <w:numPr>
         <w:numId w:val="5"/>
@@ -7528,7 +7822,7 @@
   </w:style>
   <w:style w:type="numbering" w:customStyle="1" w:styleId="WW8Num5">
     <w:name w:val="WW8Num5"/>
-    <w:basedOn w:val="Sinlista"/>
+    <w:basedOn w:val="NoList"/>
     <w:pPr>
       <w:numPr>
         <w:numId w:val="6"/>
@@ -7537,7 +7831,7 @@
   </w:style>
   <w:style w:type="numbering" w:customStyle="1" w:styleId="WW8Num6">
     <w:name w:val="WW8Num6"/>
-    <w:basedOn w:val="Sinlista"/>
+    <w:basedOn w:val="NoList"/>
     <w:pPr>
       <w:numPr>
         <w:numId w:val="7"/>
@@ -7546,7 +7840,7 @@
   </w:style>
   <w:style w:type="numbering" w:customStyle="1" w:styleId="WW8Num7">
     <w:name w:val="WW8Num7"/>
-    <w:basedOn w:val="Sinlista"/>
+    <w:basedOn w:val="NoList"/>
     <w:pPr>
       <w:numPr>
         <w:numId w:val="8"/>
@@ -7555,7 +7849,7 @@
   </w:style>
   <w:style w:type="numbering" w:customStyle="1" w:styleId="WW8Num8">
     <w:name w:val="WW8Num8"/>
-    <w:basedOn w:val="Sinlista"/>
+    <w:basedOn w:val="NoList"/>
     <w:pPr>
       <w:numPr>
         <w:numId w:val="9"/>
@@ -7564,7 +7858,7 @@
   </w:style>
   <w:style w:type="numbering" w:customStyle="1" w:styleId="WW8Num9">
     <w:name w:val="WW8Num9"/>
-    <w:basedOn w:val="Sinlista"/>
+    <w:basedOn w:val="NoList"/>
     <w:pPr>
       <w:numPr>
         <w:numId w:val="10"/>
@@ -7573,7 +7867,7 @@
   </w:style>
   <w:style w:type="numbering" w:customStyle="1" w:styleId="WW8Num10">
     <w:name w:val="WW8Num10"/>
-    <w:basedOn w:val="Sinlista"/>
+    <w:basedOn w:val="NoList"/>
     <w:pPr>
       <w:numPr>
         <w:numId w:val="11"/>
@@ -7582,7 +7876,7 @@
   </w:style>
   <w:style w:type="numbering" w:customStyle="1" w:styleId="WW8Num11">
     <w:name w:val="WW8Num11"/>
-    <w:basedOn w:val="Sinlista"/>
+    <w:basedOn w:val="NoList"/>
     <w:pPr>
       <w:numPr>
         <w:numId w:val="12"/>
@@ -7591,7 +7885,7 @@
   </w:style>
   <w:style w:type="numbering" w:customStyle="1" w:styleId="WW8Num12">
     <w:name w:val="WW8Num12"/>
-    <w:basedOn w:val="Sinlista"/>
+    <w:basedOn w:val="NoList"/>
     <w:pPr>
       <w:numPr>
         <w:numId w:val="13"/>
@@ -7600,7 +7894,7 @@
   </w:style>
   <w:style w:type="numbering" w:customStyle="1" w:styleId="WW8Num13">
     <w:name w:val="WW8Num13"/>
-    <w:basedOn w:val="Sinlista"/>
+    <w:basedOn w:val="NoList"/>
     <w:pPr>
       <w:numPr>
         <w:numId w:val="14"/>
@@ -7609,7 +7903,7 @@
   </w:style>
   <w:style w:type="numbering" w:customStyle="1" w:styleId="WW8Num14">
     <w:name w:val="WW8Num14"/>
-    <w:basedOn w:val="Sinlista"/>
+    <w:basedOn w:val="NoList"/>
     <w:pPr>
       <w:numPr>
         <w:numId w:val="15"/>
@@ -7618,7 +7912,7 @@
   </w:style>
   <w:style w:type="numbering" w:customStyle="1" w:styleId="WW8Num15">
     <w:name w:val="WW8Num15"/>
-    <w:basedOn w:val="Sinlista"/>
+    <w:basedOn w:val="NoList"/>
     <w:pPr>
       <w:numPr>
         <w:numId w:val="16"/>
@@ -7627,7 +7921,7 @@
   </w:style>
   <w:style w:type="numbering" w:customStyle="1" w:styleId="WW8Num16">
     <w:name w:val="WW8Num16"/>
-    <w:basedOn w:val="Sinlista"/>
+    <w:basedOn w:val="NoList"/>
     <w:pPr>
       <w:numPr>
         <w:numId w:val="17"/>
@@ -7636,7 +7930,7 @@
   </w:style>
   <w:style w:type="numbering" w:customStyle="1" w:styleId="WW8Num17">
     <w:name w:val="WW8Num17"/>
-    <w:basedOn w:val="Sinlista"/>
+    <w:basedOn w:val="NoList"/>
     <w:pPr>
       <w:numPr>
         <w:numId w:val="18"/>
@@ -7645,7 +7939,7 @@
   </w:style>
   <w:style w:type="numbering" w:customStyle="1" w:styleId="WW8Num18">
     <w:name w:val="WW8Num18"/>
-    <w:basedOn w:val="Sinlista"/>
+    <w:basedOn w:val="NoList"/>
     <w:pPr>
       <w:numPr>
         <w:numId w:val="19"/>
@@ -7654,7 +7948,7 @@
   </w:style>
   <w:style w:type="numbering" w:customStyle="1" w:styleId="WW8Num19">
     <w:name w:val="WW8Num19"/>
-    <w:basedOn w:val="Sinlista"/>
+    <w:basedOn w:val="NoList"/>
     <w:pPr>
       <w:numPr>
         <w:numId w:val="20"/>
@@ -7663,7 +7957,7 @@
   </w:style>
   <w:style w:type="numbering" w:customStyle="1" w:styleId="WW8Num20">
     <w:name w:val="WW8Num20"/>
-    <w:basedOn w:val="Sinlista"/>
+    <w:basedOn w:val="NoList"/>
     <w:pPr>
       <w:numPr>
         <w:numId w:val="21"/>
@@ -7672,7 +7966,7 @@
   </w:style>
   <w:style w:type="numbering" w:customStyle="1" w:styleId="WW8Num21">
     <w:name w:val="WW8Num21"/>
-    <w:basedOn w:val="Sinlista"/>
+    <w:basedOn w:val="NoList"/>
     <w:pPr>
       <w:numPr>
         <w:numId w:val="22"/>
@@ -7681,7 +7975,7 @@
   </w:style>
   <w:style w:type="numbering" w:customStyle="1" w:styleId="WW8Num22">
     <w:name w:val="WW8Num22"/>
-    <w:basedOn w:val="Sinlista"/>
+    <w:basedOn w:val="NoList"/>
     <w:pPr>
       <w:numPr>
         <w:numId w:val="23"/>
@@ -7690,7 +7984,7 @@
   </w:style>
   <w:style w:type="numbering" w:customStyle="1" w:styleId="WW8Num23">
     <w:name w:val="WW8Num23"/>
-    <w:basedOn w:val="Sinlista"/>
+    <w:basedOn w:val="NoList"/>
     <w:pPr>
       <w:numPr>
         <w:numId w:val="24"/>
@@ -7699,7 +7993,7 @@
   </w:style>
   <w:style w:type="numbering" w:customStyle="1" w:styleId="WW8Num24">
     <w:name w:val="WW8Num24"/>
-    <w:basedOn w:val="Sinlista"/>
+    <w:basedOn w:val="NoList"/>
     <w:pPr>
       <w:numPr>
         <w:numId w:val="25"/>
@@ -7708,7 +8002,7 @@
   </w:style>
   <w:style w:type="numbering" w:customStyle="1" w:styleId="WW8Num25">
     <w:name w:val="WW8Num25"/>
-    <w:basedOn w:val="Sinlista"/>
+    <w:basedOn w:val="NoList"/>
     <w:pPr>
       <w:numPr>
         <w:numId w:val="26"/>
@@ -7717,16 +8011,16 @@
   </w:style>
   <w:style w:type="numbering" w:customStyle="1" w:styleId="WW8Num26">
     <w:name w:val="WW8Num26"/>
-    <w:basedOn w:val="Sinlista"/>
+    <w:basedOn w:val="NoList"/>
     <w:pPr>
       <w:numPr>
         <w:numId w:val="27"/>
       </w:numPr>
     </w:pPr>
   </w:style>
-  <w:style w:type="character" w:styleId="Hipervnculo">
+  <w:style w:type="character" w:styleId="Hyperlink">
     <w:name w:val="Hyperlink"/>
-    <w:basedOn w:val="Fuentedeprrafopredeter"/>
+    <w:basedOn w:val="DefaultParagraphFont"/>
     <w:uiPriority w:val="99"/>
     <w:unhideWhenUsed/>
     <w:rsid w:val="00731F7B"/>
@@ -7735,9 +8029,9 @@
       <w:u w:val="single"/>
     </w:rPr>
   </w:style>
-  <w:style w:type="character" w:styleId="Mencinsinresolver">
+  <w:style w:type="character" w:styleId="UnresolvedMention">
     <w:name w:val="Unresolved Mention"/>
-    <w:basedOn w:val="Fuentedeprrafopredeter"/>
+    <w:basedOn w:val="DefaultParagraphFont"/>
     <w:uiPriority w:val="99"/>
     <w:semiHidden/>
     <w:unhideWhenUsed/>
@@ -7749,22 +8043,22 @@
   </w:style>
   <w:style w:type="character" w:customStyle="1" w:styleId="citation-230">
     <w:name w:val="citation-230"/>
-    <w:basedOn w:val="Fuentedeprrafopredeter"/>
+    <w:basedOn w:val="DefaultParagraphFont"/>
     <w:rsid w:val="003F7341"/>
   </w:style>
   <w:style w:type="character" w:customStyle="1" w:styleId="citation-229">
     <w:name w:val="citation-229"/>
-    <w:basedOn w:val="Fuentedeprrafopredeter"/>
+    <w:basedOn w:val="DefaultParagraphFont"/>
     <w:rsid w:val="003F7341"/>
   </w:style>
   <w:style w:type="character" w:customStyle="1" w:styleId="citation-228">
     <w:name w:val="citation-228"/>
-    <w:basedOn w:val="Fuentedeprrafopredeter"/>
+    <w:basedOn w:val="DefaultParagraphFont"/>
     <w:rsid w:val="003F7341"/>
   </w:style>
   <w:style w:type="character" w:customStyle="1" w:styleId="math-inline">
     <w:name w:val="math-inline"/>
-    <w:basedOn w:val="Fuentedeprrafopredeter"/>
+    <w:basedOn w:val="DefaultParagraphFont"/>
     <w:rsid w:val="003F7341"/>
   </w:style>
 </w:styles>

</xml_diff>

<commit_message>
Avances en la memoria
</commit_message>
<xml_diff>
--- a/Senku-Memoria.docx
+++ b/Senku-Memoria.docx
@@ -37,8 +37,7 @@
           <w:szCs w:val="21"/>
         </w:rPr>
         <w:sectPr>
-          <w:footerReference w:type="default" r:id="rId7"/>
-          <w:footerReference w:type="first" r:id="rId8"/>
+          <w:footerReference w:type="first" r:id="rId7"/>
           <w:pgSz w:w="11906" w:h="16838"/>
           <w:pgMar w:top="1080" w:right="720" w:bottom="2434" w:left="720" w:header="720" w:footer="720" w:gutter="0"/>
           <w:cols w:space="720"/>
@@ -105,26 +104,36 @@
         </w:rPr>
         <w:br/>
       </w:r>
+      <w:proofErr w:type="spellStart"/>
       <w:r>
         <w:rPr>
           <w:sz w:val="18"/>
           <w:szCs w:val="18"/>
           <w:lang w:val="es-ES"/>
         </w:rPr>
-        <w:t>Sevilla, España</w:t>
-      </w:r>
+        <w:t>Sevilla</w:t>
+      </w:r>
+      <w:proofErr w:type="spellEnd"/>
       <w:r>
         <w:rPr>
           <w:sz w:val="18"/>
           <w:szCs w:val="18"/>
           <w:lang w:val="es-ES"/>
         </w:rPr>
+        <w:t>, España</w:t>
+      </w:r>
+      <w:r>
+        <w:rPr>
+          <w:sz w:val="18"/>
+          <w:szCs w:val="18"/>
+          <w:lang w:val="es-ES"/>
+        </w:rPr>
         <w:br/>
       </w:r>
-      <w:hyperlink r:id="rId9" w:history="1">
+      <w:hyperlink r:id="rId8" w:history="1">
         <w:r>
           <w:rPr>
-            <w:rStyle w:val="Hyperlink"/>
+            <w:rStyle w:val="Hipervnculo"/>
             <w:sz w:val="18"/>
             <w:szCs w:val="18"/>
             <w:lang w:val="es-ES"/>
@@ -208,26 +217,36 @@
         </w:rPr>
         <w:br/>
       </w:r>
+      <w:proofErr w:type="spellStart"/>
       <w:r>
         <w:rPr>
           <w:sz w:val="18"/>
           <w:szCs w:val="18"/>
           <w:lang w:val="es-ES"/>
         </w:rPr>
-        <w:t>Sevilla, España</w:t>
-      </w:r>
+        <w:t>Sevilla</w:t>
+      </w:r>
+      <w:proofErr w:type="spellEnd"/>
       <w:r>
         <w:rPr>
           <w:sz w:val="18"/>
           <w:szCs w:val="18"/>
           <w:lang w:val="es-ES"/>
         </w:rPr>
+        <w:t>, España</w:t>
+      </w:r>
+      <w:r>
+        <w:rPr>
+          <w:sz w:val="18"/>
+          <w:szCs w:val="18"/>
+          <w:lang w:val="es-ES"/>
+        </w:rPr>
         <w:br/>
       </w:r>
-      <w:hyperlink r:id="rId10" w:history="1">
+      <w:hyperlink r:id="rId9" w:history="1">
         <w:r>
           <w:rPr>
-            <w:rStyle w:val="Hyperlink"/>
+            <w:rStyle w:val="Hipervnculo"/>
             <w:sz w:val="18"/>
             <w:szCs w:val="18"/>
             <w:lang w:val="es-ES"/>
@@ -301,7 +320,7 @@
           <w:iCs/>
           <w:lang w:val="es-ES"/>
         </w:rPr>
-        <w:t xml:space="preserve">Se ha realizado un estudio sobre como aplicar la planificación automática para solucionar diferentes modelos del juego senku, en concreto cinco variantes de este. Para ello se han utilizado dos algoritmos diferentes, el primero mediante OneShotPlanner, función </w:t>
+        <w:t xml:space="preserve">Se ha realizado un estudio sobre </w:t>
       </w:r>
       <w:r>
         <w:rPr>
@@ -309,7 +328,7 @@
           <w:iCs/>
           <w:lang w:val="es-ES"/>
         </w:rPr>
-        <w:t>definida</w:t>
+        <w:t>cómo</w:t>
       </w:r>
       <w:r>
         <w:rPr>
@@ -317,7 +336,7 @@
           <w:iCs/>
           <w:lang w:val="es-ES"/>
         </w:rPr>
-        <w:t xml:space="preserve"> </w:t>
+        <w:t xml:space="preserve"> aplicar la planificación automática para solucionar diferentes modelos del juego senku, en concreto cinco variantes de este. Para ello se han utilizado dos algoritmos diferentes, el primero mediante OneShotPlanner, función </w:t>
       </w:r>
       <w:r>
         <w:rPr>
@@ -325,7 +344,7 @@
           <w:iCs/>
           <w:lang w:val="es-ES"/>
         </w:rPr>
-        <w:t>en</w:t>
+        <w:t>definida</w:t>
       </w:r>
       <w:r>
         <w:rPr>
@@ -333,7 +352,7 @@
           <w:iCs/>
           <w:lang w:val="es-ES"/>
         </w:rPr>
-        <w:t xml:space="preserve"> la librería unified_planning</w:t>
+        <w:t xml:space="preserve"> </w:t>
       </w:r>
       <w:r>
         <w:rPr>
@@ -341,6 +360,22 @@
           <w:iCs/>
           <w:lang w:val="es-ES"/>
         </w:rPr>
+        <w:t>en</w:t>
+      </w:r>
+      <w:r>
+        <w:rPr>
+          <w:i/>
+          <w:iCs/>
+          <w:lang w:val="es-ES"/>
+        </w:rPr>
+        <w:t xml:space="preserve"> la librería unified_planning</w:t>
+      </w:r>
+      <w:r>
+        <w:rPr>
+          <w:i/>
+          <w:iCs/>
+          <w:lang w:val="es-ES"/>
+        </w:rPr>
         <w:t>, y la otra con un algoritmo beam search.</w:t>
       </w:r>
     </w:p>
@@ -391,7 +426,13 @@
         <w:rPr>
           <w:lang w:val="es-ES"/>
         </w:rPr>
-        <w:t>, planificación automática, árbol de búsqueda</w:t>
+        <w:t xml:space="preserve">, planificación automática, </w:t>
+      </w:r>
+      <w:r>
+        <w:rPr>
+          <w:lang w:val="es-ES"/>
+        </w:rPr>
+        <w:t>búsqueda en espacio de estados</w:t>
       </w:r>
       <w:r>
         <w:rPr>
@@ -402,7 +443,7 @@
     </w:p>
     <w:p>
       <w:pPr>
-        <w:pStyle w:val="Heading1"/>
+        <w:pStyle w:val="Ttulo1"/>
         <w:rPr>
           <w:lang w:val="es-ES"/>
         </w:rPr>
@@ -664,6 +705,22 @@
     </w:p>
     <w:p>
       <w:pPr>
+        <w:widowControl/>
+        <w:suppressAutoHyphens w:val="0"/>
+        <w:autoSpaceDN/>
+        <w:ind w:firstLine="216"/>
+        <w:textAlignment w:val="auto"/>
+        <w:rPr>
+          <w:rFonts w:ascii="Times New Roman" w:eastAsia="Times New Roman" w:hAnsi="Times New Roman" w:cs="Times New Roman"/>
+          <w:kern w:val="0"/>
+          <w:sz w:val="20"/>
+          <w:szCs w:val="20"/>
+          <w:lang w:eastAsia="es-ES" w:bidi="ar-SA"/>
+        </w:rPr>
+      </w:pPr>
+    </w:p>
+    <w:p>
+      <w:pPr>
         <w:pStyle w:val="Textbody"/>
         <w:rPr>
           <w:lang w:val="es-ES"/>
@@ -701,7 +758,13 @@
         <w:rPr>
           <w:lang w:val="es-ES"/>
         </w:rPr>
-        <w:t xml:space="preserve"> puede modelarse formalmente como un </w:t>
+        <w:t xml:space="preserve"> puede modelarse formalmente como</w:t>
+      </w:r>
+      <w:r>
+        <w:rPr>
+          <w:lang w:val="es-ES"/>
+        </w:rPr>
+        <w:t xml:space="preserve"> una </w:t>
       </w:r>
       <w:r>
         <w:rPr>
@@ -709,13 +772,25 @@
           <w:bCs/>
           <w:lang w:val="es-ES"/>
         </w:rPr>
-        <w:t>árbol de búsqueda</w:t>
-      </w:r>
-      <w:r>
-        <w:rPr>
-          <w:lang w:val="es-ES"/>
-        </w:rPr>
-        <w:t>, donde los nodos representan los estados del tablero y las aristas corresponden a las acciones válidas. Dado que el espacio de estados puede ser altamente complejo, el uso de algoritmos basados en grafos y técnicas heurísticas resulta fundamental para una exploración eficiente.</w:t>
+        <w:t>búsqueda en espacio de estados</w:t>
+      </w:r>
+      <w:r>
+        <w:rPr>
+          <w:lang w:val="es-ES"/>
+        </w:rPr>
+        <w:t>,</w:t>
+      </w:r>
+      <w:r>
+        <w:rPr>
+          <w:lang w:val="es-ES"/>
+        </w:rPr>
+        <w:t xml:space="preserve"> donde cada estado son diferentes situaciones del juego y sus acciones, diferentes movimientos en el tablero</w:t>
+      </w:r>
+      <w:r>
+        <w:rPr>
+          <w:lang w:val="es-ES"/>
+        </w:rPr>
+        <w:t>. Dado que el espacio de estados puede ser altamente complejo, el uso de algoritmos basados en grafos y técnicas heurísticas resulta fundamental para una exploración eficiente.</w:t>
       </w:r>
     </w:p>
     <w:p>
@@ -729,118 +804,92 @@
         <w:rPr>
           <w:lang w:val="es-ES"/>
         </w:rPr>
-        <w:t>#####No usamos búsqueda de grafo en el trabajo hehe</w:t>
-      </w:r>
-      <w:r>
-        <w:rPr>
-          <w:lang w:val="es-ES"/>
-        </w:rPr>
-        <w:t>, usamos búsqueda en espacio de estados</w:t>
+        <w:t xml:space="preserve">El objetivo de este trabajo es el diseño y desarrollo de un sistema capaz de modelar distintos escenarios del juego </w:t>
+      </w:r>
+      <w:r>
+        <w:rPr>
+          <w:b/>
+          <w:bCs/>
+          <w:lang w:val="es-ES"/>
+        </w:rPr>
+        <w:t>Senku</w:t>
+      </w:r>
+      <w:r>
+        <w:rPr>
+          <w:lang w:val="es-ES"/>
+        </w:rPr>
+        <w:t xml:space="preserve">, mediante lenguajes de descripción de dominios, concretamente </w:t>
+      </w:r>
+      <w:r>
+        <w:rPr>
+          <w:b/>
+          <w:bCs/>
+          <w:lang w:val="es-ES"/>
+        </w:rPr>
+        <w:t>PDDL</w:t>
+      </w:r>
+      <w:r>
+        <w:rPr>
+          <w:lang w:val="es-ES"/>
+        </w:rPr>
+        <w:t>, para hallar una secuencia de acciones que los resuelvan de forma automática.</w:t>
+      </w:r>
+      <w:r>
+        <w:rPr>
+          <w:lang w:val="es-ES"/>
+        </w:rPr>
+        <w:t xml:space="preserve"> El principal problema est</w:t>
+      </w:r>
+      <w:r>
+        <w:rPr>
+          <w:lang w:val="es-ES"/>
+        </w:rPr>
+        <w:t>á</w:t>
+      </w:r>
+      <w:r>
+        <w:rPr>
+          <w:lang w:val="es-ES"/>
+        </w:rPr>
+        <w:t xml:space="preserve"> en la eficiencia en la búsqueda en tableros grandes con grandes espacios de estados, por lo que la solución propuesta se ha enfocado utilizando algoritmos avanzados de búsqueda mediante el lenguaje de programación Python. El algoritmo utilizado es el Beam Search que se explicará más adelante, pero en resumen es un algo</w:t>
+      </w:r>
+      <w:r>
+        <w:rPr>
+          <w:lang w:val="es-ES"/>
+        </w:rPr>
+        <w:t>ritmo tipo A* que optimiza la exploración mediante un “ancho de rayo” prefijado.</w:t>
       </w:r>
     </w:p>
     <w:p>
       <w:pPr>
-        <w:pStyle w:val="Textbody"/>
-        <w:rPr>
-          <w:lang w:val="es-ES"/>
-        </w:rPr>
-      </w:pPr>
-      <w:r>
-        <w:rPr>
-          <w:lang w:val="es-ES"/>
-        </w:rPr>
-        <w:t xml:space="preserve">El </w:t>
-      </w:r>
-      <w:r>
-        <w:rPr>
-          <w:lang w:val="es-ES"/>
-        </w:rPr>
-        <w:t xml:space="preserve">objetivo de este trabajo es el diseño y desarrollo de un sistema capaz de modelar distintos escenarios del juego </w:t>
-      </w:r>
-      <w:r>
-        <w:rPr>
-          <w:b/>
-          <w:bCs/>
-          <w:lang w:val="es-ES"/>
-        </w:rPr>
-        <w:t>Senku</w:t>
-      </w:r>
-      <w:r>
-        <w:rPr>
-          <w:lang w:val="es-ES"/>
-        </w:rPr>
-        <w:t xml:space="preserve">, mediante lenguajes de descripción de dominios, concretamente </w:t>
-      </w:r>
-      <w:r>
-        <w:rPr>
-          <w:b/>
-          <w:bCs/>
-          <w:lang w:val="es-ES"/>
-        </w:rPr>
-        <w:t>PDDL</w:t>
-      </w:r>
-      <w:r>
-        <w:rPr>
-          <w:lang w:val="es-ES"/>
-        </w:rPr>
-        <w:t>, para hallar una secuencia de acciones que los resuelvan de forma automática.</w:t>
-      </w:r>
-      <w:r>
-        <w:rPr>
-          <w:lang w:val="es-ES"/>
-        </w:rPr>
-        <w:t xml:space="preserve"> El principal problema est</w:t>
-      </w:r>
-      <w:r>
-        <w:rPr>
-          <w:lang w:val="es-ES"/>
-        </w:rPr>
-        <w:t>á</w:t>
-      </w:r>
-      <w:r>
-        <w:rPr>
-          <w:lang w:val="es-ES"/>
-        </w:rPr>
-        <w:t xml:space="preserve"> en la eficiencia en la búsqueda en tableros grandes con grandes espacios de estados, por lo que la solución propuesta se ha enfocado utilizando algoritmos avanzados de búsqueda mediante el lenguaje de programación Python. El algoritmo utilizado es el Beam Search que se explicará más adelante, pero en resumen es un algo</w:t>
-      </w:r>
-      <w:r>
-        <w:rPr>
-          <w:lang w:val="es-ES"/>
-        </w:rPr>
-        <w:t>ritmo tipo A* que optimiza la exploración mediante un “ancho de rayo” prefijado.</w:t>
+        <w:pStyle w:val="Ttulo1"/>
+        <w:rPr>
+          <w:lang w:val="es-ES"/>
+        </w:rPr>
+      </w:pPr>
+      <w:r>
+        <w:rPr>
+          <w:lang w:val="es-ES"/>
+        </w:rPr>
+        <w:t>Preliminares</w:t>
       </w:r>
     </w:p>
     <w:p>
       <w:pPr>
-        <w:pStyle w:val="Heading1"/>
-        <w:rPr>
-          <w:lang w:val="es-ES"/>
-        </w:rPr>
-      </w:pPr>
-      <w:r>
-        <w:rPr>
-          <w:lang w:val="es-ES"/>
-        </w:rPr>
-        <w:t>Preliminares</w:t>
+        <w:pStyle w:val="Textbody"/>
+        <w:rPr>
+          <w:lang w:val="es-ES"/>
+        </w:rPr>
+      </w:pPr>
+      <w:r>
+        <w:rPr>
+          <w:lang w:val="es-ES"/>
+        </w:rPr>
+        <w:t>A continuación, se mencionarán las técnicas empleadas en este proyecto:</w:t>
       </w:r>
     </w:p>
     <w:p>
       <w:pPr>
-        <w:pStyle w:val="Textbody"/>
-        <w:rPr>
-          <w:lang w:val="es-ES"/>
-        </w:rPr>
-      </w:pPr>
-      <w:r>
-        <w:rPr>
-          <w:lang w:val="es-ES"/>
-        </w:rPr>
-        <w:t>En esta sección se hace una breve introducción de las técnicas empleadas y también trabajos relacionados, si los hay.</w:t>
-      </w:r>
-    </w:p>
-    <w:p>
-      <w:pPr>
-        <w:pStyle w:val="Heading2"/>
+        <w:pStyle w:val="Ttulo2"/>
         <w:rPr>
           <w:lang w:val="es-ES"/>
         </w:rPr>
@@ -850,48 +899,6 @@
           <w:lang w:val="es-ES"/>
         </w:rPr>
         <w:t>Métodos empleados</w:t>
-      </w:r>
-    </w:p>
-    <w:p>
-      <w:pPr>
-        <w:pStyle w:val="Standard"/>
-        <w:rPr>
-          <w:lang w:val="es-ES" w:eastAsia="en-US"/>
-        </w:rPr>
-      </w:pPr>
-      <w:r>
-        <w:rPr>
-          <w:lang w:val="es-ES" w:eastAsia="en-US"/>
-        </w:rPr>
-        <w:t>##### búsqueda en espacio de estados y clasificación por heurística</w:t>
-      </w:r>
-    </w:p>
-    <w:p>
-      <w:pPr>
-        <w:pStyle w:val="Textbody"/>
-        <w:rPr>
-          <w:lang w:val="es-ES"/>
-        </w:rPr>
-      </w:pPr>
-      <w:r>
-        <w:rPr>
-          <w:lang w:val="es-ES"/>
-        </w:rPr>
-        <w:t>Describir aquí los métodos y técnicas empleadas (búsqueda en espacio de estados, algoritmos genéticos, redes bayesianas, técnicas de clasificación, redes neuronales, etc.). Si es necesario, separarlos en distintas subsecciones dentro de Antecedentes.</w:t>
-      </w:r>
-    </w:p>
-    <w:p>
-      <w:pPr>
-        <w:pStyle w:val="Textbody"/>
-        <w:rPr>
-          <w:lang w:val="es-ES"/>
-        </w:rPr>
-      </w:pPr>
-      <w:r>
-        <w:rPr>
-          <w:lang w:val="es-ES"/>
-        </w:rPr>
-        <w:t>Se pueden usar listas por puntos como sigue:</w:t>
       </w:r>
     </w:p>
     <w:p>
@@ -909,7 +916,13 @@
         <w:rPr>
           <w:lang w:val="es-ES"/>
         </w:rPr>
-        <w:t>Un punto: esto es un ejemplo de una lista.</w:t>
+        <w:t>Búsqueda en espacio de estados</w:t>
+      </w:r>
+      <w:r>
+        <w:rPr>
+          <w:lang w:val="es-ES"/>
+        </w:rPr>
+        <w:t>, consiste en representar un conjunto de posibles situaciones (estados) y buscar una secuencia de acciones que lleve desde un estado inicial a un estado objetivo.</w:t>
       </w:r>
     </w:p>
     <w:p>
@@ -923,133 +936,198 @@
         <w:rPr>
           <w:lang w:val="es-ES"/>
         </w:rPr>
-        <w:t>Otro punto.</w:t>
+        <w:t>Clasificación por heurística</w:t>
+      </w:r>
+      <w:r>
+        <w:rPr>
+          <w:lang w:val="es-ES"/>
+        </w:rPr>
+        <w:t>, consiste en clasificar cada uno de los estados resultantes en el algoritmo anterior, para elegir aquellos estados “mejores” en cada iteración. En concreto nosotros utilizaremos la función pagoda explicada más adelante.</w:t>
       </w:r>
     </w:p>
     <w:p>
       <w:pPr>
-        <w:pStyle w:val="Textbody"/>
-        <w:rPr>
-          <w:lang w:val="es-ES"/>
-        </w:rPr>
-      </w:pPr>
-      <w:r>
-        <w:rPr>
-          <w:lang w:val="es-ES"/>
-        </w:rPr>
-        <w:t xml:space="preserve">Por último, se debe hacer un uso correcto de las referencias bibliográficas, para que el lector pueda acceder a más información </w:t>
-      </w:r>
-      <w:r>
-        <w:rPr>
-          <w:lang w:val="es-ES"/>
-        </w:rPr>
-        <w:fldChar w:fldCharType="begin"/>
-      </w:r>
-      <w:r>
-        <w:rPr>
-          <w:lang w:val="es-ES"/>
-        </w:rPr>
-        <w:instrText xml:space="preserve"> PAGEREF _Ref509593486 </w:instrText>
-      </w:r>
-      <w:r>
-        <w:rPr>
-          <w:lang w:val="es-ES"/>
-        </w:rPr>
-        <w:fldChar w:fldCharType="separate"/>
-      </w:r>
-      <w:r>
-        <w:rPr>
-          <w:lang w:val="es-ES"/>
-        </w:rPr>
-        <w:t>[1]</w:t>
-      </w:r>
-      <w:r>
-        <w:rPr>
-          <w:lang w:val="es-ES"/>
-        </w:rPr>
-        <w:fldChar w:fldCharType="end"/>
-      </w:r>
-      <w:r>
-        <w:rPr>
-          <w:lang w:val="es-ES"/>
-        </w:rPr>
-        <w:t>. Todas las referencias al final del documento deben ser citadas al menos una vez.</w:t>
+        <w:pStyle w:val="Ttulo2"/>
+        <w:rPr>
+          <w:lang w:val="es-ES"/>
+        </w:rPr>
+      </w:pPr>
+      <w:r>
+        <w:rPr>
+          <w:lang w:val="es-ES"/>
+        </w:rPr>
+        <w:t>Trabajo Relacionado</w:t>
       </w:r>
     </w:p>
     <w:p>
       <w:pPr>
-        <w:pStyle w:val="Heading2"/>
-        <w:rPr>
-          <w:lang w:val="es-ES"/>
-        </w:rPr>
-      </w:pPr>
-      <w:r>
-        <w:rPr>
-          <w:lang w:val="es-ES"/>
-        </w:rPr>
-        <w:t>Trabajo Relacionado</w:t>
+        <w:pStyle w:val="Textbody"/>
+        <w:rPr>
+          <w:lang w:val="es-ES"/>
+        </w:rPr>
+      </w:pPr>
+      <w:r>
+        <w:rPr>
+          <w:lang w:val="es-ES"/>
+        </w:rPr>
+        <w:t>Como trabajos relacionados hemos encontrado y consultado diferentes de ellos que estudian matemáticamente el juego del senku.  Estos son:</w:t>
       </w:r>
     </w:p>
     <w:p>
       <w:pPr>
-        <w:pStyle w:val="Standard"/>
-        <w:rPr>
-          <w:lang w:val="es-ES" w:eastAsia="en-US"/>
-        </w:rPr>
-      </w:pPr>
-      <w:r>
-        <w:rPr>
-          <w:lang w:val="es-ES" w:eastAsia="en-US"/>
-        </w:rPr>
-        <w:t>#### No se si aquí es el sitio, pero se puede poner referencia a consultar los links de las referencias para ver que había estados irresolubles del problema</w:t>
+        <w:pStyle w:val="Textbody"/>
+        <w:numPr>
+          <w:ilvl w:val="0"/>
+          <w:numId w:val="36"/>
+        </w:numPr>
+        <w:rPr>
+          <w:lang w:val="es-ES"/>
+        </w:rPr>
+      </w:pPr>
+      <w:r>
+        <w:rPr>
+          <w:lang w:val="es-ES"/>
+        </w:rPr>
+        <w:t xml:space="preserve">En el primer caso , esta página se estudia el juego senku desde una vista tanto recreativa como computacional. Una de las partes más importantes en la de Computacional Serach </w:t>
+      </w:r>
+      <w:proofErr w:type="spellStart"/>
+      <w:r>
+        <w:rPr>
+          <w:lang w:val="es-ES"/>
+        </w:rPr>
+        <w:t>Techniques</w:t>
+      </w:r>
+      <w:proofErr w:type="spellEnd"/>
+      <w:r>
+        <w:rPr>
+          <w:lang w:val="es-ES"/>
+        </w:rPr>
+        <w:t>, donde explica cómo los algoritmos de búsqueda en espacio de estados se utilizan para resolver el juego automáticamente</w:t>
+      </w:r>
+      <w:r>
+        <w:rPr>
+          <w:lang w:val="es-ES"/>
+        </w:rPr>
+        <w:t xml:space="preserve">  [2]</w:t>
+      </w:r>
+      <w:r>
+        <w:rPr>
+          <w:lang w:val="es-ES"/>
+        </w:rPr>
+        <w:t>, con este estudio nos ha ayudado a comprender el objetivo y la utilizad reales que tiene la función pagoda para guiar la heurística. Además, nos confirmó que la variante 5 tiene solo cuatro posiciones iniciales en las que se puede resolver.</w:t>
       </w:r>
     </w:p>
     <w:p>
       <w:pPr>
         <w:pStyle w:val="Textbody"/>
-        <w:rPr>
-          <w:lang w:val="es-ES"/>
-        </w:rPr>
-      </w:pPr>
-      <w:r>
-        <w:rPr>
-          <w:lang w:val="es-ES"/>
-        </w:rPr>
-        <w:t>Se puede realizar un recorrido en la literatura sobre trabajos anteriores que estén relacionados y que sea por tanto interesante comentar aquí. Por supuesto, añadir las referencias bibliográficas correspondientes.</w:t>
+        <w:numPr>
+          <w:ilvl w:val="0"/>
+          <w:numId w:val="36"/>
+        </w:numPr>
+        <w:rPr>
+          <w:lang w:val="es-ES"/>
+        </w:rPr>
+      </w:pPr>
+      <w:r>
+        <w:rPr>
+          <w:lang w:val="es-ES"/>
+        </w:rPr>
+        <w:t xml:space="preserve">En el segundo caso </w:t>
+      </w:r>
+      <w:r>
+        <w:rPr>
+          <w:lang w:val="es-ES"/>
+        </w:rPr>
+        <w:t>, tiene un enfoque más matemático que el estudio anterior, en este se centra más en invariantes del senku para demostrar cuándo una partida de este juego es imposible de ganar, donde una invariante es una propiedad o cantidad que permanece constante durante todos los movimientos, y si un estado inicial y un estado final tienen invariantes diferentes, entonces es imposible llegar de uno a otro</w:t>
+      </w:r>
+      <w:r>
+        <w:rPr>
+          <w:lang w:val="es-ES"/>
+        </w:rPr>
+        <w:t xml:space="preserve"> [3]</w:t>
+      </w:r>
+      <w:r>
+        <w:rPr>
+          <w:lang w:val="es-ES"/>
+        </w:rPr>
+        <w:t>. Esta página nos ha ayudado junto a la siguiente para demostrar que la variante 1 del trabajo no es solucionable si se tiene como estado inicial y final la misma posición.</w:t>
       </w:r>
     </w:p>
     <w:p>
       <w:pPr>
-        <w:pStyle w:val="Heading1"/>
-        <w:rPr>
-          <w:lang w:val="es-ES"/>
-        </w:rPr>
-      </w:pPr>
-      <w:r>
-        <w:rPr>
-          <w:lang w:val="es-ES"/>
-        </w:rPr>
-        <w:t>Metodología</w:t>
+        <w:pStyle w:val="Textbody"/>
+        <w:numPr>
+          <w:ilvl w:val="0"/>
+          <w:numId w:val="36"/>
+        </w:numPr>
+        <w:rPr>
+          <w:lang w:val="es-ES"/>
+        </w:rPr>
+      </w:pPr>
+      <w:r>
+        <w:rPr>
+          <w:lang w:val="es-ES"/>
+        </w:rPr>
+        <w:t>En el tercer caso, se puede clasificar como el estudio anterior, desde una perspectiva matemática, lógica y combinatoria se centra en encontrar soluciones</w:t>
+      </w:r>
+      <w:r>
+        <w:rPr>
+          <w:lang w:val="es-ES"/>
+        </w:rPr>
+        <w:t>, observar si ciertas posiciones son  posibles o imposibles</w:t>
+      </w:r>
+      <w:r>
+        <w:rPr>
+          <w:lang w:val="es-ES"/>
+        </w:rPr>
+        <w:t xml:space="preserve"> </w:t>
+      </w:r>
+      <w:r>
+        <w:rPr>
+          <w:lang w:val="es-ES"/>
+        </w:rPr>
+        <w:t xml:space="preserve"> y que propiedades estructurales tiene el juego</w:t>
+      </w:r>
+      <w:r>
+        <w:rPr>
+          <w:lang w:val="es-ES"/>
+        </w:rPr>
+        <w:t>[4]</w:t>
+      </w:r>
+      <w:r>
+        <w:rPr>
+          <w:lang w:val="es-ES"/>
+        </w:rPr>
+        <w:t xml:space="preserve">. Esta página junto a la anterior nos </w:t>
+      </w:r>
+      <w:proofErr w:type="spellStart"/>
+      <w:r>
+        <w:rPr>
+          <w:lang w:val="es-ES"/>
+        </w:rPr>
+        <w:t>ayudo</w:t>
+      </w:r>
+      <w:proofErr w:type="spellEnd"/>
+      <w:r>
+        <w:rPr>
+          <w:lang w:val="es-ES"/>
+        </w:rPr>
+        <w:t xml:space="preserve"> a demostrar que la variante 1 no estaba bien planteada.</w:t>
       </w:r>
     </w:p>
     <w:p>
       <w:pPr>
-        <w:pStyle w:val="Standard"/>
-        <w:rPr>
-          <w:lang w:val="es-ES" w:eastAsia="en-US"/>
-        </w:rPr>
-      </w:pPr>
-      <w:r>
-        <w:rPr>
-          <w:lang w:val="es-ES" w:eastAsia="en-US"/>
-        </w:rPr>
-        <w:t xml:space="preserve">#### </w:t>
-      </w:r>
-      <w:r>
-        <w:rPr>
-          <w:lang w:val="es-ES" w:eastAsia="en-US"/>
-        </w:rPr>
-        <w:t>en la parte común seguimos el tipo de trabajo que nos enseñaron en la práctica, y en la parte de junio hemos ido optimizando la búsqueda mediante estudio y experimentación.</w:t>
+        <w:pStyle w:val="Ttulo1"/>
+        <w:rPr>
+          <w:lang w:val="es-ES"/>
+        </w:rPr>
+      </w:pPr>
+      <w:r>
+        <w:rPr>
+          <w:lang w:val="es-ES"/>
+        </w:rPr>
+        <w:lastRenderedPageBreak/>
+        <w:t>Metodología</w:t>
       </w:r>
     </w:p>
     <w:p>
@@ -1059,20 +1137,26 @@
           <w:lang w:val="es-ES" w:eastAsia="en-US"/>
         </w:rPr>
       </w:pPr>
+      <w:r>
+        <w:rPr>
+          <w:lang w:val="es-ES" w:eastAsia="en-US"/>
+        </w:rPr>
+        <w:t xml:space="preserve">#### </w:t>
+      </w:r>
+      <w:r>
+        <w:rPr>
+          <w:lang w:val="es-ES" w:eastAsia="en-US"/>
+        </w:rPr>
+        <w:t>en la parte común seguimos el tipo de trabajo que nos enseñaron en la práctica, y en la parte de junio hemos ido optimizando la búsqueda mediante estudio y experimentación.</w:t>
+      </w:r>
     </w:p>
     <w:p>
       <w:pPr>
-        <w:pStyle w:val="Textbody"/>
-        <w:rPr>
-          <w:lang w:val="es-ES"/>
-        </w:rPr>
-      </w:pPr>
-      <w:r>
-        <w:rPr>
-          <w:lang w:val="es-ES"/>
-        </w:rPr>
-        <w:t>Esta sección se dedica a la descripción del método implementado en el trabajo. Esta parte es la correspondiente a lo realmente desarrollado en el trabajo, y se puede emplear pseudocódigo (nunca código), esquemas, tablas, etc.</w:t>
-      </w:r>
+        <w:pStyle w:val="Standard"/>
+        <w:rPr>
+          <w:lang w:val="es-ES" w:eastAsia="en-US"/>
+        </w:rPr>
+      </w:pPr>
     </w:p>
     <w:p>
       <w:pPr>
@@ -1081,10 +1165,88 @@
           <w:lang w:val="es-ES"/>
         </w:rPr>
       </w:pPr>
+      <w:r>
+        <w:rPr>
+          <w:lang w:val="es-ES"/>
+        </w:rPr>
+        <w:t>Este trabajo se puede dividir claramente en dos partes, la parte común y la parte de convocatoria de junio.</w:t>
+      </w:r>
     </w:p>
     <w:p>
       <w:pPr>
         <w:pStyle w:val="Textbody"/>
+        <w:rPr>
+          <w:lang w:val="es-ES"/>
+        </w:rPr>
+      </w:pPr>
+      <w:r>
+        <w:rPr>
+          <w:lang w:val="es-ES"/>
+        </w:rPr>
+        <w:t xml:space="preserve">Para la parte común </w:t>
+      </w:r>
+      <w:r>
+        <w:rPr>
+          <w:lang w:val="es-ES"/>
+        </w:rPr>
+        <w:t xml:space="preserve">se ha seguido el tipo de trabajo que se enseñó en la práctica cuatro del tema de planificación automática, se ha definido el dominio con las funciones que nos enseñaron de la librería </w:t>
+      </w:r>
+      <w:r>
+        <w:rPr>
+          <w:lang w:val="es-ES"/>
+        </w:rPr>
+        <w:t>unified_planning</w:t>
+      </w:r>
+      <w:r>
+        <w:rPr>
+          <w:lang w:val="es-ES"/>
+        </w:rPr>
+        <w:t>, se continúa creando las instancias de l</w:t>
+      </w:r>
+      <w:r>
+        <w:rPr>
+          <w:lang w:val="es-ES"/>
+        </w:rPr>
+        <w:t xml:space="preserve">os cinco tipos de senku establecidos en el enunciado del trabajo </w:t>
+      </w:r>
+      <w:r>
+        <w:rPr>
+          <w:lang w:val="es-ES"/>
+        </w:rPr>
+        <w:t>y por último se busca una solución con el conjunto de acciones realizadas para llegar a ella, mediante la función OneShotPlanner.</w:t>
+      </w:r>
+    </w:p>
+    <w:p>
+      <w:pPr>
+        <w:pStyle w:val="Textbody"/>
+        <w:rPr>
+          <w:lang w:val="es-ES"/>
+        </w:rPr>
+      </w:pPr>
+      <w:r>
+        <w:rPr>
+          <w:lang w:val="es-ES"/>
+        </w:rPr>
+        <w:t>Para la parte de convocatoria de junio</w:t>
+      </w:r>
+      <w:r>
+        <w:rPr>
+          <w:lang w:val="es-ES"/>
+        </w:rPr>
+        <w:t xml:space="preserve"> se ha utilizado de base la creación del dominio y de las diferentes instancias, y se han creado principalmente una función que realiza el algoritmo de Beam Search que se explica más adelante. Junto con este algoritmo y algunas funciones auxiliares se ha llegado al objetivo de solucionar las cinco variantes del senku señaladas en las instrucciones del trabajo. Para llegar a solucionarlas se ha ido optimizando el algoritmo y la heurística pagoda mediante el estudio de ambos en las páginas referenciadas anteriormente y nuestra propia experimentación, es decir, mediante ensayo y error.</w:t>
+      </w:r>
+    </w:p>
+    <w:p>
+      <w:pPr>
+        <w:pStyle w:val="Textbody"/>
+        <w:rPr>
+          <w:lang w:val="es-ES"/>
+        </w:rPr>
+      </w:pPr>
+    </w:p>
+    <w:p>
+      <w:pPr>
+        <w:pStyle w:val="Textbody"/>
         <w:jc w:val="center"/>
         <w:rPr>
           <w:lang w:val="es-ES"/>
@@ -1092,28 +1254,25 @@
       </w:pPr>
       <w:r>
         <w:rPr>
-          <w:noProof/>
           <w:lang w:val="es-ES"/>
         </w:rPr>
         <w:drawing>
-          <wp:inline distT="0" distB="0" distL="0" distR="0" wp14:anchorId="696508BE" wp14:editId="640D59E2">
-            <wp:extent cx="2531882" cy="1582552"/>
-            <wp:effectExtent l="0" t="0" r="1768" b="0"/>
-            <wp:docPr id="1572054954" name="Image1"/>
-            <wp:cNvGraphicFramePr/>
+          <wp:inline distT="0" distB="0" distL="0" distR="0" wp14:anchorId="3E97585C" wp14:editId="2360B4E1">
+            <wp:extent cx="3094355" cy="703580"/>
+            <wp:effectExtent l="0" t="0" r="0" b="1270"/>
+            <wp:docPr id="539791659" name="Imagen 1"/>
+            <wp:cNvGraphicFramePr>
+              <a:graphicFrameLocks xmlns:a="http://schemas.openxmlformats.org/drawingml/2006/main" noChangeAspect="1"/>
+            </wp:cNvGraphicFramePr>
             <a:graphic xmlns:a="http://schemas.openxmlformats.org/drawingml/2006/main">
               <a:graphicData uri="http://schemas.openxmlformats.org/drawingml/2006/picture">
                 <pic:pic xmlns:pic="http://schemas.openxmlformats.org/drawingml/2006/picture">
                   <pic:nvPicPr>
-                    <pic:cNvPr id="0" name=""/>
+                    <pic:cNvPr id="539791659" name=""/>
                     <pic:cNvPicPr/>
                   </pic:nvPicPr>
                   <pic:blipFill>
-                    <a:blip r:embed="rId11">
-                      <a:lum/>
-                      <a:alphaModFix/>
-                    </a:blip>
-                    <a:srcRect/>
+                    <a:blip r:embed="rId10"/>
                     <a:stretch>
                       <a:fillRect/>
                     </a:stretch>
@@ -1121,15 +1280,11 @@
                   <pic:spPr>
                     <a:xfrm>
                       <a:off x="0" y="0"/>
-                      <a:ext cx="2531882" cy="1582552"/>
+                      <a:ext cx="3094355" cy="703580"/>
                     </a:xfrm>
                     <a:prstGeom prst="rect">
                       <a:avLst/>
                     </a:prstGeom>
-                    <a:ln>
-                      <a:noFill/>
-                      <a:prstDash/>
-                    </a:ln>
                   </pic:spPr>
                 </pic:pic>
               </a:graphicData>
@@ -1149,15 +1304,12 @@
           <w:lang w:val="es-ES"/>
         </w:rPr>
       </w:pPr>
-      <w:bookmarkStart w:id="0" w:name="_Ref509684450"/>
-      <w:r>
-        <w:rPr>
-          <w:lang w:val="es-ES"/>
-        </w:rPr>
-        <w:lastRenderedPageBreak/>
-        <w:t>Ejemplo de un pie de figura. Imagen con derechos Creative Commons</w:t>
-      </w:r>
-      <w:bookmarkEnd w:id="0"/>
+      <w:r>
+        <w:rPr>
+          <w:lang w:val="es-ES"/>
+        </w:rPr>
+        <w:t>Diferentes variantes del senku obsequiadas por las instrucciones, variante 1 y 5 erradas.</w:t>
+      </w:r>
     </w:p>
     <w:p>
       <w:pPr>
@@ -1168,77 +1320,6 @@
       </w:pPr>
       <w:r>
         <w:rPr>
-          <w:lang w:val="es-ES"/>
-        </w:rPr>
-        <w:t>A continuación, un ejemplo de uso de listas numeradas:</w:t>
-      </w:r>
-    </w:p>
-    <w:p>
-      <w:pPr>
-        <w:pStyle w:val="Heading3"/>
-        <w:rPr>
-          <w:lang w:val="es-ES"/>
-        </w:rPr>
-      </w:pPr>
-      <w:r>
-        <w:rPr>
-          <w:lang w:val="es-ES"/>
-        </w:rPr>
-        <w:t>Trabajos con dos alumnos: Poner nombre y apellidos completos de cada uno, y correos electrónicos de contacto (a ser posible de la Universidad de Sevilla). El orden de los alumnos se fijará por orden alfabético según los apellidos.</w:t>
-      </w:r>
-    </w:p>
-    <w:p>
-      <w:pPr>
-        <w:pStyle w:val="Heading3"/>
-        <w:rPr>
-          <w:lang w:val="es-ES"/>
-        </w:rPr>
-      </w:pPr>
-      <w:r>
-        <w:rPr>
-          <w:lang w:val="es-ES"/>
-        </w:rPr>
-        <w:t>Trabajo con un autor: Cambiar la cabecera de la siguiente manera</w:t>
-      </w:r>
-    </w:p>
-    <w:p>
-      <w:pPr>
-        <w:pStyle w:val="Heading4"/>
-        <w:rPr>
-          <w:lang w:val="es-ES"/>
-        </w:rPr>
-      </w:pPr>
-      <w:r>
-        <w:rPr>
-          <w:lang w:val="es-ES"/>
-        </w:rPr>
-        <w:t>Una sola columna: Sólo se debe especificar un alumno.</w:t>
-      </w:r>
-    </w:p>
-    <w:p>
-      <w:pPr>
-        <w:pStyle w:val="Heading4"/>
-        <w:rPr>
-          <w:lang w:val="es-ES"/>
-        </w:rPr>
-      </w:pPr>
-      <w:r>
-        <w:rPr>
-          <w:lang w:val="es-ES"/>
-        </w:rPr>
-        <w:t>Información a añadir: La misma que la especificada en el punto 1).</w:t>
-      </w:r>
-    </w:p>
-    <w:p>
-      <w:pPr>
-        <w:pStyle w:val="Textbody"/>
-        <w:rPr>
-          <w:lang w:val="es-ES"/>
-        </w:rPr>
-      </w:pPr>
-      <w:r>
-        <w:rPr>
-          <w:noProof/>
           <w:lang w:val="es-ES"/>
         </w:rPr>
         <mc:AlternateContent>
@@ -1481,19 +1562,15 @@
                               <w:jc w:val="left"/>
                               <w:rPr>
                                 <w:sz w:val="18"/>
+                                <w:lang w:val="es-ES"/>
                               </w:rPr>
                             </w:pPr>
                             <w:r>
                               <w:rPr>
                                 <w:sz w:val="18"/>
-                              </w:rPr>
-                              <w:t xml:space="preserve">       P = List</w:t>
-                            </w:r>
-                            <w:r>
-                              <w:rPr>
-                                <w:sz w:val="18"/>
-                              </w:rPr>
-                              <w:t>[]</w:t>
+                                <w:lang w:val="es-ES"/>
+                              </w:rPr>
+                              <w:t xml:space="preserve">       P = List[]</w:t>
                             </w:r>
                           </w:p>
                           <w:p>
@@ -1502,49 +1579,15 @@
                               <w:jc w:val="left"/>
                               <w:rPr>
                                 <w:sz w:val="18"/>
+                                <w:lang w:val="es-ES"/>
                               </w:rPr>
                             </w:pPr>
                             <w:r>
                               <w:rPr>
                                 <w:sz w:val="18"/>
-                              </w:rPr>
-                              <w:t xml:space="preserve">       </w:t>
-                            </w:r>
-                            <w:r>
-                              <w:rPr>
-                                <w:sz w:val="18"/>
-                              </w:rPr>
-                              <w:t xml:space="preserve">B = </w:t>
-                            </w:r>
-                            <w:r>
-                              <w:rPr>
-                                <w:sz w:val="18"/>
-                              </w:rPr>
-                              <w:t>List [</w:t>
-                            </w:r>
-                            <w:r>
-                              <w:rPr>
-                                <w:sz w:val="18"/>
-                              </w:rPr>
-                              <w:t>Set(E,</w:t>
-                            </w:r>
-                            <w:r>
-                              <w:rPr>
-                                <w:sz w:val="18"/>
-                              </w:rPr>
-                              <w:t>P</w:t>
-                            </w:r>
-                            <w:r>
-                              <w:rPr>
-                                <w:sz w:val="18"/>
-                              </w:rPr>
-                              <w:t>)</w:t>
-                            </w:r>
-                            <w:r>
-                              <w:rPr>
-                                <w:sz w:val="18"/>
-                              </w:rPr>
-                              <w:t>]</w:t>
+                                <w:lang w:val="es-ES"/>
+                              </w:rPr>
+                              <w:t xml:space="preserve">       B = List [Set(E,P)]</w:t>
                             </w:r>
                           </w:p>
                           <w:p>
@@ -1561,14 +1604,7 @@
                                 <w:sz w:val="18"/>
                                 <w:lang w:val="es-ES"/>
                               </w:rPr>
-                              <w:t xml:space="preserve">      </w:t>
-                            </w:r>
-                            <w:r>
-                              <w:rPr>
-                                <w:sz w:val="18"/>
-                                <w:lang w:val="es-ES"/>
-                              </w:rPr>
-                              <w:t xml:space="preserve"> Mientras B no esté vacío:</w:t>
+                              <w:t xml:space="preserve">       Mientras B no esté vacío:</w:t>
                             </w:r>
                           </w:p>
                           <w:p>
@@ -1603,7 +1639,22 @@
                                 <w:lang w:val="es-ES"/>
                               </w:rPr>
                               <w:tab/>
-                              <w:t>for(estado e</w:t>
+                            </w:r>
+                            <w:proofErr w:type="spellStart"/>
+                            <w:r>
+                              <w:rPr>
+                                <w:sz w:val="18"/>
+                                <w:lang w:val="es-ES"/>
+                              </w:rPr>
+                              <w:t>for</w:t>
+                            </w:r>
+                            <w:proofErr w:type="spellEnd"/>
+                            <w:r>
+                              <w:rPr>
+                                <w:sz w:val="18"/>
+                                <w:lang w:val="es-ES"/>
+                              </w:rPr>
+                              <w:t>(estado e</w:t>
                             </w:r>
                             <w:r>
                               <w:rPr>
@@ -1659,7 +1710,39 @@
                                 <w:lang w:val="es-ES"/>
                               </w:rPr>
                               <w:tab/>
-                              <w:t xml:space="preserve">     for(mov in MP):</w:t>
+                              <w:t xml:space="preserve">     </w:t>
+                            </w:r>
+                            <w:proofErr w:type="spellStart"/>
+                            <w:r>
+                              <w:rPr>
+                                <w:sz w:val="18"/>
+                                <w:lang w:val="es-ES"/>
+                              </w:rPr>
+                              <w:t>for</w:t>
+                            </w:r>
+                            <w:proofErr w:type="spellEnd"/>
+                            <w:r>
+                              <w:rPr>
+                                <w:sz w:val="18"/>
+                                <w:lang w:val="es-ES"/>
+                              </w:rPr>
+                              <w:t>(</w:t>
+                            </w:r>
+                            <w:proofErr w:type="spellStart"/>
+                            <w:r>
+                              <w:rPr>
+                                <w:sz w:val="18"/>
+                                <w:lang w:val="es-ES"/>
+                              </w:rPr>
+                              <w:t>mov</w:t>
+                            </w:r>
+                            <w:proofErr w:type="spellEnd"/>
+                            <w:r>
+                              <w:rPr>
+                                <w:sz w:val="18"/>
+                                <w:lang w:val="es-ES"/>
+                              </w:rPr>
+                              <w:t xml:space="preserve"> in MP):</w:t>
                             </w:r>
                           </w:p>
                           <w:p>
@@ -1677,7 +1760,55 @@
                                 <w:lang w:val="es-ES"/>
                               </w:rPr>
                               <w:tab/>
-                              <w:t xml:space="preserve">          nuevo_e = aplicar_mov(e, mov)</w:t>
+                              <w:t xml:space="preserve">          </w:t>
+                            </w:r>
+                            <w:proofErr w:type="spellStart"/>
+                            <w:r>
+                              <w:rPr>
+                                <w:sz w:val="18"/>
+                                <w:lang w:val="es-ES"/>
+                              </w:rPr>
+                              <w:t>nuevo_e</w:t>
+                            </w:r>
+                            <w:proofErr w:type="spellEnd"/>
+                            <w:r>
+                              <w:rPr>
+                                <w:sz w:val="18"/>
+                                <w:lang w:val="es-ES"/>
+                              </w:rPr>
+                              <w:t xml:space="preserve"> = </w:t>
+                            </w:r>
+                            <w:proofErr w:type="spellStart"/>
+                            <w:r>
+                              <w:rPr>
+                                <w:sz w:val="18"/>
+                                <w:lang w:val="es-ES"/>
+                              </w:rPr>
+                              <w:t>aplicar_mov</w:t>
+                            </w:r>
+                            <w:proofErr w:type="spellEnd"/>
+                            <w:r>
+                              <w:rPr>
+                                <w:sz w:val="18"/>
+                                <w:lang w:val="es-ES"/>
+                              </w:rPr>
+                              <w:t xml:space="preserve">(e, </w:t>
+                            </w:r>
+                            <w:proofErr w:type="spellStart"/>
+                            <w:r>
+                              <w:rPr>
+                                <w:sz w:val="18"/>
+                                <w:lang w:val="es-ES"/>
+                              </w:rPr>
+                              <w:t>mov</w:t>
+                            </w:r>
+                            <w:proofErr w:type="spellEnd"/>
+                            <w:r>
+                              <w:rPr>
+                                <w:sz w:val="18"/>
+                                <w:lang w:val="es-ES"/>
+                              </w:rPr>
+                              <w:t>)</w:t>
                             </w:r>
                           </w:p>
                           <w:p>
@@ -1695,7 +1826,55 @@
                                 <w:lang w:val="es-ES"/>
                               </w:rPr>
                               <w:tab/>
-                              <w:t xml:space="preserve">          nuevo_p = p.add(mov)</w:t>
+                              <w:t xml:space="preserve">          </w:t>
+                            </w:r>
+                            <w:proofErr w:type="spellStart"/>
+                            <w:r>
+                              <w:rPr>
+                                <w:sz w:val="18"/>
+                                <w:lang w:val="es-ES"/>
+                              </w:rPr>
+                              <w:t>nuevo_p</w:t>
+                            </w:r>
+                            <w:proofErr w:type="spellEnd"/>
+                            <w:r>
+                              <w:rPr>
+                                <w:sz w:val="18"/>
+                                <w:lang w:val="es-ES"/>
+                              </w:rPr>
+                              <w:t xml:space="preserve"> = </w:t>
+                            </w:r>
+                            <w:proofErr w:type="spellStart"/>
+                            <w:r>
+                              <w:rPr>
+                                <w:sz w:val="18"/>
+                                <w:lang w:val="es-ES"/>
+                              </w:rPr>
+                              <w:t>p.add</w:t>
+                            </w:r>
+                            <w:proofErr w:type="spellEnd"/>
+                            <w:r>
+                              <w:rPr>
+                                <w:sz w:val="18"/>
+                                <w:lang w:val="es-ES"/>
+                              </w:rPr>
+                              <w:t>(</w:t>
+                            </w:r>
+                            <w:proofErr w:type="spellStart"/>
+                            <w:r>
+                              <w:rPr>
+                                <w:sz w:val="18"/>
+                                <w:lang w:val="es-ES"/>
+                              </w:rPr>
+                              <w:t>mov</w:t>
+                            </w:r>
+                            <w:proofErr w:type="spellEnd"/>
+                            <w:r>
+                              <w:rPr>
+                                <w:sz w:val="18"/>
+                                <w:lang w:val="es-ES"/>
+                              </w:rPr>
+                              <w:t>)</w:t>
                             </w:r>
                           </w:p>
                           <w:p>
@@ -1713,7 +1892,55 @@
                                 <w:lang w:val="es-ES"/>
                               </w:rPr>
                               <w:tab/>
-                              <w:t xml:space="preserve">          if(esSolucion(nuevo_e)):</w:t>
+                              <w:t xml:space="preserve">          </w:t>
+                            </w:r>
+                            <w:proofErr w:type="spellStart"/>
+                            <w:r>
+                              <w:rPr>
+                                <w:sz w:val="18"/>
+                                <w:lang w:val="es-ES"/>
+                              </w:rPr>
+                              <w:t>if</w:t>
+                            </w:r>
+                            <w:proofErr w:type="spellEnd"/>
+                            <w:r>
+                              <w:rPr>
+                                <w:sz w:val="18"/>
+                                <w:lang w:val="es-ES"/>
+                              </w:rPr>
+                              <w:t>(</w:t>
+                            </w:r>
+                            <w:proofErr w:type="spellStart"/>
+                            <w:r>
+                              <w:rPr>
+                                <w:sz w:val="18"/>
+                                <w:lang w:val="es-ES"/>
+                              </w:rPr>
+                              <w:t>esSolucion</w:t>
+                            </w:r>
+                            <w:proofErr w:type="spellEnd"/>
+                            <w:r>
+                              <w:rPr>
+                                <w:sz w:val="18"/>
+                                <w:lang w:val="es-ES"/>
+                              </w:rPr>
+                              <w:t>(</w:t>
+                            </w:r>
+                            <w:proofErr w:type="spellStart"/>
+                            <w:r>
+                              <w:rPr>
+                                <w:sz w:val="18"/>
+                                <w:lang w:val="es-ES"/>
+                              </w:rPr>
+                              <w:t>nuevo_e</w:t>
+                            </w:r>
+                            <w:proofErr w:type="spellEnd"/>
+                            <w:r>
+                              <w:rPr>
+                                <w:sz w:val="18"/>
+                                <w:lang w:val="es-ES"/>
+                              </w:rPr>
+                              <w:t>)):</w:t>
                             </w:r>
                           </w:p>
                           <w:p>
@@ -1738,7 +1965,81 @@
                                 <w:lang w:val="es-ES"/>
                               </w:rPr>
                               <w:tab/>
-                              <w:t>return nuevo_p</w:t>
+                            </w:r>
+                            <w:proofErr w:type="spellStart"/>
+                            <w:r>
+                              <w:rPr>
+                                <w:sz w:val="18"/>
+                                <w:lang w:val="es-ES"/>
+                              </w:rPr>
+                              <w:t>return</w:t>
+                            </w:r>
+                            <w:proofErr w:type="spellEnd"/>
+                            <w:r>
+                              <w:rPr>
+                                <w:sz w:val="18"/>
+                                <w:lang w:val="es-ES"/>
+                              </w:rPr>
+                              <w:t xml:space="preserve"> </w:t>
+                            </w:r>
+                            <w:proofErr w:type="spellStart"/>
+                            <w:r>
+                              <w:rPr>
+                                <w:sz w:val="18"/>
+                                <w:lang w:val="es-ES"/>
+                              </w:rPr>
+                              <w:t>nuevo_p</w:t>
+                            </w:r>
+                            <w:proofErr w:type="spellEnd"/>
+                          </w:p>
+                          <w:p>
+                            <w:pPr>
+                              <w:pStyle w:val="Standard"/>
+                              <w:jc w:val="left"/>
+                              <w:rPr>
+                                <w:sz w:val="18"/>
+                                <w:lang w:val="es-ES"/>
+                              </w:rPr>
+                            </w:pPr>
+                            <w:r>
+                              <w:rPr>
+                                <w:sz w:val="18"/>
+                                <w:lang w:val="es-ES"/>
+                              </w:rPr>
+                              <w:tab/>
+                              <w:t xml:space="preserve">          h  = </w:t>
+                            </w:r>
+                            <w:proofErr w:type="spellStart"/>
+                            <w:r>
+                              <w:rPr>
+                                <w:sz w:val="18"/>
+                                <w:lang w:val="es-ES"/>
+                              </w:rPr>
+                              <w:t>aplicar_heuristica</w:t>
+                            </w:r>
+                            <w:proofErr w:type="spellEnd"/>
+                            <w:r>
+                              <w:rPr>
+                                <w:sz w:val="18"/>
+                                <w:lang w:val="es-ES"/>
+                              </w:rPr>
+                              <w:t>(</w:t>
+                            </w:r>
+                            <w:proofErr w:type="spellStart"/>
+                            <w:r>
+                              <w:rPr>
+                                <w:sz w:val="18"/>
+                                <w:lang w:val="es-ES"/>
+                              </w:rPr>
+                              <w:t>nuevo_e</w:t>
+                            </w:r>
+                            <w:proofErr w:type="spellEnd"/>
+                            <w:r>
+                              <w:rPr>
+                                <w:sz w:val="18"/>
+                                <w:lang w:val="es-ES"/>
+                              </w:rPr>
+                              <w:t>)</w:t>
                             </w:r>
                           </w:p>
                           <w:p>
@@ -1756,7 +2057,55 @@
                                 <w:lang w:val="es-ES"/>
                               </w:rPr>
                               <w:tab/>
-                              <w:t xml:space="preserve">          h  = aplicar_heuristica(nuevo_e)</w:t>
+                              <w:t xml:space="preserve">          </w:t>
+                            </w:r>
+                            <w:proofErr w:type="spellStart"/>
+                            <w:r>
+                              <w:rPr>
+                                <w:sz w:val="18"/>
+                                <w:lang w:val="es-ES"/>
+                              </w:rPr>
+                              <w:t>candidatos.add</w:t>
+                            </w:r>
+                            <w:proofErr w:type="spellEnd"/>
+                            <w:r>
+                              <w:rPr>
+                                <w:sz w:val="18"/>
+                                <w:lang w:val="es-ES"/>
+                              </w:rPr>
+                              <w:t>( (</w:t>
+                            </w:r>
+                            <w:proofErr w:type="spellStart"/>
+                            <w:r>
+                              <w:rPr>
+                                <w:sz w:val="18"/>
+                                <w:lang w:val="es-ES"/>
+                              </w:rPr>
+                              <w:t>nuevo_e</w:t>
+                            </w:r>
+                            <w:proofErr w:type="spellEnd"/>
+                            <w:r>
+                              <w:rPr>
+                                <w:sz w:val="18"/>
+                                <w:lang w:val="es-ES"/>
+                              </w:rPr>
+                              <w:t xml:space="preserve">, h, </w:t>
+                            </w:r>
+                            <w:proofErr w:type="spellStart"/>
+                            <w:r>
+                              <w:rPr>
+                                <w:sz w:val="18"/>
+                                <w:lang w:val="es-ES"/>
+                              </w:rPr>
+                              <w:t>nuevo_p</w:t>
+                            </w:r>
+                            <w:proofErr w:type="spellEnd"/>
+                            <w:r>
+                              <w:rPr>
+                                <w:sz w:val="18"/>
+                                <w:lang w:val="es-ES"/>
+                              </w:rPr>
+                              <w:t>) )</w:t>
                             </w:r>
                           </w:p>
                           <w:p>
@@ -1774,7 +2123,38 @@
                                 <w:lang w:val="es-ES"/>
                               </w:rPr>
                               <w:tab/>
-                              <w:t xml:space="preserve">          candidatos.add( (nuevo_e, h, nuevo_p) )</w:t>
+                            </w:r>
+                            <w:proofErr w:type="spellStart"/>
+                            <w:r>
+                              <w:rPr>
+                                <w:sz w:val="18"/>
+                                <w:lang w:val="es-ES"/>
+                              </w:rPr>
+                              <w:t>candidatos.sort</w:t>
+                            </w:r>
+                            <w:proofErr w:type="spellEnd"/>
+                            <w:r>
+                              <w:rPr>
+                                <w:sz w:val="18"/>
+                                <w:lang w:val="es-ES"/>
+                              </w:rPr>
+                              <w:t>(</w:t>
+                            </w:r>
+                            <w:proofErr w:type="spellStart"/>
+                            <w:r>
+                              <w:rPr>
+                                <w:sz w:val="18"/>
+                                <w:lang w:val="es-ES"/>
+                              </w:rPr>
+                              <w:t>key</w:t>
+                            </w:r>
+                            <w:proofErr w:type="spellEnd"/>
+                            <w:r>
+                              <w:rPr>
+                                <w:sz w:val="18"/>
+                                <w:lang w:val="es-ES"/>
+                              </w:rPr>
+                              <w:t>=h)</w:t>
                             </w:r>
                           </w:p>
                           <w:p>
@@ -1792,7 +2172,7 @@
                                 <w:lang w:val="es-ES"/>
                               </w:rPr>
                               <w:tab/>
-                              <w:t>candidatos.sort(key=h)</w:t>
+                              <w:t>beam = candidatos[:β]</w:t>
                             </w:r>
                           </w:p>
                           <w:p>
@@ -1809,40 +2189,33 @@
                                 <w:sz w:val="18"/>
                                 <w:lang w:val="es-ES"/>
                               </w:rPr>
-                              <w:tab/>
-                              <w:t>beam = candidatos[:</w:t>
+                              <w:t xml:space="preserve">       </w:t>
                             </w:r>
+                            <w:proofErr w:type="spellStart"/>
                             <w:r>
                               <w:rPr>
                                 <w:sz w:val="18"/>
                                 <w:lang w:val="es-ES"/>
                               </w:rPr>
-                              <w:t>β</w:t>
+                              <w:t>return</w:t>
                             </w:r>
+                            <w:proofErr w:type="spellEnd"/>
                             <w:r>
                               <w:rPr>
                                 <w:sz w:val="18"/>
                                 <w:lang w:val="es-ES"/>
                               </w:rPr>
-                              <w:t>]</w:t>
+                              <w:t xml:space="preserve"> </w:t>
                             </w:r>
-                          </w:p>
-                          <w:p>
-                            <w:pPr>
-                              <w:pStyle w:val="Standard"/>
-                              <w:jc w:val="left"/>
-                              <w:rPr>
-                                <w:sz w:val="18"/>
-                                <w:lang w:val="es-ES"/>
-                              </w:rPr>
-                            </w:pPr>
+                            <w:proofErr w:type="spellStart"/>
                             <w:r>
                               <w:rPr>
                                 <w:sz w:val="18"/>
                                 <w:lang w:val="es-ES"/>
                               </w:rPr>
-                              <w:t xml:space="preserve">       return None</w:t>
+                              <w:t>None</w:t>
                             </w:r>
+                            <w:proofErr w:type="spellEnd"/>
                           </w:p>
                         </w:txbxContent>
                       </wps:txbx>
@@ -2070,19 +2443,15 @@
                         <w:jc w:val="left"/>
                         <w:rPr>
                           <w:sz w:val="18"/>
+                          <w:lang w:val="es-ES"/>
                         </w:rPr>
                       </w:pPr>
                       <w:r>
                         <w:rPr>
                           <w:sz w:val="18"/>
-                        </w:rPr>
-                        <w:t xml:space="preserve">       P = List</w:t>
-                      </w:r>
-                      <w:r>
-                        <w:rPr>
-                          <w:sz w:val="18"/>
-                        </w:rPr>
-                        <w:t>[]</w:t>
+                          <w:lang w:val="es-ES"/>
+                        </w:rPr>
+                        <w:t xml:space="preserve">       P = List[]</w:t>
                       </w:r>
                     </w:p>
                     <w:p>
@@ -2091,49 +2460,15 @@
                         <w:jc w:val="left"/>
                         <w:rPr>
                           <w:sz w:val="18"/>
+                          <w:lang w:val="es-ES"/>
                         </w:rPr>
                       </w:pPr>
                       <w:r>
                         <w:rPr>
                           <w:sz w:val="18"/>
-                        </w:rPr>
-                        <w:t xml:space="preserve">       </w:t>
-                      </w:r>
-                      <w:r>
-                        <w:rPr>
-                          <w:sz w:val="18"/>
-                        </w:rPr>
-                        <w:t xml:space="preserve">B = </w:t>
-                      </w:r>
-                      <w:r>
-                        <w:rPr>
-                          <w:sz w:val="18"/>
-                        </w:rPr>
-                        <w:t>List [</w:t>
-                      </w:r>
-                      <w:r>
-                        <w:rPr>
-                          <w:sz w:val="18"/>
-                        </w:rPr>
-                        <w:t>Set(E,</w:t>
-                      </w:r>
-                      <w:r>
-                        <w:rPr>
-                          <w:sz w:val="18"/>
-                        </w:rPr>
-                        <w:t>P</w:t>
-                      </w:r>
-                      <w:r>
-                        <w:rPr>
-                          <w:sz w:val="18"/>
-                        </w:rPr>
-                        <w:t>)</w:t>
-                      </w:r>
-                      <w:r>
-                        <w:rPr>
-                          <w:sz w:val="18"/>
-                        </w:rPr>
-                        <w:t>]</w:t>
+                          <w:lang w:val="es-ES"/>
+                        </w:rPr>
+                        <w:t xml:space="preserve">       B = List [Set(E,P)]</w:t>
                       </w:r>
                     </w:p>
                     <w:p>
@@ -2150,14 +2485,7 @@
                           <w:sz w:val="18"/>
                           <w:lang w:val="es-ES"/>
                         </w:rPr>
-                        <w:t xml:space="preserve">      </w:t>
-                      </w:r>
-                      <w:r>
-                        <w:rPr>
-                          <w:sz w:val="18"/>
-                          <w:lang w:val="es-ES"/>
-                        </w:rPr>
-                        <w:t xml:space="preserve"> Mientras B no esté vacío:</w:t>
+                        <w:t xml:space="preserve">       Mientras B no esté vacío:</w:t>
                       </w:r>
                     </w:p>
                     <w:p>
@@ -2192,7 +2520,22 @@
                           <w:lang w:val="es-ES"/>
                         </w:rPr>
                         <w:tab/>
-                        <w:t>for(estado e</w:t>
+                      </w:r>
+                      <w:proofErr w:type="spellStart"/>
+                      <w:r>
+                        <w:rPr>
+                          <w:sz w:val="18"/>
+                          <w:lang w:val="es-ES"/>
+                        </w:rPr>
+                        <w:t>for</w:t>
+                      </w:r>
+                      <w:proofErr w:type="spellEnd"/>
+                      <w:r>
+                        <w:rPr>
+                          <w:sz w:val="18"/>
+                          <w:lang w:val="es-ES"/>
+                        </w:rPr>
+                        <w:t>(estado e</w:t>
                       </w:r>
                       <w:r>
                         <w:rPr>
@@ -2248,7 +2591,39 @@
                           <w:lang w:val="es-ES"/>
                         </w:rPr>
                         <w:tab/>
-                        <w:t xml:space="preserve">     for(mov in MP):</w:t>
+                        <w:t xml:space="preserve">     </w:t>
+                      </w:r>
+                      <w:proofErr w:type="spellStart"/>
+                      <w:r>
+                        <w:rPr>
+                          <w:sz w:val="18"/>
+                          <w:lang w:val="es-ES"/>
+                        </w:rPr>
+                        <w:t>for</w:t>
+                      </w:r>
+                      <w:proofErr w:type="spellEnd"/>
+                      <w:r>
+                        <w:rPr>
+                          <w:sz w:val="18"/>
+                          <w:lang w:val="es-ES"/>
+                        </w:rPr>
+                        <w:t>(</w:t>
+                      </w:r>
+                      <w:proofErr w:type="spellStart"/>
+                      <w:r>
+                        <w:rPr>
+                          <w:sz w:val="18"/>
+                          <w:lang w:val="es-ES"/>
+                        </w:rPr>
+                        <w:t>mov</w:t>
+                      </w:r>
+                      <w:proofErr w:type="spellEnd"/>
+                      <w:r>
+                        <w:rPr>
+                          <w:sz w:val="18"/>
+                          <w:lang w:val="es-ES"/>
+                        </w:rPr>
+                        <w:t xml:space="preserve"> in MP):</w:t>
                       </w:r>
                     </w:p>
                     <w:p>
@@ -2266,7 +2641,55 @@
                           <w:lang w:val="es-ES"/>
                         </w:rPr>
                         <w:tab/>
-                        <w:t xml:space="preserve">          nuevo_e = aplicar_mov(e, mov)</w:t>
+                        <w:t xml:space="preserve">          </w:t>
+                      </w:r>
+                      <w:proofErr w:type="spellStart"/>
+                      <w:r>
+                        <w:rPr>
+                          <w:sz w:val="18"/>
+                          <w:lang w:val="es-ES"/>
+                        </w:rPr>
+                        <w:t>nuevo_e</w:t>
+                      </w:r>
+                      <w:proofErr w:type="spellEnd"/>
+                      <w:r>
+                        <w:rPr>
+                          <w:sz w:val="18"/>
+                          <w:lang w:val="es-ES"/>
+                        </w:rPr>
+                        <w:t xml:space="preserve"> = </w:t>
+                      </w:r>
+                      <w:proofErr w:type="spellStart"/>
+                      <w:r>
+                        <w:rPr>
+                          <w:sz w:val="18"/>
+                          <w:lang w:val="es-ES"/>
+                        </w:rPr>
+                        <w:t>aplicar_mov</w:t>
+                      </w:r>
+                      <w:proofErr w:type="spellEnd"/>
+                      <w:r>
+                        <w:rPr>
+                          <w:sz w:val="18"/>
+                          <w:lang w:val="es-ES"/>
+                        </w:rPr>
+                        <w:t xml:space="preserve">(e, </w:t>
+                      </w:r>
+                      <w:proofErr w:type="spellStart"/>
+                      <w:r>
+                        <w:rPr>
+                          <w:sz w:val="18"/>
+                          <w:lang w:val="es-ES"/>
+                        </w:rPr>
+                        <w:t>mov</w:t>
+                      </w:r>
+                      <w:proofErr w:type="spellEnd"/>
+                      <w:r>
+                        <w:rPr>
+                          <w:sz w:val="18"/>
+                          <w:lang w:val="es-ES"/>
+                        </w:rPr>
+                        <w:t>)</w:t>
                       </w:r>
                     </w:p>
                     <w:p>
@@ -2284,7 +2707,55 @@
                           <w:lang w:val="es-ES"/>
                         </w:rPr>
                         <w:tab/>
-                        <w:t xml:space="preserve">          nuevo_p = p.add(mov)</w:t>
+                        <w:t xml:space="preserve">          </w:t>
+                      </w:r>
+                      <w:proofErr w:type="spellStart"/>
+                      <w:r>
+                        <w:rPr>
+                          <w:sz w:val="18"/>
+                          <w:lang w:val="es-ES"/>
+                        </w:rPr>
+                        <w:t>nuevo_p</w:t>
+                      </w:r>
+                      <w:proofErr w:type="spellEnd"/>
+                      <w:r>
+                        <w:rPr>
+                          <w:sz w:val="18"/>
+                          <w:lang w:val="es-ES"/>
+                        </w:rPr>
+                        <w:t xml:space="preserve"> = </w:t>
+                      </w:r>
+                      <w:proofErr w:type="spellStart"/>
+                      <w:r>
+                        <w:rPr>
+                          <w:sz w:val="18"/>
+                          <w:lang w:val="es-ES"/>
+                        </w:rPr>
+                        <w:t>p.add</w:t>
+                      </w:r>
+                      <w:proofErr w:type="spellEnd"/>
+                      <w:r>
+                        <w:rPr>
+                          <w:sz w:val="18"/>
+                          <w:lang w:val="es-ES"/>
+                        </w:rPr>
+                        <w:t>(</w:t>
+                      </w:r>
+                      <w:proofErr w:type="spellStart"/>
+                      <w:r>
+                        <w:rPr>
+                          <w:sz w:val="18"/>
+                          <w:lang w:val="es-ES"/>
+                        </w:rPr>
+                        <w:t>mov</w:t>
+                      </w:r>
+                      <w:proofErr w:type="spellEnd"/>
+                      <w:r>
+                        <w:rPr>
+                          <w:sz w:val="18"/>
+                          <w:lang w:val="es-ES"/>
+                        </w:rPr>
+                        <w:t>)</w:t>
                       </w:r>
                     </w:p>
                     <w:p>
@@ -2302,7 +2773,55 @@
                           <w:lang w:val="es-ES"/>
                         </w:rPr>
                         <w:tab/>
-                        <w:t xml:space="preserve">          if(esSolucion(nuevo_e)):</w:t>
+                        <w:t xml:space="preserve">          </w:t>
+                      </w:r>
+                      <w:proofErr w:type="spellStart"/>
+                      <w:r>
+                        <w:rPr>
+                          <w:sz w:val="18"/>
+                          <w:lang w:val="es-ES"/>
+                        </w:rPr>
+                        <w:t>if</w:t>
+                      </w:r>
+                      <w:proofErr w:type="spellEnd"/>
+                      <w:r>
+                        <w:rPr>
+                          <w:sz w:val="18"/>
+                          <w:lang w:val="es-ES"/>
+                        </w:rPr>
+                        <w:t>(</w:t>
+                      </w:r>
+                      <w:proofErr w:type="spellStart"/>
+                      <w:r>
+                        <w:rPr>
+                          <w:sz w:val="18"/>
+                          <w:lang w:val="es-ES"/>
+                        </w:rPr>
+                        <w:t>esSolucion</w:t>
+                      </w:r>
+                      <w:proofErr w:type="spellEnd"/>
+                      <w:r>
+                        <w:rPr>
+                          <w:sz w:val="18"/>
+                          <w:lang w:val="es-ES"/>
+                        </w:rPr>
+                        <w:t>(</w:t>
+                      </w:r>
+                      <w:proofErr w:type="spellStart"/>
+                      <w:r>
+                        <w:rPr>
+                          <w:sz w:val="18"/>
+                          <w:lang w:val="es-ES"/>
+                        </w:rPr>
+                        <w:t>nuevo_e</w:t>
+                      </w:r>
+                      <w:proofErr w:type="spellEnd"/>
+                      <w:r>
+                        <w:rPr>
+                          <w:sz w:val="18"/>
+                          <w:lang w:val="es-ES"/>
+                        </w:rPr>
+                        <w:t>)):</w:t>
                       </w:r>
                     </w:p>
                     <w:p>
@@ -2327,7 +2846,81 @@
                           <w:lang w:val="es-ES"/>
                         </w:rPr>
                         <w:tab/>
-                        <w:t>return nuevo_p</w:t>
+                      </w:r>
+                      <w:proofErr w:type="spellStart"/>
+                      <w:r>
+                        <w:rPr>
+                          <w:sz w:val="18"/>
+                          <w:lang w:val="es-ES"/>
+                        </w:rPr>
+                        <w:t>return</w:t>
+                      </w:r>
+                      <w:proofErr w:type="spellEnd"/>
+                      <w:r>
+                        <w:rPr>
+                          <w:sz w:val="18"/>
+                          <w:lang w:val="es-ES"/>
+                        </w:rPr>
+                        <w:t xml:space="preserve"> </w:t>
+                      </w:r>
+                      <w:proofErr w:type="spellStart"/>
+                      <w:r>
+                        <w:rPr>
+                          <w:sz w:val="18"/>
+                          <w:lang w:val="es-ES"/>
+                        </w:rPr>
+                        <w:t>nuevo_p</w:t>
+                      </w:r>
+                      <w:proofErr w:type="spellEnd"/>
+                    </w:p>
+                    <w:p>
+                      <w:pPr>
+                        <w:pStyle w:val="Standard"/>
+                        <w:jc w:val="left"/>
+                        <w:rPr>
+                          <w:sz w:val="18"/>
+                          <w:lang w:val="es-ES"/>
+                        </w:rPr>
+                      </w:pPr>
+                      <w:r>
+                        <w:rPr>
+                          <w:sz w:val="18"/>
+                          <w:lang w:val="es-ES"/>
+                        </w:rPr>
+                        <w:tab/>
+                        <w:t xml:space="preserve">          h  = </w:t>
+                      </w:r>
+                      <w:proofErr w:type="spellStart"/>
+                      <w:r>
+                        <w:rPr>
+                          <w:sz w:val="18"/>
+                          <w:lang w:val="es-ES"/>
+                        </w:rPr>
+                        <w:t>aplicar_heuristica</w:t>
+                      </w:r>
+                      <w:proofErr w:type="spellEnd"/>
+                      <w:r>
+                        <w:rPr>
+                          <w:sz w:val="18"/>
+                          <w:lang w:val="es-ES"/>
+                        </w:rPr>
+                        <w:t>(</w:t>
+                      </w:r>
+                      <w:proofErr w:type="spellStart"/>
+                      <w:r>
+                        <w:rPr>
+                          <w:sz w:val="18"/>
+                          <w:lang w:val="es-ES"/>
+                        </w:rPr>
+                        <w:t>nuevo_e</w:t>
+                      </w:r>
+                      <w:proofErr w:type="spellEnd"/>
+                      <w:r>
+                        <w:rPr>
+                          <w:sz w:val="18"/>
+                          <w:lang w:val="es-ES"/>
+                        </w:rPr>
+                        <w:t>)</w:t>
                       </w:r>
                     </w:p>
                     <w:p>
@@ -2345,7 +2938,55 @@
                           <w:lang w:val="es-ES"/>
                         </w:rPr>
                         <w:tab/>
-                        <w:t xml:space="preserve">          h  = aplicar_heuristica(nuevo_e)</w:t>
+                        <w:t xml:space="preserve">          </w:t>
+                      </w:r>
+                      <w:proofErr w:type="spellStart"/>
+                      <w:r>
+                        <w:rPr>
+                          <w:sz w:val="18"/>
+                          <w:lang w:val="es-ES"/>
+                        </w:rPr>
+                        <w:t>candidatos.add</w:t>
+                      </w:r>
+                      <w:proofErr w:type="spellEnd"/>
+                      <w:r>
+                        <w:rPr>
+                          <w:sz w:val="18"/>
+                          <w:lang w:val="es-ES"/>
+                        </w:rPr>
+                        <w:t>( (</w:t>
+                      </w:r>
+                      <w:proofErr w:type="spellStart"/>
+                      <w:r>
+                        <w:rPr>
+                          <w:sz w:val="18"/>
+                          <w:lang w:val="es-ES"/>
+                        </w:rPr>
+                        <w:t>nuevo_e</w:t>
+                      </w:r>
+                      <w:proofErr w:type="spellEnd"/>
+                      <w:r>
+                        <w:rPr>
+                          <w:sz w:val="18"/>
+                          <w:lang w:val="es-ES"/>
+                        </w:rPr>
+                        <w:t xml:space="preserve">, h, </w:t>
+                      </w:r>
+                      <w:proofErr w:type="spellStart"/>
+                      <w:r>
+                        <w:rPr>
+                          <w:sz w:val="18"/>
+                          <w:lang w:val="es-ES"/>
+                        </w:rPr>
+                        <w:t>nuevo_p</w:t>
+                      </w:r>
+                      <w:proofErr w:type="spellEnd"/>
+                      <w:r>
+                        <w:rPr>
+                          <w:sz w:val="18"/>
+                          <w:lang w:val="es-ES"/>
+                        </w:rPr>
+                        <w:t>) )</w:t>
                       </w:r>
                     </w:p>
                     <w:p>
@@ -2363,7 +3004,38 @@
                           <w:lang w:val="es-ES"/>
                         </w:rPr>
                         <w:tab/>
-                        <w:t xml:space="preserve">          candidatos.add( (nuevo_e, h, nuevo_p) )</w:t>
+                      </w:r>
+                      <w:proofErr w:type="spellStart"/>
+                      <w:r>
+                        <w:rPr>
+                          <w:sz w:val="18"/>
+                          <w:lang w:val="es-ES"/>
+                        </w:rPr>
+                        <w:t>candidatos.sort</w:t>
+                      </w:r>
+                      <w:proofErr w:type="spellEnd"/>
+                      <w:r>
+                        <w:rPr>
+                          <w:sz w:val="18"/>
+                          <w:lang w:val="es-ES"/>
+                        </w:rPr>
+                        <w:t>(</w:t>
+                      </w:r>
+                      <w:proofErr w:type="spellStart"/>
+                      <w:r>
+                        <w:rPr>
+                          <w:sz w:val="18"/>
+                          <w:lang w:val="es-ES"/>
+                        </w:rPr>
+                        <w:t>key</w:t>
+                      </w:r>
+                      <w:proofErr w:type="spellEnd"/>
+                      <w:r>
+                        <w:rPr>
+                          <w:sz w:val="18"/>
+                          <w:lang w:val="es-ES"/>
+                        </w:rPr>
+                        <w:t>=h)</w:t>
                       </w:r>
                     </w:p>
                     <w:p>
@@ -2381,7 +3053,7 @@
                           <w:lang w:val="es-ES"/>
                         </w:rPr>
                         <w:tab/>
-                        <w:t>candidatos.sort(key=h)</w:t>
+                        <w:t>beam = candidatos[:β]</w:t>
                       </w:r>
                     </w:p>
                     <w:p>
@@ -2398,40 +3070,33 @@
                           <w:sz w:val="18"/>
                           <w:lang w:val="es-ES"/>
                         </w:rPr>
-                        <w:tab/>
-                        <w:t>beam = candidatos[:</w:t>
+                        <w:t xml:space="preserve">       </w:t>
                       </w:r>
+                      <w:proofErr w:type="spellStart"/>
                       <w:r>
                         <w:rPr>
                           <w:sz w:val="18"/>
                           <w:lang w:val="es-ES"/>
                         </w:rPr>
-                        <w:t>β</w:t>
+                        <w:t>return</w:t>
                       </w:r>
+                      <w:proofErr w:type="spellEnd"/>
                       <w:r>
                         <w:rPr>
                           <w:sz w:val="18"/>
                           <w:lang w:val="es-ES"/>
                         </w:rPr>
-                        <w:t>]</w:t>
+                        <w:t xml:space="preserve"> </w:t>
                       </w:r>
-                    </w:p>
-                    <w:p>
-                      <w:pPr>
-                        <w:pStyle w:val="Standard"/>
-                        <w:jc w:val="left"/>
-                        <w:rPr>
-                          <w:sz w:val="18"/>
-                          <w:lang w:val="es-ES"/>
-                        </w:rPr>
-                      </w:pPr>
+                      <w:proofErr w:type="spellStart"/>
                       <w:r>
                         <w:rPr>
                           <w:sz w:val="18"/>
                           <w:lang w:val="es-ES"/>
                         </w:rPr>
-                        <w:t xml:space="preserve">       return None</w:t>
+                        <w:t>None</w:t>
                       </w:r>
+                      <w:proofErr w:type="spellEnd"/>
                     </w:p>
                   </w:txbxContent>
                 </v:textbox>
@@ -2505,8 +3170,44 @@
         <w:rPr>
           <w:lang w:val="es-ES"/>
         </w:rPr>
-        <w:t>Error: Reference source not found</w:t>
-      </w:r>
+        <w:t xml:space="preserve">Error: Reference </w:t>
+      </w:r>
+      <w:proofErr w:type="spellStart"/>
+      <w:r>
+        <w:rPr>
+          <w:lang w:val="es-ES"/>
+        </w:rPr>
+        <w:t>source</w:t>
+      </w:r>
+      <w:proofErr w:type="spellEnd"/>
+      <w:r>
+        <w:rPr>
+          <w:lang w:val="es-ES"/>
+        </w:rPr>
+        <w:t xml:space="preserve"> </w:t>
+      </w:r>
+      <w:proofErr w:type="spellStart"/>
+      <w:r>
+        <w:rPr>
+          <w:lang w:val="es-ES"/>
+        </w:rPr>
+        <w:t>not</w:t>
+      </w:r>
+      <w:proofErr w:type="spellEnd"/>
+      <w:r>
+        <w:rPr>
+          <w:lang w:val="es-ES"/>
+        </w:rPr>
+        <w:t xml:space="preserve"> </w:t>
+      </w:r>
+      <w:proofErr w:type="spellStart"/>
+      <w:r>
+        <w:rPr>
+          <w:lang w:val="es-ES"/>
+        </w:rPr>
+        <w:t>found</w:t>
+      </w:r>
+      <w:proofErr w:type="spellEnd"/>
       <w:r>
         <w:rPr>
           <w:lang w:val="es-ES"/>
@@ -2631,7 +3332,6 @@
       </w:pPr>
       <w:r>
         <w:rPr>
-          <w:noProof/>
           <w:lang w:val="es-ES"/>
         </w:rPr>
         <mc:AlternateContent>
@@ -2671,13 +3371,13 @@
                         <w:txbxContent>
                           <w:p>
                             <w:pPr>
-                              <w:pStyle w:val="Caption"/>
+                              <w:pStyle w:val="Descripcin"/>
                               <w:jc w:val="left"/>
                               <w:rPr>
                                 <w:lang w:val="es-ES"/>
                               </w:rPr>
                             </w:pPr>
-                            <w:bookmarkStart w:id="1" w:name="_Ref5096856281"/>
+                            <w:bookmarkStart w:id="0" w:name="_Ref5096856281"/>
                             <w:r>
                               <w:rPr>
                                 <w:b w:val="0"/>
@@ -2687,7 +3387,7 @@
                               </w:rPr>
                               <w:t>Pseudocódigo 1</w:t>
                             </w:r>
-                            <w:bookmarkEnd w:id="1"/>
+                            <w:bookmarkEnd w:id="0"/>
                             <w:r>
                               <w:rPr>
                                 <w:b w:val="0"/>
@@ -2695,8 +3395,19 @@
                                 <w:szCs w:val="16"/>
                                 <w:lang w:val="es-ES"/>
                               </w:rPr>
-                              <w:t>. Algoritmo de Mergesort</w:t>
+                              <w:t xml:space="preserve">. Algoritmo de </w:t>
                             </w:r>
+                            <w:proofErr w:type="spellStart"/>
+                            <w:r>
+                              <w:rPr>
+                                <w:b w:val="0"/>
+                                <w:sz w:val="16"/>
+                                <w:szCs w:val="16"/>
+                                <w:lang w:val="es-ES"/>
+                              </w:rPr>
+                              <w:t>Mergesort</w:t>
+                            </w:r>
+                            <w:proofErr w:type="spellEnd"/>
                           </w:p>
                         </w:txbxContent>
                       </wps:txbx>
@@ -2716,13 +3427,13 @@
                   <w:txbxContent>
                     <w:p>
                       <w:pPr>
-                        <w:pStyle w:val="Caption"/>
+                        <w:pStyle w:val="Descripcin"/>
                         <w:jc w:val="left"/>
                         <w:rPr>
                           <w:lang w:val="es-ES"/>
                         </w:rPr>
                       </w:pPr>
-                      <w:bookmarkStart w:id="2" w:name="_Ref5096856281"/>
+                      <w:bookmarkStart w:id="1" w:name="_Ref5096856281"/>
                       <w:r>
                         <w:rPr>
                           <w:b w:val="0"/>
@@ -2732,7 +3443,7 @@
                         </w:rPr>
                         <w:t>Pseudocódigo 1</w:t>
                       </w:r>
-                      <w:bookmarkEnd w:id="2"/>
+                      <w:bookmarkEnd w:id="1"/>
                       <w:r>
                         <w:rPr>
                           <w:b w:val="0"/>
@@ -2740,8 +3451,19 @@
                           <w:szCs w:val="16"/>
                           <w:lang w:val="es-ES"/>
                         </w:rPr>
-                        <w:t>. Algoritmo de Mergesort</w:t>
+                        <w:t xml:space="preserve">. Algoritmo de </w:t>
                       </w:r>
+                      <w:proofErr w:type="spellStart"/>
+                      <w:r>
+                        <w:rPr>
+                          <w:b w:val="0"/>
+                          <w:sz w:val="16"/>
+                          <w:szCs w:val="16"/>
+                          <w:lang w:val="es-ES"/>
+                        </w:rPr>
+                        <w:t>Mergesort</w:t>
+                      </w:r>
+                      <w:proofErr w:type="spellEnd"/>
                     </w:p>
                   </w:txbxContent>
                 </v:textbox>
@@ -2754,7 +3476,7 @@
     </w:p>
     <w:p>
       <w:pPr>
-        <w:pStyle w:val="Heading1"/>
+        <w:pStyle w:val="Ttulo1"/>
         <w:rPr>
           <w:lang w:val="es-ES"/>
         </w:rPr>
@@ -2791,21 +3513,28 @@
         <w:rPr>
           <w:lang w:val="es-ES" w:eastAsia="en-US"/>
         </w:rPr>
-        <w:t xml:space="preserve">### También hemos filtrado los estados que son simétricos o rotaciones de otros ya estudiados, que no se puede aplicar a todos los tableros. En los que se puede aplicar hace que la búsqueda sea más lenta pero permite bajar mucho la </w:t>
+        <w:t xml:space="preserve">### También hemos filtrado los estados que son simétricos o rotaciones de otros ya estudiados, que no se puede aplicar a todos los tableros. En los que se puede aplicar hace que la búsqueda sea más </w:t>
+      </w:r>
+      <w:proofErr w:type="gramStart"/>
+      <w:r>
+        <w:rPr>
+          <w:lang w:val="es-ES" w:eastAsia="en-US"/>
+        </w:rPr>
+        <w:t>lenta</w:t>
+      </w:r>
+      <w:proofErr w:type="gramEnd"/>
+      <w:r>
+        <w:rPr>
+          <w:lang w:val="es-ES" w:eastAsia="en-US"/>
+        </w:rPr>
+        <w:t xml:space="preserve"> pero permite bajar mucho la </w:t>
       </w:r>
       <w:r>
         <w:rPr>
           <w:sz w:val="18"/>
           <w:lang w:val="es-ES"/>
         </w:rPr>
-        <w:t>β</w:t>
-      </w:r>
-      <w:r>
-        <w:rPr>
-          <w:sz w:val="18"/>
-          <w:lang w:val="es-ES"/>
-        </w:rPr>
-        <w:t>.</w:t>
+        <w:t>β.</w:t>
       </w:r>
     </w:p>
     <w:p>
@@ -2928,7 +3657,7 @@
     </w:p>
     <w:p>
       <w:pPr>
-        <w:pStyle w:val="Caption"/>
+        <w:pStyle w:val="Descripcin"/>
         <w:rPr>
           <w:b w:val="0"/>
           <w:sz w:val="16"/>
@@ -2936,8 +3665,8 @@
           <w:lang w:val="es-ES"/>
         </w:rPr>
       </w:pPr>
-      <w:bookmarkStart w:id="3" w:name="_Ref509686985"/>
-      <w:bookmarkStart w:id="4" w:name="_Ref509686919"/>
+      <w:bookmarkStart w:id="2" w:name="_Ref509686985"/>
+      <w:bookmarkStart w:id="3" w:name="_Ref509686919"/>
       <w:r>
         <w:rPr>
           <w:b w:val="0"/>
@@ -2947,7 +3676,7 @@
         </w:rPr>
         <w:t>Table 1</w:t>
       </w:r>
-      <w:bookmarkEnd w:id="3"/>
+      <w:bookmarkEnd w:id="2"/>
       <w:r>
         <w:rPr>
           <w:b w:val="0"/>
@@ -2957,7 +3686,7 @@
         </w:rPr>
         <w:t>. Ejemplo de tabla</w:t>
       </w:r>
-      <w:bookmarkEnd w:id="4"/>
+      <w:bookmarkEnd w:id="3"/>
     </w:p>
     <w:tbl>
       <w:tblPr>
@@ -3011,6 +3740,7 @@
               <w:rPr>
                 <w:lang w:val="es-ES"/>
               </w:rPr>
+              <w:lastRenderedPageBreak/>
               <w:t>Table Head</w:t>
             </w:r>
           </w:p>
@@ -3044,7 +3774,21 @@
               <w:rPr>
                 <w:lang w:val="es-ES"/>
               </w:rPr>
-              <w:t>Table Column Head</w:t>
+              <w:t xml:space="preserve">Table </w:t>
+            </w:r>
+            <w:proofErr w:type="spellStart"/>
+            <w:r>
+              <w:rPr>
+                <w:lang w:val="es-ES"/>
+              </w:rPr>
+              <w:t>Column</w:t>
+            </w:r>
+            <w:proofErr w:type="spellEnd"/>
+            <w:r>
+              <w:rPr>
+                <w:lang w:val="es-ES"/>
+              </w:rPr>
+              <w:t xml:space="preserve"> Head</w:t>
             </w:r>
           </w:p>
         </w:tc>
@@ -3102,8 +3846,30 @@
               <w:rPr>
                 <w:lang w:val="es-ES"/>
               </w:rPr>
-              <w:t>Table column subhead</w:t>
+              <w:t xml:space="preserve">Table </w:t>
             </w:r>
+            <w:proofErr w:type="spellStart"/>
+            <w:r>
+              <w:rPr>
+                <w:lang w:val="es-ES"/>
+              </w:rPr>
+              <w:t>column</w:t>
+            </w:r>
+            <w:proofErr w:type="spellEnd"/>
+            <w:r>
+              <w:rPr>
+                <w:lang w:val="es-ES"/>
+              </w:rPr>
+              <w:t xml:space="preserve"> </w:t>
+            </w:r>
+            <w:proofErr w:type="spellStart"/>
+            <w:r>
+              <w:rPr>
+                <w:lang w:val="es-ES"/>
+              </w:rPr>
+              <w:t>subhead</w:t>
+            </w:r>
+            <w:proofErr w:type="spellEnd"/>
           </w:p>
         </w:tc>
         <w:tc>
@@ -3129,12 +3895,14 @@
                 <w:lang w:val="es-ES"/>
               </w:rPr>
             </w:pPr>
+            <w:proofErr w:type="spellStart"/>
             <w:r>
               <w:rPr>
                 <w:lang w:val="es-ES"/>
               </w:rPr>
               <w:t>Subhead</w:t>
             </w:r>
+            <w:proofErr w:type="spellEnd"/>
           </w:p>
         </w:tc>
         <w:tc>
@@ -3161,12 +3929,14 @@
                 <w:lang w:val="es-ES"/>
               </w:rPr>
             </w:pPr>
+            <w:proofErr w:type="spellStart"/>
             <w:r>
               <w:rPr>
                 <w:lang w:val="es-ES"/>
               </w:rPr>
               <w:t>Subhead</w:t>
             </w:r>
+            <w:proofErr w:type="spellEnd"/>
           </w:p>
         </w:tc>
       </w:tr>
@@ -3198,12 +3968,14 @@
                 <w:lang w:val="es-ES"/>
               </w:rPr>
             </w:pPr>
+            <w:proofErr w:type="spellStart"/>
             <w:r>
               <w:rPr>
                 <w:lang w:val="es-ES"/>
               </w:rPr>
               <w:t>copy</w:t>
             </w:r>
+            <w:proofErr w:type="spellEnd"/>
           </w:p>
         </w:tc>
         <w:tc>
@@ -3233,7 +4005,14 @@
               <w:rPr>
                 <w:lang w:val="es-ES"/>
               </w:rPr>
-              <w:t>More table copy</w:t>
+              <w:t xml:space="preserve">More table </w:t>
+            </w:r>
+            <w:proofErr w:type="spellStart"/>
+            <w:r>
+              <w:rPr>
+                <w:lang w:val="es-ES"/>
+              </w:rPr>
+              <w:t>copy</w:t>
             </w:r>
             <w:r>
               <w:rPr>
@@ -3242,6 +4021,7 @@
               </w:rPr>
               <w:t>a</w:t>
             </w:r>
+            <w:proofErr w:type="spellEnd"/>
           </w:p>
         </w:tc>
         <w:tc>
@@ -3313,7 +4093,7 @@
     </w:p>
     <w:p>
       <w:pPr>
-        <w:pStyle w:val="Heading1"/>
+        <w:pStyle w:val="Ttulo1"/>
         <w:rPr>
           <w:lang w:val="es-ES"/>
         </w:rPr>
@@ -3336,12 +4116,18 @@
         <w:rPr>
           <w:lang w:val="es-ES"/>
         </w:rPr>
-        <w:t>Finalmente, se dedica la última sección para indicar las conclusiones obtenidas del trabajo. Se puede dedicar un párrafo para realizar un resumen sucinto del trabajo, con los experimentos y resultados. Seguidamente, uno o dos párrafos con conclusiones. Se suele dedicar un párrafo final con ideas de mejora y trabajo futuro.</w:t>
+        <w:t xml:space="preserve">Finalmente, se dedica la última sección para indicar las conclusiones obtenidas del trabajo. Se puede dedicar un párrafo para realizar un resumen sucinto del trabajo, con los experimentos y resultados. Seguidamente, uno o dos párrafos </w:t>
+      </w:r>
+      <w:r>
+        <w:rPr>
+          <w:lang w:val="es-ES"/>
+        </w:rPr>
+        <w:t>con conclusiones. Se suele dedicar un párrafo final con ideas de mejora y trabajo futuro.</w:t>
       </w:r>
     </w:p>
     <w:p>
       <w:pPr>
-        <w:pStyle w:val="Heading5"/>
+        <w:pStyle w:val="Ttulo5"/>
         <w:rPr>
           <w:lang w:val="es-ES"/>
         </w:rPr>
@@ -3374,10 +4160,10 @@
         </w:rPr>
         <w:t xml:space="preserve">Página de Wikipedia sobre el </w:t>
       </w:r>
-      <w:hyperlink r:id="rId12" w:history="1">
+      <w:hyperlink r:id="rId11" w:history="1">
         <w:r>
           <w:rPr>
-            <w:rStyle w:val="Hyperlink"/>
+            <w:rStyle w:val="Hipervnculo"/>
             <w:lang w:val="es-ES"/>
           </w:rPr>
           <w:t>Senku</w:t>
@@ -3397,55 +4183,175 @@
           <w:lang w:val="es-ES"/>
         </w:rPr>
       </w:pPr>
+      <w:hyperlink r:id="rId12" w:history="1">
+        <w:r>
+          <w:rPr>
+            <w:rStyle w:val="Hipervnculo"/>
+            <w:lang w:val="es-ES"/>
+          </w:rPr>
+          <w:t>Gibe</w:t>
+        </w:r>
+        <w:r>
+          <w:rPr>
+            <w:rStyle w:val="Hipervnculo"/>
+            <w:lang w:val="es-ES"/>
+          </w:rPr>
+          <w:t>l</w:t>
+        </w:r>
+        <w:r>
+          <w:rPr>
+            <w:rStyle w:val="Hipervnculo"/>
+            <w:lang w:val="es-ES"/>
+          </w:rPr>
+          <w:t>l.net</w:t>
+        </w:r>
+      </w:hyperlink>
+      <w:r>
+        <w:rPr>
+          <w:lang w:val="es-ES"/>
+        </w:rPr>
+        <w:t>, con todo tipo de información sobre Senku y variaciones, consultada el 28/05/2026</w:t>
+      </w:r>
+    </w:p>
+    <w:p>
+      <w:pPr>
+        <w:pStyle w:val="references"/>
+        <w:rPr>
+          <w:lang w:val="es-ES"/>
+        </w:rPr>
+      </w:pPr>
       <w:hyperlink r:id="rId13" w:history="1">
         <w:r>
           <w:rPr>
-            <w:rStyle w:val="Hyperlink"/>
+            <w:rStyle w:val="Hipervnculo"/>
             <w:lang w:val="es-ES"/>
           </w:rPr>
-          <w:t>Gibell.net</w:t>
+          <w:t xml:space="preserve">Peg Solitaire and </w:t>
+        </w:r>
+        <w:proofErr w:type="spellStart"/>
+        <w:r>
+          <w:rPr>
+            <w:rStyle w:val="Hipervnculo"/>
+            <w:lang w:val="es-ES"/>
+          </w:rPr>
+          <w:t>its</w:t>
+        </w:r>
+        <w:proofErr w:type="spellEnd"/>
+        <w:r>
+          <w:rPr>
+            <w:rStyle w:val="Hipervnculo"/>
+            <w:lang w:val="es-ES"/>
+          </w:rPr>
+          <w:t xml:space="preserve"> </w:t>
+        </w:r>
+        <w:proofErr w:type="spellStart"/>
+        <w:r>
+          <w:rPr>
+            <w:rStyle w:val="Hipervnculo"/>
+            <w:lang w:val="es-ES"/>
+          </w:rPr>
+          <w:t>unbeatable</w:t>
+        </w:r>
+        <w:proofErr w:type="spellEnd"/>
+        <w:r>
+          <w:rPr>
+            <w:rStyle w:val="Hipervnculo"/>
+            <w:lang w:val="es-ES"/>
+          </w:rPr>
+          <w:t xml:space="preserve"> </w:t>
+        </w:r>
+        <w:proofErr w:type="spellStart"/>
+        <w:r>
+          <w:rPr>
+            <w:rStyle w:val="Hipervnculo"/>
+            <w:lang w:val="es-ES"/>
+          </w:rPr>
+          <w:t>g</w:t>
+        </w:r>
+        <w:r>
+          <w:rPr>
+            <w:rStyle w:val="Hipervnculo"/>
+            <w:lang w:val="es-ES"/>
+          </w:rPr>
+          <w:t>a</w:t>
+        </w:r>
+        <w:r>
+          <w:rPr>
+            <w:rStyle w:val="Hipervnculo"/>
+            <w:lang w:val="es-ES"/>
+          </w:rPr>
+          <w:t>mes</w:t>
+        </w:r>
+        <w:proofErr w:type="spellEnd"/>
+      </w:hyperlink>
+      <w:r>
+        <w:rPr>
+          <w:lang w:val="es-ES"/>
+        </w:rPr>
+        <w:t>, consultada el 28/05/2026</w:t>
+      </w:r>
+    </w:p>
+    <w:p>
+      <w:pPr>
+        <w:pStyle w:val="references"/>
+        <w:rPr>
+          <w:lang w:val="es-ES"/>
+        </w:rPr>
+      </w:pPr>
+      <w:hyperlink r:id="rId14" w:history="1">
+        <w:proofErr w:type="spellStart"/>
+        <w:r>
+          <w:rPr>
+            <w:rStyle w:val="Hipervnculo"/>
+            <w:lang w:val="es-ES"/>
+          </w:rPr>
+          <w:t>Analysis</w:t>
+        </w:r>
+        <w:proofErr w:type="spellEnd"/>
+        <w:r>
+          <w:rPr>
+            <w:rStyle w:val="Hipervnculo"/>
+            <w:lang w:val="es-ES"/>
+          </w:rPr>
+          <w:t xml:space="preserve"> </w:t>
+        </w:r>
+        <w:proofErr w:type="spellStart"/>
+        <w:r>
+          <w:rPr>
+            <w:rStyle w:val="Hipervnculo"/>
+            <w:lang w:val="es-ES"/>
+          </w:rPr>
+          <w:t>of</w:t>
+        </w:r>
+        <w:proofErr w:type="spellEnd"/>
+        <w:r>
+          <w:rPr>
+            <w:rStyle w:val="Hipervnculo"/>
+            <w:lang w:val="es-ES"/>
+          </w:rPr>
+          <w:t xml:space="preserve"> Peg Solitaire</w:t>
         </w:r>
       </w:hyperlink>
       <w:r>
         <w:rPr>
           <w:lang w:val="es-ES"/>
         </w:rPr>
-        <w:t>, con todo tipo de información sobre Senku y variaciones, consultada el 28/05/2026</w:t>
+        <w:t>, consultada el 28/05/2026</w:t>
       </w:r>
     </w:p>
     <w:p>
       <w:pPr>
-        <w:pStyle w:val="references"/>
-      </w:pPr>
-      <w:hyperlink r:id="rId14" w:history="1">
-        <w:r>
-          <w:rPr>
-            <w:rStyle w:val="Hyperlink"/>
-          </w:rPr>
-          <w:t>Peg Solitaire and its unbeatable games</w:t>
-        </w:r>
-      </w:hyperlink>
-      <w:r>
-        <w:t xml:space="preserve">, y </w:t>
-      </w:r>
-      <w:hyperlink r:id="rId15" w:history="1">
-        <w:r>
-          <w:rPr>
-            <w:rStyle w:val="Hyperlink"/>
-          </w:rPr>
-          <w:t>Analysis of Peg Solitaire</w:t>
-        </w:r>
-      </w:hyperlink>
-      <w:r>
-        <w:t>, consultadas el 28/05/2026</w:t>
-      </w:r>
+        <w:rPr>
+          <w:rFonts w:cs="Mangal"/>
+          <w:szCs w:val="21"/>
+        </w:rPr>
+      </w:pPr>
     </w:p>
     <w:p>
       <w:pPr>
         <w:rPr>
           <w:rFonts w:cs="Mangal"/>
           <w:szCs w:val="21"/>
-          <w:lang w:val="en-US"/>
         </w:rPr>
         <w:sectPr>
           <w:type w:val="continuous"/>
@@ -3470,6 +4376,9 @@
         </w:rPr>
       </w:pPr>
       <w:r>
+        <w:rPr>
+          <w:lang w:val="es-ES"/>
+        </w:rPr>
         <w:t xml:space="preserve">                     </w:t>
       </w:r>
     </w:p>
@@ -3507,20 +4416,7 @@
 <w:ftr xmlns:wpc="http://schemas.microsoft.com/office/word/2010/wordprocessingCanvas" xmlns:cx="http://schemas.microsoft.com/office/drawing/2014/chartex" xmlns:cx1="http://schemas.microsoft.com/office/drawing/2015/9/8/chartex" xmlns:cx2="http://schemas.microsoft.com/office/drawing/2015/10/21/chartex" xmlns:cx3="http://schemas.microsoft.com/office/drawing/2016/5/9/chartex" xmlns:cx4="http://schemas.microsoft.com/office/drawing/2016/5/10/chartex" xmlns:cx5="http://schemas.microsoft.com/office/drawing/2016/5/11/chartex" xmlns:cx6="http://schemas.microsoft.com/office/drawing/2016/5/12/chartex" xmlns:cx7="http://schemas.microsoft.com/office/drawing/2016/5/13/chartex" xmlns:cx8="http://schemas.microsoft.com/office/drawing/2016/5/14/chartex" xmlns:mc="http://schemas.openxmlformats.org/markup-compatibility/2006" xmlns:aink="http://schemas.microsoft.com/office/drawing/2016/ink" xmlns:am3d="http://schemas.microsoft.com/office/drawing/2017/model3d" xmlns:o="urn:schemas-microsoft-com:office:office" xmlns:oel="http://schemas.microsoft.com/office/2019/extlst" xmlns:r="http://schemas.openxmlformats.org/officeDocument/2006/relationships" xmlns:m="http://schemas.openxmlformats.org/officeDocument/2006/math" xmlns:v="urn:schemas-microsoft-com:vml" xmlns:wp14="http://schemas.microsoft.com/office/word/2010/wordprocessingDrawing" xmlns:wp="http://schemas.openxmlformats.org/drawingml/2006/wordprocessingDrawing" xmlns:w10="urn:schemas-microsoft-com:office:word" xmlns:w="http://schemas.openxmlformats.org/wordprocessingml/2006/main" xmlns:w14="http://schemas.microsoft.com/office/word/2010/wordml" xmlns:w15="http://schemas.microsoft.com/office/word/2012/wordml" xmlns:w16cex="http://schemas.microsoft.com/office/word/2018/wordml/cex" xmlns:w16cid="http://schemas.microsoft.com/office/word/2016/wordml/cid" xmlns:w16="http://schemas.microsoft.com/office/word/2018/wordml" xmlns:w16du="http://schemas.microsoft.com/office/word/2023/wordml/word16du" xmlns:w16sdtdh="http://schemas.microsoft.com/office/word/2020/wordml/sdtdatahash" xmlns:w16sdtfl="http://schemas.microsoft.com/office/word/2024/wordml/sdtformatlock" xmlns:w16se="http://schemas.microsoft.com/office/word/2015/wordml/symex" xmlns:wpg="http://schemas.microsoft.com/office/word/2010/wordprocessingGroup" xmlns:wpi="http://schemas.microsoft.com/office/word/2010/wordprocessingInk" xmlns:wne="http://schemas.microsoft.com/office/word/2006/wordml" xmlns:wps="http://schemas.microsoft.com/office/word/2010/wordprocessingShape" mc:Ignorable="w14 w15 w16se w16cid w16 w16cex w16sdtdh w16sdtfl w16du wp14">
   <w:p>
     <w:pPr>
-      <w:pStyle w:val="Footer"/>
-      <w:rPr>
-        <w:lang w:val="es-ES"/>
-      </w:rPr>
-    </w:pPr>
-  </w:p>
-</w:ftr>
-</file>
-
-<file path=word/footer2.xml><?xml version="1.0" encoding="utf-8"?>
-<w:ftr xmlns:wpc="http://schemas.microsoft.com/office/word/2010/wordprocessingCanvas" xmlns:cx="http://schemas.microsoft.com/office/drawing/2014/chartex" xmlns:cx1="http://schemas.microsoft.com/office/drawing/2015/9/8/chartex" xmlns:cx2="http://schemas.microsoft.com/office/drawing/2015/10/21/chartex" xmlns:cx3="http://schemas.microsoft.com/office/drawing/2016/5/9/chartex" xmlns:cx4="http://schemas.microsoft.com/office/drawing/2016/5/10/chartex" xmlns:cx5="http://schemas.microsoft.com/office/drawing/2016/5/11/chartex" xmlns:cx6="http://schemas.microsoft.com/office/drawing/2016/5/12/chartex" xmlns:cx7="http://schemas.microsoft.com/office/drawing/2016/5/13/chartex" xmlns:cx8="http://schemas.microsoft.com/office/drawing/2016/5/14/chartex" xmlns:mc="http://schemas.openxmlformats.org/markup-compatibility/2006" xmlns:aink="http://schemas.microsoft.com/office/drawing/2016/ink" xmlns:am3d="http://schemas.microsoft.com/office/drawing/2017/model3d" xmlns:o="urn:schemas-microsoft-com:office:office" xmlns:oel="http://schemas.microsoft.com/office/2019/extlst" xmlns:r="http://schemas.openxmlformats.org/officeDocument/2006/relationships" xmlns:m="http://schemas.openxmlformats.org/officeDocument/2006/math" xmlns:v="urn:schemas-microsoft-com:vml" xmlns:wp14="http://schemas.microsoft.com/office/word/2010/wordprocessingDrawing" xmlns:wp="http://schemas.openxmlformats.org/drawingml/2006/wordprocessingDrawing" xmlns:w10="urn:schemas-microsoft-com:office:word" xmlns:w="http://schemas.openxmlformats.org/wordprocessingml/2006/main" xmlns:w14="http://schemas.microsoft.com/office/word/2010/wordml" xmlns:w15="http://schemas.microsoft.com/office/word/2012/wordml" xmlns:w16cex="http://schemas.microsoft.com/office/word/2018/wordml/cex" xmlns:w16cid="http://schemas.microsoft.com/office/word/2016/wordml/cid" xmlns:w16="http://schemas.microsoft.com/office/word/2018/wordml" xmlns:w16du="http://schemas.microsoft.com/office/word/2023/wordml/word16du" xmlns:w16sdtdh="http://schemas.microsoft.com/office/word/2020/wordml/sdtdatahash" xmlns:w16sdtfl="http://schemas.microsoft.com/office/word/2024/wordml/sdtformatlock" xmlns:w16se="http://schemas.microsoft.com/office/word/2015/wordml/symex" xmlns:wpg="http://schemas.microsoft.com/office/word/2010/wordprocessingGroup" xmlns:wpi="http://schemas.microsoft.com/office/word/2010/wordprocessingInk" xmlns:wne="http://schemas.microsoft.com/office/word/2006/wordml" xmlns:wps="http://schemas.microsoft.com/office/word/2010/wordprocessingShape" mc:Ignorable="w14 w15 w16se w16cid w16 w16cex w16sdtdh w16sdtfl w16du wp14">
-  <w:p>
-    <w:pPr>
-      <w:pStyle w:val="Footer"/>
+      <w:pStyle w:val="Piedepgina"/>
       <w:jc w:val="both"/>
       <w:rPr>
         <w:lang w:val="es-ES"/>
@@ -4111,7 +5007,7 @@
     <w:lvl w:ilvl="0">
       <w:start w:val="1"/>
       <w:numFmt w:val="upperRoman"/>
-      <w:pStyle w:val="Heading1"/>
+      <w:pStyle w:val="Ttulo1"/>
       <w:lvlText w:val="%1."/>
       <w:lvlJc w:val="center"/>
       <w:pPr>
@@ -4138,7 +5034,7 @@
     <w:lvl w:ilvl="1">
       <w:start w:val="1"/>
       <w:numFmt w:val="upperLetter"/>
-      <w:pStyle w:val="Heading2"/>
+      <w:pStyle w:val="Ttulo2"/>
       <w:lvlText w:val="%2."/>
       <w:lvlJc w:val="left"/>
       <w:pPr>
@@ -4169,7 +5065,7 @@
     <w:lvl w:ilvl="2">
       <w:start w:val="1"/>
       <w:numFmt w:val="decimal"/>
-      <w:pStyle w:val="Heading3"/>
+      <w:pStyle w:val="Ttulo3"/>
       <w:lvlText w:val="%3)"/>
       <w:lvlJc w:val="left"/>
       <w:pPr>
@@ -4200,7 +5096,7 @@
     <w:lvl w:ilvl="3">
       <w:start w:val="1"/>
       <w:numFmt w:val="lowerLetter"/>
-      <w:pStyle w:val="Heading4"/>
+      <w:pStyle w:val="Ttulo4"/>
       <w:lvlText w:val="%4)"/>
       <w:lvlJc w:val="left"/>
       <w:pPr>
@@ -5826,6 +6722,232 @@
     </w:lvl>
   </w:abstractNum>
   <w:abstractNum w:abstractNumId="22" w15:restartNumberingAfterBreak="0">
+    <w:nsid w:val="6328448A"/>
+    <w:multiLevelType w:val="hybridMultilevel"/>
+    <w:tmpl w:val="D05A95AA"/>
+    <w:lvl w:ilvl="0" w:tplc="0C0A0001">
+      <w:start w:val="1"/>
+      <w:numFmt w:val="bullet"/>
+      <w:lvlText w:val=""/>
+      <w:lvlJc w:val="left"/>
+      <w:pPr>
+        <w:ind w:left="1008" w:hanging="360"/>
+      </w:pPr>
+      <w:rPr>
+        <w:rFonts w:ascii="Symbol" w:hAnsi="Symbol" w:hint="default"/>
+      </w:rPr>
+    </w:lvl>
+    <w:lvl w:ilvl="1" w:tplc="0C0A0003" w:tentative="1">
+      <w:start w:val="1"/>
+      <w:numFmt w:val="bullet"/>
+      <w:lvlText w:val="o"/>
+      <w:lvlJc w:val="left"/>
+      <w:pPr>
+        <w:ind w:left="1728" w:hanging="360"/>
+      </w:pPr>
+      <w:rPr>
+        <w:rFonts w:ascii="Courier New" w:hAnsi="Courier New" w:cs="Courier New" w:hint="default"/>
+      </w:rPr>
+    </w:lvl>
+    <w:lvl w:ilvl="2" w:tplc="0C0A0005" w:tentative="1">
+      <w:start w:val="1"/>
+      <w:numFmt w:val="bullet"/>
+      <w:lvlText w:val=""/>
+      <w:lvlJc w:val="left"/>
+      <w:pPr>
+        <w:ind w:left="2448" w:hanging="360"/>
+      </w:pPr>
+      <w:rPr>
+        <w:rFonts w:ascii="Wingdings" w:hAnsi="Wingdings" w:hint="default"/>
+      </w:rPr>
+    </w:lvl>
+    <w:lvl w:ilvl="3" w:tplc="0C0A0001" w:tentative="1">
+      <w:start w:val="1"/>
+      <w:numFmt w:val="bullet"/>
+      <w:lvlText w:val=""/>
+      <w:lvlJc w:val="left"/>
+      <w:pPr>
+        <w:ind w:left="3168" w:hanging="360"/>
+      </w:pPr>
+      <w:rPr>
+        <w:rFonts w:ascii="Symbol" w:hAnsi="Symbol" w:hint="default"/>
+      </w:rPr>
+    </w:lvl>
+    <w:lvl w:ilvl="4" w:tplc="0C0A0003" w:tentative="1">
+      <w:start w:val="1"/>
+      <w:numFmt w:val="bullet"/>
+      <w:lvlText w:val="o"/>
+      <w:lvlJc w:val="left"/>
+      <w:pPr>
+        <w:ind w:left="3888" w:hanging="360"/>
+      </w:pPr>
+      <w:rPr>
+        <w:rFonts w:ascii="Courier New" w:hAnsi="Courier New" w:cs="Courier New" w:hint="default"/>
+      </w:rPr>
+    </w:lvl>
+    <w:lvl w:ilvl="5" w:tplc="0C0A0005" w:tentative="1">
+      <w:start w:val="1"/>
+      <w:numFmt w:val="bullet"/>
+      <w:lvlText w:val=""/>
+      <w:lvlJc w:val="left"/>
+      <w:pPr>
+        <w:ind w:left="4608" w:hanging="360"/>
+      </w:pPr>
+      <w:rPr>
+        <w:rFonts w:ascii="Wingdings" w:hAnsi="Wingdings" w:hint="default"/>
+      </w:rPr>
+    </w:lvl>
+    <w:lvl w:ilvl="6" w:tplc="0C0A0001" w:tentative="1">
+      <w:start w:val="1"/>
+      <w:numFmt w:val="bullet"/>
+      <w:lvlText w:val=""/>
+      <w:lvlJc w:val="left"/>
+      <w:pPr>
+        <w:ind w:left="5328" w:hanging="360"/>
+      </w:pPr>
+      <w:rPr>
+        <w:rFonts w:ascii="Symbol" w:hAnsi="Symbol" w:hint="default"/>
+      </w:rPr>
+    </w:lvl>
+    <w:lvl w:ilvl="7" w:tplc="0C0A0003" w:tentative="1">
+      <w:start w:val="1"/>
+      <w:numFmt w:val="bullet"/>
+      <w:lvlText w:val="o"/>
+      <w:lvlJc w:val="left"/>
+      <w:pPr>
+        <w:ind w:left="6048" w:hanging="360"/>
+      </w:pPr>
+      <w:rPr>
+        <w:rFonts w:ascii="Courier New" w:hAnsi="Courier New" w:cs="Courier New" w:hint="default"/>
+      </w:rPr>
+    </w:lvl>
+    <w:lvl w:ilvl="8" w:tplc="0C0A0005" w:tentative="1">
+      <w:start w:val="1"/>
+      <w:numFmt w:val="bullet"/>
+      <w:lvlText w:val=""/>
+      <w:lvlJc w:val="left"/>
+      <w:pPr>
+        <w:ind w:left="6768" w:hanging="360"/>
+      </w:pPr>
+      <w:rPr>
+        <w:rFonts w:ascii="Wingdings" w:hAnsi="Wingdings" w:hint="default"/>
+      </w:rPr>
+    </w:lvl>
+  </w:abstractNum>
+  <w:abstractNum w:abstractNumId="23" w15:restartNumberingAfterBreak="0">
+    <w:nsid w:val="6554056E"/>
+    <w:multiLevelType w:val="hybridMultilevel"/>
+    <w:tmpl w:val="EB72130E"/>
+    <w:lvl w:ilvl="0" w:tplc="0C0A0001">
+      <w:start w:val="1"/>
+      <w:numFmt w:val="bullet"/>
+      <w:lvlText w:val=""/>
+      <w:lvlJc w:val="left"/>
+      <w:pPr>
+        <w:ind w:left="720" w:hanging="360"/>
+      </w:pPr>
+      <w:rPr>
+        <w:rFonts w:ascii="Symbol" w:hAnsi="Symbol" w:hint="default"/>
+      </w:rPr>
+    </w:lvl>
+    <w:lvl w:ilvl="1" w:tplc="0C0A0003" w:tentative="1">
+      <w:start w:val="1"/>
+      <w:numFmt w:val="bullet"/>
+      <w:lvlText w:val="o"/>
+      <w:lvlJc w:val="left"/>
+      <w:pPr>
+        <w:ind w:left="1440" w:hanging="360"/>
+      </w:pPr>
+      <w:rPr>
+        <w:rFonts w:ascii="Courier New" w:hAnsi="Courier New" w:cs="Courier New" w:hint="default"/>
+      </w:rPr>
+    </w:lvl>
+    <w:lvl w:ilvl="2" w:tplc="0C0A0005" w:tentative="1">
+      <w:start w:val="1"/>
+      <w:numFmt w:val="bullet"/>
+      <w:lvlText w:val=""/>
+      <w:lvlJc w:val="left"/>
+      <w:pPr>
+        <w:ind w:left="2160" w:hanging="360"/>
+      </w:pPr>
+      <w:rPr>
+        <w:rFonts w:ascii="Wingdings" w:hAnsi="Wingdings" w:hint="default"/>
+      </w:rPr>
+    </w:lvl>
+    <w:lvl w:ilvl="3" w:tplc="0C0A0001" w:tentative="1">
+      <w:start w:val="1"/>
+      <w:numFmt w:val="bullet"/>
+      <w:lvlText w:val=""/>
+      <w:lvlJc w:val="left"/>
+      <w:pPr>
+        <w:ind w:left="2880" w:hanging="360"/>
+      </w:pPr>
+      <w:rPr>
+        <w:rFonts w:ascii="Symbol" w:hAnsi="Symbol" w:hint="default"/>
+      </w:rPr>
+    </w:lvl>
+    <w:lvl w:ilvl="4" w:tplc="0C0A0003" w:tentative="1">
+      <w:start w:val="1"/>
+      <w:numFmt w:val="bullet"/>
+      <w:lvlText w:val="o"/>
+      <w:lvlJc w:val="left"/>
+      <w:pPr>
+        <w:ind w:left="3600" w:hanging="360"/>
+      </w:pPr>
+      <w:rPr>
+        <w:rFonts w:ascii="Courier New" w:hAnsi="Courier New" w:cs="Courier New" w:hint="default"/>
+      </w:rPr>
+    </w:lvl>
+    <w:lvl w:ilvl="5" w:tplc="0C0A0005" w:tentative="1">
+      <w:start w:val="1"/>
+      <w:numFmt w:val="bullet"/>
+      <w:lvlText w:val=""/>
+      <w:lvlJc w:val="left"/>
+      <w:pPr>
+        <w:ind w:left="4320" w:hanging="360"/>
+      </w:pPr>
+      <w:rPr>
+        <w:rFonts w:ascii="Wingdings" w:hAnsi="Wingdings" w:hint="default"/>
+      </w:rPr>
+    </w:lvl>
+    <w:lvl w:ilvl="6" w:tplc="0C0A0001" w:tentative="1">
+      <w:start w:val="1"/>
+      <w:numFmt w:val="bullet"/>
+      <w:lvlText w:val=""/>
+      <w:lvlJc w:val="left"/>
+      <w:pPr>
+        <w:ind w:left="5040" w:hanging="360"/>
+      </w:pPr>
+      <w:rPr>
+        <w:rFonts w:ascii="Symbol" w:hAnsi="Symbol" w:hint="default"/>
+      </w:rPr>
+    </w:lvl>
+    <w:lvl w:ilvl="7" w:tplc="0C0A0003" w:tentative="1">
+      <w:start w:val="1"/>
+      <w:numFmt w:val="bullet"/>
+      <w:lvlText w:val="o"/>
+      <w:lvlJc w:val="left"/>
+      <w:pPr>
+        <w:ind w:left="5760" w:hanging="360"/>
+      </w:pPr>
+      <w:rPr>
+        <w:rFonts w:ascii="Courier New" w:hAnsi="Courier New" w:cs="Courier New" w:hint="default"/>
+      </w:rPr>
+    </w:lvl>
+    <w:lvl w:ilvl="8" w:tplc="0C0A0005" w:tentative="1">
+      <w:start w:val="1"/>
+      <w:numFmt w:val="bullet"/>
+      <w:lvlText w:val=""/>
+      <w:lvlJc w:val="left"/>
+      <w:pPr>
+        <w:ind w:left="6480" w:hanging="360"/>
+      </w:pPr>
+      <w:rPr>
+        <w:rFonts w:ascii="Wingdings" w:hAnsi="Wingdings" w:hint="default"/>
+      </w:rPr>
+    </w:lvl>
+  </w:abstractNum>
+  <w:abstractNum w:abstractNumId="24" w15:restartNumberingAfterBreak="0">
     <w:nsid w:val="69F64969"/>
     <w:multiLevelType w:val="multilevel"/>
     <w:tmpl w:val="F3DCD434"/>
@@ -5930,7 +7052,7 @@
       </w:rPr>
     </w:lvl>
   </w:abstractNum>
-  <w:abstractNum w:abstractNumId="23" w15:restartNumberingAfterBreak="0">
+  <w:abstractNum w:abstractNumId="25" w15:restartNumberingAfterBreak="0">
     <w:nsid w:val="6AF04E9F"/>
     <w:multiLevelType w:val="multilevel"/>
     <w:tmpl w:val="D37A66B6"/>
@@ -6027,7 +7149,7 @@
       </w:pPr>
     </w:lvl>
   </w:abstractNum>
-  <w:abstractNum w:abstractNumId="24" w15:restartNumberingAfterBreak="0">
+  <w:abstractNum w:abstractNumId="26" w15:restartNumberingAfterBreak="0">
     <w:nsid w:val="72090DB0"/>
     <w:multiLevelType w:val="multilevel"/>
     <w:tmpl w:val="9AC4BB36"/>
@@ -6136,7 +7258,7 @@
       </w:pPr>
     </w:lvl>
   </w:abstractNum>
-  <w:abstractNum w:abstractNumId="25" w15:restartNumberingAfterBreak="0">
+  <w:abstractNum w:abstractNumId="27" w15:restartNumberingAfterBreak="0">
     <w:nsid w:val="73F53EDC"/>
     <w:multiLevelType w:val="multilevel"/>
     <w:tmpl w:val="61DA561A"/>
@@ -6223,7 +7345,7 @@
       </w:pPr>
     </w:lvl>
   </w:abstractNum>
-  <w:abstractNum w:abstractNumId="26" w15:restartNumberingAfterBreak="0">
+  <w:abstractNum w:abstractNumId="28" w15:restartNumberingAfterBreak="0">
     <w:nsid w:val="7FA652C0"/>
     <w:multiLevelType w:val="multilevel"/>
     <w:tmpl w:val="AAF0228E"/>
@@ -6350,10 +7472,10 @@
     <w:abstractNumId w:val="20"/>
   </w:num>
   <w:num w:numId="13" w16cid:durableId="971984543">
-    <w:abstractNumId w:val="22"/>
+    <w:abstractNumId w:val="24"/>
   </w:num>
   <w:num w:numId="14" w16cid:durableId="1429543118">
-    <w:abstractNumId w:val="25"/>
+    <w:abstractNumId w:val="27"/>
   </w:num>
   <w:num w:numId="15" w16cid:durableId="322243936">
     <w:abstractNumId w:val="19"/>
@@ -6371,16 +7493,16 @@
     <w:abstractNumId w:val="17"/>
   </w:num>
   <w:num w:numId="20" w16cid:durableId="88353451">
-    <w:abstractNumId w:val="26"/>
+    <w:abstractNumId w:val="28"/>
   </w:num>
   <w:num w:numId="21" w16cid:durableId="1573546006">
     <w:abstractNumId w:val="7"/>
   </w:num>
   <w:num w:numId="22" w16cid:durableId="1313485035">
-    <w:abstractNumId w:val="24"/>
+    <w:abstractNumId w:val="26"/>
   </w:num>
   <w:num w:numId="23" w16cid:durableId="1680962751">
-    <w:abstractNumId w:val="23"/>
+    <w:abstractNumId w:val="25"/>
   </w:num>
   <w:num w:numId="24" w16cid:durableId="788280934">
     <w:abstractNumId w:val="2"/>
@@ -6407,7 +7529,7 @@
     <w:abstractNumId w:val="11"/>
   </w:num>
   <w:num w:numId="31" w16cid:durableId="1550335370">
-    <w:abstractNumId w:val="22"/>
+    <w:abstractNumId w:val="24"/>
   </w:num>
   <w:num w:numId="32" w16cid:durableId="441456017">
     <w:abstractNumId w:val="10"/>
@@ -6419,10 +7541,16 @@
     <w:abstractNumId w:val="2"/>
   </w:num>
   <w:num w:numId="34" w16cid:durableId="173500285">
-    <w:abstractNumId w:val="23"/>
+    <w:abstractNumId w:val="25"/>
     <w:lvlOverride w:ilvl="0">
       <w:startOverride w:val="1"/>
     </w:lvlOverride>
+  </w:num>
+  <w:num w:numId="35" w16cid:durableId="1662200336">
+    <w:abstractNumId w:val="22"/>
+  </w:num>
+  <w:num w:numId="36" w16cid:durableId="1352025084">
+    <w:abstractNumId w:val="23"/>
   </w:num>
 </w:numbering>
 </file>
@@ -6833,7 +7961,7 @@
       <w:lang w:val="es-ES"/>
     </w:rPr>
   </w:style>
-  <w:style w:type="paragraph" w:styleId="Heading1">
+  <w:style w:type="paragraph" w:styleId="Ttulo1">
     <w:name w:val="heading 1"/>
     <w:basedOn w:val="Standard"/>
     <w:next w:val="Standard"/>
@@ -6856,7 +7984,7 @@
       <w:lang w:eastAsia="en-US"/>
     </w:rPr>
   </w:style>
-  <w:style w:type="paragraph" w:styleId="Heading2">
+  <w:style w:type="paragraph" w:styleId="Ttulo2">
     <w:name w:val="heading 2"/>
     <w:basedOn w:val="Standard"/>
     <w:next w:val="Standard"/>
@@ -6883,7 +8011,7 @@
       <w:lang w:eastAsia="en-US"/>
     </w:rPr>
   </w:style>
-  <w:style w:type="paragraph" w:styleId="Heading3">
+  <w:style w:type="paragraph" w:styleId="Ttulo3">
     <w:name w:val="heading 3"/>
     <w:basedOn w:val="Standard"/>
     <w:next w:val="Standard"/>
@@ -6905,7 +8033,7 @@
       <w:lang w:eastAsia="en-US"/>
     </w:rPr>
   </w:style>
-  <w:style w:type="paragraph" w:styleId="Heading4">
+  <w:style w:type="paragraph" w:styleId="Ttulo4">
     <w:name w:val="heading 4"/>
     <w:basedOn w:val="Standard"/>
     <w:next w:val="Standard"/>
@@ -6930,7 +8058,7 @@
       <w:lang w:eastAsia="en-US"/>
     </w:rPr>
   </w:style>
-  <w:style w:type="paragraph" w:styleId="Heading5">
+  <w:style w:type="paragraph" w:styleId="Ttulo5">
     <w:name w:val="heading 5"/>
     <w:basedOn w:val="Standard"/>
     <w:next w:val="Standard"/>
@@ -6949,13 +8077,12 @@
       <w:lang w:eastAsia="en-US"/>
     </w:rPr>
   </w:style>
-  <w:style w:type="character" w:default="1" w:styleId="DefaultParagraphFont">
+  <w:style w:type="character" w:default="1" w:styleId="Fuentedeprrafopredeter">
     <w:name w:val="Default Paragraph Font"/>
     <w:uiPriority w:val="1"/>
-    <w:semiHidden/>
     <w:unhideWhenUsed/>
   </w:style>
-  <w:style w:type="table" w:default="1" w:styleId="TableNormal">
+  <w:style w:type="table" w:default="1" w:styleId="Tablanormal">
     <w:name w:val="Normal Table"/>
     <w:uiPriority w:val="99"/>
     <w:semiHidden/>
@@ -6970,7 +8097,7 @@
       </w:tblCellMar>
     </w:tblPr>
   </w:style>
-  <w:style w:type="numbering" w:default="1" w:styleId="NoList">
+  <w:style w:type="numbering" w:default="1" w:styleId="Sinlista">
     <w:name w:val="No List"/>
     <w:uiPriority w:val="99"/>
     <w:semiHidden/>
@@ -6978,7 +8105,7 @@
   </w:style>
   <w:style w:type="numbering" w:customStyle="1" w:styleId="Outline">
     <w:name w:val="Outline"/>
-    <w:basedOn w:val="NoList"/>
+    <w:basedOn w:val="Sinlista"/>
     <w:pPr>
       <w:numPr>
         <w:numId w:val="1"/>
@@ -7027,7 +8154,7 @@
       <w:spacing w:val="-1"/>
     </w:rPr>
   </w:style>
-  <w:style w:type="paragraph" w:styleId="List">
+  <w:style w:type="paragraph" w:styleId="Lista">
     <w:name w:val="List"/>
     <w:basedOn w:val="Textbody"/>
     <w:rPr>
@@ -7035,7 +8162,7 @@
       <w:sz w:val="24"/>
     </w:rPr>
   </w:style>
-  <w:style w:type="paragraph" w:styleId="Caption">
+  <w:style w:type="paragraph" w:styleId="Descripcin">
     <w:name w:val="caption"/>
     <w:basedOn w:val="Standard"/>
     <w:next w:val="Standard"/>
@@ -7302,7 +8429,7 @@
       <w:i/>
     </w:rPr>
   </w:style>
-  <w:style w:type="paragraph" w:styleId="Header">
+  <w:style w:type="paragraph" w:styleId="Encabezado">
     <w:name w:val="header"/>
     <w:basedOn w:val="Standard"/>
     <w:pPr>
@@ -7312,7 +8439,7 @@
       </w:tabs>
     </w:pPr>
   </w:style>
-  <w:style w:type="paragraph" w:styleId="Footer">
+  <w:style w:type="paragraph" w:styleId="Piedepgina">
     <w:name w:val="footer"/>
     <w:basedOn w:val="Standard"/>
     <w:pPr>
@@ -7771,11 +8898,11 @@
   </w:style>
   <w:style w:type="character" w:customStyle="1" w:styleId="EncabezadoCar">
     <w:name w:val="Encabezado Car"/>
-    <w:basedOn w:val="DefaultParagraphFont"/>
+    <w:basedOn w:val="Fuentedeprrafopredeter"/>
   </w:style>
   <w:style w:type="character" w:customStyle="1" w:styleId="PiedepginaCar">
     <w:name w:val="Pie de página Car"/>
-    <w:basedOn w:val="DefaultParagraphFont"/>
+    <w:basedOn w:val="Fuentedeprrafopredeter"/>
   </w:style>
   <w:style w:type="character" w:customStyle="1" w:styleId="Internetlink">
     <w:name w:val="Internet link"/>
@@ -7786,7 +8913,7 @@
   </w:style>
   <w:style w:type="numbering" w:customStyle="1" w:styleId="WW8Num1">
     <w:name w:val="WW8Num1"/>
-    <w:basedOn w:val="NoList"/>
+    <w:basedOn w:val="Sinlista"/>
     <w:pPr>
       <w:numPr>
         <w:numId w:val="2"/>
@@ -7795,7 +8922,7 @@
   </w:style>
   <w:style w:type="numbering" w:customStyle="1" w:styleId="WW8Num2">
     <w:name w:val="WW8Num2"/>
-    <w:basedOn w:val="NoList"/>
+    <w:basedOn w:val="Sinlista"/>
     <w:pPr>
       <w:numPr>
         <w:numId w:val="3"/>
@@ -7804,7 +8931,7 @@
   </w:style>
   <w:style w:type="numbering" w:customStyle="1" w:styleId="WW8Num3">
     <w:name w:val="WW8Num3"/>
-    <w:basedOn w:val="NoList"/>
+    <w:basedOn w:val="Sinlista"/>
     <w:pPr>
       <w:numPr>
         <w:numId w:val="4"/>
@@ -7813,7 +8940,7 @@
   </w:style>
   <w:style w:type="numbering" w:customStyle="1" w:styleId="WW8Num4">
     <w:name w:val="WW8Num4"/>
-    <w:basedOn w:val="NoList"/>
+    <w:basedOn w:val="Sinlista"/>
     <w:pPr>
       <w:numPr>
         <w:numId w:val="5"/>
@@ -7822,7 +8949,7 @@
   </w:style>
   <w:style w:type="numbering" w:customStyle="1" w:styleId="WW8Num5">
     <w:name w:val="WW8Num5"/>
-    <w:basedOn w:val="NoList"/>
+    <w:basedOn w:val="Sinlista"/>
     <w:pPr>
       <w:numPr>
         <w:numId w:val="6"/>
@@ -7831,7 +8958,7 @@
   </w:style>
   <w:style w:type="numbering" w:customStyle="1" w:styleId="WW8Num6">
     <w:name w:val="WW8Num6"/>
-    <w:basedOn w:val="NoList"/>
+    <w:basedOn w:val="Sinlista"/>
     <w:pPr>
       <w:numPr>
         <w:numId w:val="7"/>
@@ -7840,7 +8967,7 @@
   </w:style>
   <w:style w:type="numbering" w:customStyle="1" w:styleId="WW8Num7">
     <w:name w:val="WW8Num7"/>
-    <w:basedOn w:val="NoList"/>
+    <w:basedOn w:val="Sinlista"/>
     <w:pPr>
       <w:numPr>
         <w:numId w:val="8"/>
@@ -7849,7 +8976,7 @@
   </w:style>
   <w:style w:type="numbering" w:customStyle="1" w:styleId="WW8Num8">
     <w:name w:val="WW8Num8"/>
-    <w:basedOn w:val="NoList"/>
+    <w:basedOn w:val="Sinlista"/>
     <w:pPr>
       <w:numPr>
         <w:numId w:val="9"/>
@@ -7858,7 +8985,7 @@
   </w:style>
   <w:style w:type="numbering" w:customStyle="1" w:styleId="WW8Num9">
     <w:name w:val="WW8Num9"/>
-    <w:basedOn w:val="NoList"/>
+    <w:basedOn w:val="Sinlista"/>
     <w:pPr>
       <w:numPr>
         <w:numId w:val="10"/>
@@ -7867,7 +8994,7 @@
   </w:style>
   <w:style w:type="numbering" w:customStyle="1" w:styleId="WW8Num10">
     <w:name w:val="WW8Num10"/>
-    <w:basedOn w:val="NoList"/>
+    <w:basedOn w:val="Sinlista"/>
     <w:pPr>
       <w:numPr>
         <w:numId w:val="11"/>
@@ -7876,7 +9003,7 @@
   </w:style>
   <w:style w:type="numbering" w:customStyle="1" w:styleId="WW8Num11">
     <w:name w:val="WW8Num11"/>
-    <w:basedOn w:val="NoList"/>
+    <w:basedOn w:val="Sinlista"/>
     <w:pPr>
       <w:numPr>
         <w:numId w:val="12"/>
@@ -7885,7 +9012,7 @@
   </w:style>
   <w:style w:type="numbering" w:customStyle="1" w:styleId="WW8Num12">
     <w:name w:val="WW8Num12"/>
-    <w:basedOn w:val="NoList"/>
+    <w:basedOn w:val="Sinlista"/>
     <w:pPr>
       <w:numPr>
         <w:numId w:val="13"/>
@@ -7894,7 +9021,7 @@
   </w:style>
   <w:style w:type="numbering" w:customStyle="1" w:styleId="WW8Num13">
     <w:name w:val="WW8Num13"/>
-    <w:basedOn w:val="NoList"/>
+    <w:basedOn w:val="Sinlista"/>
     <w:pPr>
       <w:numPr>
         <w:numId w:val="14"/>
@@ -7903,7 +9030,7 @@
   </w:style>
   <w:style w:type="numbering" w:customStyle="1" w:styleId="WW8Num14">
     <w:name w:val="WW8Num14"/>
-    <w:basedOn w:val="NoList"/>
+    <w:basedOn w:val="Sinlista"/>
     <w:pPr>
       <w:numPr>
         <w:numId w:val="15"/>
@@ -7912,7 +9039,7 @@
   </w:style>
   <w:style w:type="numbering" w:customStyle="1" w:styleId="WW8Num15">
     <w:name w:val="WW8Num15"/>
-    <w:basedOn w:val="NoList"/>
+    <w:basedOn w:val="Sinlista"/>
     <w:pPr>
       <w:numPr>
         <w:numId w:val="16"/>
@@ -7921,7 +9048,7 @@
   </w:style>
   <w:style w:type="numbering" w:customStyle="1" w:styleId="WW8Num16">
     <w:name w:val="WW8Num16"/>
-    <w:basedOn w:val="NoList"/>
+    <w:basedOn w:val="Sinlista"/>
     <w:pPr>
       <w:numPr>
         <w:numId w:val="17"/>
@@ -7930,7 +9057,7 @@
   </w:style>
   <w:style w:type="numbering" w:customStyle="1" w:styleId="WW8Num17">
     <w:name w:val="WW8Num17"/>
-    <w:basedOn w:val="NoList"/>
+    <w:basedOn w:val="Sinlista"/>
     <w:pPr>
       <w:numPr>
         <w:numId w:val="18"/>
@@ -7939,7 +9066,7 @@
   </w:style>
   <w:style w:type="numbering" w:customStyle="1" w:styleId="WW8Num18">
     <w:name w:val="WW8Num18"/>
-    <w:basedOn w:val="NoList"/>
+    <w:basedOn w:val="Sinlista"/>
     <w:pPr>
       <w:numPr>
         <w:numId w:val="19"/>
@@ -7948,7 +9075,7 @@
   </w:style>
   <w:style w:type="numbering" w:customStyle="1" w:styleId="WW8Num19">
     <w:name w:val="WW8Num19"/>
-    <w:basedOn w:val="NoList"/>
+    <w:basedOn w:val="Sinlista"/>
     <w:pPr>
       <w:numPr>
         <w:numId w:val="20"/>
@@ -7957,7 +9084,7 @@
   </w:style>
   <w:style w:type="numbering" w:customStyle="1" w:styleId="WW8Num20">
     <w:name w:val="WW8Num20"/>
-    <w:basedOn w:val="NoList"/>
+    <w:basedOn w:val="Sinlista"/>
     <w:pPr>
       <w:numPr>
         <w:numId w:val="21"/>
@@ -7966,7 +9093,7 @@
   </w:style>
   <w:style w:type="numbering" w:customStyle="1" w:styleId="WW8Num21">
     <w:name w:val="WW8Num21"/>
-    <w:basedOn w:val="NoList"/>
+    <w:basedOn w:val="Sinlista"/>
     <w:pPr>
       <w:numPr>
         <w:numId w:val="22"/>
@@ -7975,7 +9102,7 @@
   </w:style>
   <w:style w:type="numbering" w:customStyle="1" w:styleId="WW8Num22">
     <w:name w:val="WW8Num22"/>
-    <w:basedOn w:val="NoList"/>
+    <w:basedOn w:val="Sinlista"/>
     <w:pPr>
       <w:numPr>
         <w:numId w:val="23"/>
@@ -7984,7 +9111,7 @@
   </w:style>
   <w:style w:type="numbering" w:customStyle="1" w:styleId="WW8Num23">
     <w:name w:val="WW8Num23"/>
-    <w:basedOn w:val="NoList"/>
+    <w:basedOn w:val="Sinlista"/>
     <w:pPr>
       <w:numPr>
         <w:numId w:val="24"/>
@@ -7993,7 +9120,7 @@
   </w:style>
   <w:style w:type="numbering" w:customStyle="1" w:styleId="WW8Num24">
     <w:name w:val="WW8Num24"/>
-    <w:basedOn w:val="NoList"/>
+    <w:basedOn w:val="Sinlista"/>
     <w:pPr>
       <w:numPr>
         <w:numId w:val="25"/>
@@ -8002,7 +9129,7 @@
   </w:style>
   <w:style w:type="numbering" w:customStyle="1" w:styleId="WW8Num25">
     <w:name w:val="WW8Num25"/>
-    <w:basedOn w:val="NoList"/>
+    <w:basedOn w:val="Sinlista"/>
     <w:pPr>
       <w:numPr>
         <w:numId w:val="26"/>
@@ -8011,16 +9138,16 @@
   </w:style>
   <w:style w:type="numbering" w:customStyle="1" w:styleId="WW8Num26">
     <w:name w:val="WW8Num26"/>
-    <w:basedOn w:val="NoList"/>
+    <w:basedOn w:val="Sinlista"/>
     <w:pPr>
       <w:numPr>
         <w:numId w:val="27"/>
       </w:numPr>
     </w:pPr>
   </w:style>
-  <w:style w:type="character" w:styleId="Hyperlink">
+  <w:style w:type="character" w:styleId="Hipervnculo">
     <w:name w:val="Hyperlink"/>
-    <w:basedOn w:val="DefaultParagraphFont"/>
+    <w:basedOn w:val="Fuentedeprrafopredeter"/>
     <w:uiPriority w:val="99"/>
     <w:unhideWhenUsed/>
     <w:rsid w:val="00731F7B"/>
@@ -8029,9 +9156,9 @@
       <w:u w:val="single"/>
     </w:rPr>
   </w:style>
-  <w:style w:type="character" w:styleId="UnresolvedMention">
+  <w:style w:type="character" w:styleId="Mencinsinresolver">
     <w:name w:val="Unresolved Mention"/>
-    <w:basedOn w:val="DefaultParagraphFont"/>
+    <w:basedOn w:val="Fuentedeprrafopredeter"/>
     <w:uiPriority w:val="99"/>
     <w:semiHidden/>
     <w:unhideWhenUsed/>
@@ -8043,23 +9170,35 @@
   </w:style>
   <w:style w:type="character" w:customStyle="1" w:styleId="citation-230">
     <w:name w:val="citation-230"/>
-    <w:basedOn w:val="DefaultParagraphFont"/>
+    <w:basedOn w:val="Fuentedeprrafopredeter"/>
     <w:rsid w:val="003F7341"/>
   </w:style>
   <w:style w:type="character" w:customStyle="1" w:styleId="citation-229">
     <w:name w:val="citation-229"/>
-    <w:basedOn w:val="DefaultParagraphFont"/>
+    <w:basedOn w:val="Fuentedeprrafopredeter"/>
     <w:rsid w:val="003F7341"/>
   </w:style>
   <w:style w:type="character" w:customStyle="1" w:styleId="citation-228">
     <w:name w:val="citation-228"/>
-    <w:basedOn w:val="DefaultParagraphFont"/>
+    <w:basedOn w:val="Fuentedeprrafopredeter"/>
     <w:rsid w:val="003F7341"/>
   </w:style>
   <w:style w:type="character" w:customStyle="1" w:styleId="math-inline">
     <w:name w:val="math-inline"/>
-    <w:basedOn w:val="DefaultParagraphFont"/>
+    <w:basedOn w:val="Fuentedeprrafopredeter"/>
     <w:rsid w:val="003F7341"/>
+  </w:style>
+  <w:style w:type="character" w:styleId="Hipervnculovisitado">
+    <w:name w:val="FollowedHyperlink"/>
+    <w:basedOn w:val="Fuentedeprrafopredeter"/>
+    <w:uiPriority w:val="99"/>
+    <w:semiHidden/>
+    <w:unhideWhenUsed/>
+    <w:rsid w:val="003E1F95"/>
+    <w:rPr>
+      <w:color w:val="96607D" w:themeColor="followedHyperlink"/>
+      <w:u w:val="single"/>
+    </w:rPr>
   </w:style>
 </w:styles>
 </file>

</xml_diff>